<commit_message>
docs(do-an): revision round 1 - address peer review for sections 1.2 to 1.4
</commit_message>
<xml_diff>
--- a/work/do-an/outputs/CHUONG_1_REVIEW.docx
+++ b/work/do-an/outputs/CHUONG_1_REVIEW.docx
@@ -1821,21 +1821,7 @@
           <w:rFonts w:ascii="Times New Roman" w:hAnsi="Times New Roman"/>
           <w:color w:val="000000"/>
         </w:rPr>
-        <w:t>Vào tháng 03 năm 2017, Microsoft phát hành bản tin an ninh định kỳ MS17-010 nhằm xử lý một nhóm gồm 6 lỗ hổng bảo mật nghiêm trọng trong driver xử lý giao thức SMBv1 (</w:t>
-      </w:r>
-      <w:r>
-        <w:rPr>
-          <w:rFonts w:ascii="Times New Roman" w:hAnsi="Times New Roman"/>
-          <w:color w:val="000000"/>
-        </w:rPr>
-        <w:t>srv.sys</w:t>
-      </w:r>
-      <w:r>
-        <w:rPr>
-          <w:rFonts w:ascii="Times New Roman" w:hAnsi="Times New Roman"/>
-          <w:color w:val="000000"/>
-        </w:rPr>
-        <w:t>) của hệ điều hành Windows. Đây là bản tin an ninh tổng hợp bao trùm nhiều lỗ hổng khác nhau, chứ không đại diện cho một lỗi kỹ thuật đơn lẻ.</w:t>
+        <w:t>Vào tháng 03 năm 2017, Microsoft phát hành bản tin an ninh MS17-010 nhằm khắc phục sáu lỗ hổng bảo mật liên quan đến giao thức SMBv1 trong hệ điều hành Windows. Nhóm lỗ hổng này bao gồm năm lỗ hổng thực thi mã từ xa (Remote Code Execution - RCE) và một lỗ hổng tiết lộ thông tin (Information Disclosure). Đây là bản tin an ninh tổng hợp bao trùm nhiều vấn đề kỹ thuật khác nhau, không đại diện cho một lỗi đơn lẻ.</w:t>
       </w:r>
     </w:p>
     <w:p>
@@ -1845,7 +1831,7 @@
           <w:rFonts w:ascii="Times New Roman" w:hAnsi="Times New Roman"/>
           <w:color w:val="000000"/>
         </w:rPr>
-        <w:t xml:space="preserve">Bản chất của các lỗ hổng trong MS17-010 bắt nguồn từ việc giao thức SMBv1 được thiết kế từ giai đoạn đầu của mạng máy tính cá nhân, khi các yêu cầu kiểm soát biên dữ liệu và xác thực chặt chẽ chưa được đặt ra đầy đủ. Do driver </w:t>
+        <w:t xml:space="preserve">Nguyên nhân gốc rễ bắt nguồn từ việc giao thức SMBv1 được thiết kế từ giai đoạn sớm của mạng máy tính, khi các cơ chế kiểm soát biên dữ liệu chưa được hoàn thiện. Do trình điều khiển </w:t>
       </w:r>
       <w:r>
         <w:rPr>
@@ -1859,7 +1845,7 @@
           <w:rFonts w:ascii="Times New Roman" w:hAnsi="Times New Roman"/>
           <w:color w:val="000000"/>
         </w:rPr>
-        <w:t xml:space="preserve"> vận hành trực tiếp trong không gian nhân (Kernel Mode) nhằm tối ưu tốc độ xử lý I/O mạng, bất kỳ sai sót nào trong việc cấp phát và quản lý bộ nhớ đệm tại đây cũng tạo ra nguy cơ đe dọa trực tiếp đến toàn bộ hệ điều hành.</w:t>
+        <w:t xml:space="preserve"> vận hành trực tiếp trong không gian nhân (Kernel Mode) nhằm tối ưu hiệu năng I/O, các thiếu sót trong quản lý bộ nhớ tại thành phần này có thể đe dọa trực tiếp đến tính ổn định và an toàn của hệ điều hành. Bản tin ảnh hưởng đến nhiều phiên bản Windows còn lưu hành tại thời điểm công bố.</w:t>
       </w:r>
     </w:p>
     <w:p>
@@ -1869,7 +1855,219 @@
           <w:rFonts w:ascii="Times New Roman" w:hAnsi="Times New Roman"/>
           <w:color w:val="000000"/>
         </w:rPr>
-        <w:t>Phạm vi ảnh hưởng của MS17-010 bao phủ hầu hết các thế hệ Windows lưu hành tại thời điểm công bố, bao gồm Windows Vista, Windows 7, Windows 8.1, Windows 10 (các bản dựng đầu) cùng các hệ điều hành máy chủ Windows Server 2008, 2012 và 2016. Do mức độ nguy hiểm đặc biệt cao, Microsoft thậm chí đã phải phát hành bản vá ngoại lệ cho cả những phiên bản đã kết thúc vòng đời hỗ trợ chính thức như Windows XP và Windows Server 2003.</w:t>
+        <w:t>Trong phạm vi đồ án, nhóm em tập trung vào lỗ hổng thực thi mã từ xa không yêu cầu xác thực trong nhóm này để làm rõ rủi ro của dịch vụ SMBv1, đồng thời xây dựng quy trình kiểm thử và đối chứng phòng thủ có kiểm soát.</w:t>
+      </w:r>
+    </w:p>
+    <w:p>
+      <w:pPr>
+        <w:pStyle w:val="Heading3"/>
+      </w:pPr>
+      <w:r>
+        <w:rPr>
+          <w:rFonts w:ascii="Times New Roman" w:hAnsi="Times New Roman"/>
+          <w:color w:val="000000"/>
+        </w:rPr>
+        <w:t>1.2.2. Các CVE liên quan</w:t>
+      </w:r>
+    </w:p>
+    <w:p>
+      <w:pPr>
+        <w:keepNext/>
+      </w:pPr>
+      <w:r>
+        <w:rPr>
+          <w:rFonts w:ascii="Times New Roman" w:hAnsi="Times New Roman"/>
+          <w:color w:val="000000"/>
+        </w:rPr>
+        <w:t>Bản tin MS17-010 xử lý sáu mã lỗ hổng (Common Vulnerabilities and Exposures - CVE) với các đặc điểm kỹ thuật khác nhau:</w:t>
+      </w:r>
+    </w:p>
+    <w:p>
+      <w:pPr>
+        <w:spacing w:before="0" w:after="60"/>
+        <w:ind w:left="709" w:hanging="283"/>
+        <w:jc w:val="both"/>
+      </w:pPr>
+      <w:r>
+        <w:rPr>
+          <w:rFonts w:ascii="Times New Roman" w:hAnsi="Times New Roman"/>
+          <w:color w:val="000000"/>
+        </w:rPr>
+        <w:t xml:space="preserve">• </w:t>
+      </w:r>
+      <w:r>
+        <w:rPr>
+          <w:rFonts w:ascii="Times New Roman" w:hAnsi="Times New Roman"/>
+          <w:b/>
+          <w:color w:val="000000"/>
+        </w:rPr>
+        <w:t>CVE-2017-0143 (RCE):</w:t>
+      </w:r>
+      <w:r>
+        <w:rPr>
+          <w:rFonts w:ascii="Times New Roman" w:hAnsi="Times New Roman"/>
+          <w:color w:val="000000"/>
+        </w:rPr>
+        <w:t xml:space="preserve"> Lỗ hổng thực thi mã từ xa phát sinh từ cách xử lý các thông điệp giao dịch phụ (Transaction2) trong SMBv1 khi nhận chuỗi yêu cầu bất thường.</w:t>
+      </w:r>
+    </w:p>
+    <w:p>
+      <w:pPr>
+        <w:spacing w:before="0" w:after="60"/>
+        <w:ind w:left="709" w:hanging="283"/>
+        <w:jc w:val="both"/>
+      </w:pPr>
+      <w:r>
+        <w:rPr>
+          <w:rFonts w:ascii="Times New Roman" w:hAnsi="Times New Roman"/>
+          <w:color w:val="000000"/>
+        </w:rPr>
+        <w:t xml:space="preserve">• </w:t>
+      </w:r>
+      <w:r>
+        <w:rPr>
+          <w:rFonts w:ascii="Times New Roman" w:hAnsi="Times New Roman"/>
+          <w:b/>
+          <w:color w:val="000000"/>
+        </w:rPr>
+        <w:t>CVE-2017-0144 (RCE):</w:t>
+      </w:r>
+      <w:r>
+        <w:rPr>
+          <w:rFonts w:ascii="Times New Roman" w:hAnsi="Times New Roman"/>
+          <w:color w:val="000000"/>
+        </w:rPr>
+        <w:t xml:space="preserve"> Lỗ hổng thực thi mã từ xa do lỗi kiểm soát kích thước khi xử lý cấu trúc thuộc tính tệp mở rộng (FEA) trong SMBv1, dẫn đến tràn bộ nhớ nhân.</w:t>
+      </w:r>
+    </w:p>
+    <w:p>
+      <w:pPr>
+        <w:spacing w:before="0" w:after="60"/>
+        <w:ind w:left="709" w:hanging="283"/>
+        <w:jc w:val="both"/>
+      </w:pPr>
+      <w:r>
+        <w:rPr>
+          <w:rFonts w:ascii="Times New Roman" w:hAnsi="Times New Roman"/>
+          <w:color w:val="000000"/>
+        </w:rPr>
+        <w:t xml:space="preserve">• </w:t>
+      </w:r>
+      <w:r>
+        <w:rPr>
+          <w:rFonts w:ascii="Times New Roman" w:hAnsi="Times New Roman"/>
+          <w:b/>
+          <w:color w:val="000000"/>
+        </w:rPr>
+        <w:t>CVE-2017-0145 (RCE):</w:t>
+      </w:r>
+      <w:r>
+        <w:rPr>
+          <w:rFonts w:ascii="Times New Roman" w:hAnsi="Times New Roman"/>
+          <w:color w:val="000000"/>
+        </w:rPr>
+        <w:t xml:space="preserve"> Lỗ hổng thực thi mã từ xa liên quan đến việc xác thực tham số bộ đệm trong các yêu cầu giao dịch SMBv1.</w:t>
+      </w:r>
+    </w:p>
+    <w:p>
+      <w:pPr>
+        <w:spacing w:before="0" w:after="60"/>
+        <w:ind w:left="709" w:hanging="283"/>
+        <w:jc w:val="both"/>
+      </w:pPr>
+      <w:r>
+        <w:rPr>
+          <w:rFonts w:ascii="Times New Roman" w:hAnsi="Times New Roman"/>
+          <w:color w:val="000000"/>
+        </w:rPr>
+        <w:t xml:space="preserve">• </w:t>
+      </w:r>
+      <w:r>
+        <w:rPr>
+          <w:rFonts w:ascii="Times New Roman" w:hAnsi="Times New Roman"/>
+          <w:b/>
+          <w:color w:val="000000"/>
+        </w:rPr>
+        <w:t>CVE-2017-0146 (RCE):</w:t>
+      </w:r>
+      <w:r>
+        <w:rPr>
+          <w:rFonts w:ascii="Times New Roman" w:hAnsi="Times New Roman"/>
+          <w:color w:val="000000"/>
+        </w:rPr>
+        <w:t xml:space="preserve"> Lỗ hổng thực thi mã từ xa do xử lý con trỏ và đối tượng bộ nhớ không an toàn trong driver </w:t>
+      </w:r>
+      <w:r>
+        <w:rPr>
+          <w:rFonts w:ascii="Times New Roman" w:hAnsi="Times New Roman"/>
+          <w:color w:val="000000"/>
+        </w:rPr>
+        <w:t>srv.sys</w:t>
+      </w:r>
+      <w:r>
+        <w:rPr>
+          <w:rFonts w:ascii="Times New Roman" w:hAnsi="Times New Roman"/>
+          <w:color w:val="000000"/>
+        </w:rPr>
+        <w:t>.</w:t>
+      </w:r>
+    </w:p>
+    <w:p>
+      <w:pPr>
+        <w:spacing w:before="0" w:after="60"/>
+        <w:ind w:left="709" w:hanging="283"/>
+        <w:jc w:val="both"/>
+      </w:pPr>
+      <w:r>
+        <w:rPr>
+          <w:rFonts w:ascii="Times New Roman" w:hAnsi="Times New Roman"/>
+          <w:color w:val="000000"/>
+        </w:rPr>
+        <w:t xml:space="preserve">• </w:t>
+      </w:r>
+      <w:r>
+        <w:rPr>
+          <w:rFonts w:ascii="Times New Roman" w:hAnsi="Times New Roman"/>
+          <w:b/>
+          <w:color w:val="000000"/>
+        </w:rPr>
+        <w:t>CVE-2017-0147 (Information Disclosure):</w:t>
+      </w:r>
+      <w:r>
+        <w:rPr>
+          <w:rFonts w:ascii="Times New Roman" w:hAnsi="Times New Roman"/>
+          <w:color w:val="000000"/>
+        </w:rPr>
+        <w:t xml:space="preserve"> Lỗ hổng tiết lộ thông tin từ bộ nhớ nhân về phía client thông qua các gói tin phản hồi SMBv1 không được xóa trắng dữ liệu.</w:t>
+      </w:r>
+    </w:p>
+    <w:p>
+      <w:pPr>
+        <w:spacing w:before="0" w:after="60"/>
+        <w:ind w:left="709" w:hanging="283"/>
+        <w:jc w:val="both"/>
+      </w:pPr>
+      <w:r>
+        <w:rPr>
+          <w:rFonts w:ascii="Times New Roman" w:hAnsi="Times New Roman"/>
+          <w:color w:val="000000"/>
+        </w:rPr>
+        <w:t xml:space="preserve">• </w:t>
+      </w:r>
+      <w:r>
+        <w:rPr>
+          <w:rFonts w:ascii="Times New Roman" w:hAnsi="Times New Roman"/>
+          <w:b/>
+          <w:color w:val="000000"/>
+        </w:rPr>
+        <w:t>CVE-2017-0148 (RCE):</w:t>
+      </w:r>
+      <w:r>
+        <w:rPr>
+          <w:rFonts w:ascii="Times New Roman" w:hAnsi="Times New Roman"/>
+          <w:color w:val="000000"/>
+        </w:rPr>
+        <w:t xml:space="preserve"> Lỗ hổng thực thi mã từ xa do lỗi kiểm tra hợp lệ trong quá trình xử lý các gói tin giao dịch liên tiếp.</w:t>
       </w:r>
     </w:p>
     <w:p>
@@ -1879,7 +2077,7 @@
           <w:rFonts w:ascii="Times New Roman" w:hAnsi="Times New Roman"/>
           <w:color w:val="000000"/>
         </w:rPr>
-        <w:t>Trong phạm vi đồ án, nhóm em tập trung nghiên cứu lỗ hổng thực thi mã từ xa không cần xác thực trong nhóm này để làm rõ bản chất rủi ro của dịch vụ SMBv1, đồng thời xây dựng quy trình kiểm thử và đối chứng phòng thủ có kiểm soát.</w:t>
+        <w:t>Việc phân định các mã CVE cho thấy MS17-010 là một tập hợp lỗi với cơ chế khác nhau. Trong số này, CVE-2017-0144 là đối tượng trung tâm được nhóm em phân tích và kiểm chứng trong đồ án do đặc tính không đòi hỏi xác thực tài khoản và mức độ tác động trực tiếp đến dịch vụ SMBv1.</w:t>
       </w:r>
     </w:p>
     <w:p>
@@ -1891,10 +2089,34 @@
           <w:rFonts w:ascii="Times New Roman" w:hAnsi="Times New Roman"/>
           <w:color w:val="000000"/>
         </w:rPr>
-        <w:t>1.2.2. Các CVE liên quan</w:t>
+        <w:t>1.2.3. Cơ chế xử lý yêu cầu SMBv1 dẫn đến lỗ hổng</w:t>
       </w:r>
     </w:p>
     <w:p>
+      <w:pPr/>
+      <w:r>
+        <w:rPr>
+          <w:rFonts w:ascii="Times New Roman" w:hAnsi="Times New Roman"/>
+          <w:color w:val="000000"/>
+        </w:rPr>
+        <w:t xml:space="preserve">Lỗ hổng CVE-2017-0144 liên quan đến quá trình driver </w:t>
+      </w:r>
+      <w:r>
+        <w:rPr>
+          <w:rFonts w:ascii="Times New Roman" w:hAnsi="Times New Roman"/>
+          <w:color w:val="000000"/>
+        </w:rPr>
+        <w:t>srv.sys</w:t>
+      </w:r>
+      <w:r>
+        <w:rPr>
+          <w:rFonts w:ascii="Times New Roman" w:hAnsi="Times New Roman"/>
+          <w:color w:val="000000"/>
+        </w:rPr>
+        <w:t xml:space="preserve"> xử lý các thuộc tính tệp mở rộng (Full Extended Attributes - FEA) được gửi qua các gói tin giao dịch của SMBv1. Cấu trúc FEA vốn được duy trì để bảo đảm khả năng tương thích ngược với hệ thống tệp cũ.</w:t>
+      </w:r>
+    </w:p>
+    <w:p>
       <w:pPr>
         <w:keepNext/>
       </w:pPr>
@@ -1903,7 +2125,21 @@
           <w:rFonts w:ascii="Times New Roman" w:hAnsi="Times New Roman"/>
           <w:color w:val="000000"/>
         </w:rPr>
-        <w:t>Bản tin bảo mật MS17-010 khắc phục 6 mã định danh lỗ hổng an ninh (Common Vulnerabilities and Exposures - CVE), gồm 5 lỗ hổng thực thi mã từ xa (Remote Code Execution - RCE) và 1 lỗ hổng làm lộ thông tin (Information Disclosure):</w:t>
+        <w:t xml:space="preserve">Khi client gửi yêu cầu chứa danh sách các thuộc tính FEA, </w:t>
+      </w:r>
+      <w:r>
+        <w:rPr>
+          <w:rFonts w:ascii="Times New Roman" w:hAnsi="Times New Roman"/>
+          <w:color w:val="000000"/>
+        </w:rPr>
+        <w:t>srv.sys</w:t>
+      </w:r>
+      <w:r>
+        <w:rPr>
+          <w:rFonts w:ascii="Times New Roman" w:hAnsi="Times New Roman"/>
+          <w:color w:val="000000"/>
+        </w:rPr>
+        <w:t xml:space="preserve"> cần chuyển đổi danh sách này sang cấu trúc định dạng nội bộ của Windows NT. Quá trình xử lý bao gồm hai bước chính:</w:t>
       </w:r>
     </w:p>
     <w:p>
@@ -1922,17 +2158,23 @@
       <w:r>
         <w:rPr>
           <w:rFonts w:ascii="Times New Roman" w:hAnsi="Times New Roman"/>
-          <w:b/>
-          <w:color w:val="000000"/>
-        </w:rPr>
-        <w:t>CVE-2017-0143 (RCE):</w:t>
-      </w:r>
-      <w:r>
-        <w:rPr>
-          <w:rFonts w:ascii="Times New Roman" w:hAnsi="Times New Roman"/>
-          <w:color w:val="000000"/>
-        </w:rPr>
-        <w:t xml:space="preserve"> Lỗ hổng phát sinh từ việc xử lý sai các thông điệp giao dịch phụ (Transaction2) trong SMBv1, liên quan trực tiếp đến các công cụ khai thác mang tên EternalSynergy và EternalRomance.</w:t>
+          <w:color w:val="000000"/>
+        </w:rPr>
+        <w:t xml:space="preserve">Đầu tiên, hàm </w:t>
+      </w:r>
+      <w:r>
+        <w:rPr>
+          <w:rFonts w:ascii="Times New Roman" w:hAnsi="Times New Roman"/>
+          <w:color w:val="000000"/>
+        </w:rPr>
+        <w:t>SrvOs2FeaListSizeToNt</w:t>
+      </w:r>
+      <w:r>
+        <w:rPr>
+          <w:rFonts w:ascii="Times New Roman" w:hAnsi="Times New Roman"/>
+          <w:color w:val="000000"/>
+        </w:rPr>
+        <w:t xml:space="preserve"> duyệt qua danh sách để tính toán tổng dung lượng bộ nhớ cần cấp phát trong bộ nhớ nhân (Kernel Pool).</w:t>
       </w:r>
     </w:p>
     <w:p>
@@ -1951,17 +2193,78 @@
       <w:r>
         <w:rPr>
           <w:rFonts w:ascii="Times New Roman" w:hAnsi="Times New Roman"/>
+          <w:color w:val="000000"/>
+        </w:rPr>
+        <w:t xml:space="preserve">Sau đó, hệ thống cấp phát vùng đệm và hàm </w:t>
+      </w:r>
+      <w:r>
+        <w:rPr>
+          <w:rFonts w:ascii="Times New Roman" w:hAnsi="Times New Roman"/>
+          <w:color w:val="000000"/>
+        </w:rPr>
+        <w:t>SrvOs2FeaToNt</w:t>
+      </w:r>
+      <w:r>
+        <w:rPr>
+          <w:rFonts w:ascii="Times New Roman" w:hAnsi="Times New Roman"/>
+          <w:color w:val="000000"/>
+        </w:rPr>
+        <w:t xml:space="preserve"> tiến hành sao chép các phần tử dữ liệu vào vùng đệm đã tạo.</w:t>
+      </w:r>
+    </w:p>
+    <w:p>
+      <w:pPr/>
+      <w:r>
+        <w:rPr>
+          <w:rFonts w:ascii="Times New Roman" w:hAnsi="Times New Roman"/>
+          <w:color w:val="000000"/>
+        </w:rPr>
+        <w:t>Vấn đề phát sinh do sai lệch trong khâu kiểm soát và chuyển đổi kích thước dữ liệu: giá trị kích thước được tính toán ở bước đầu bị thiếu hụt so với lượng dữ liệu thực tế được ghi ở bước sau. Hậu quả là hệ điều hành chỉ chuẩn bị một vùng đệm nhỏ hơn nhu cầu, khiến quá trình sao chép ghi dữ liệu vượt ra ngoài phạm vi vùng nhớ dự kiến trong kernel pool (Kernel Pool Overflow).</w:t>
+      </w:r>
+    </w:p>
+    <w:p>
+      <w:pPr/>
+      <w:r>
+        <w:rPr>
+          <w:rFonts w:ascii="Times New Roman" w:hAnsi="Times New Roman"/>
+          <w:color w:val="000000"/>
+        </w:rPr>
+        <w:t>Lỗi xảy ra trực tiếp trong không gian nhân của hệ điều hành, khiến việc vùng nhớ bị ghi đè có thể dẫn đến tình trạng mất ổn định và phát sinh lỗi dừng (BSOD). Ngoài ra, các mã khai thác như EternalBlue có thể lợi dụng sự sai lệch bố cục bộ nhớ này để thực thi mã lệnh tùy ý với đặc quyền hệ thống cao nhất.</w:t>
+      </w:r>
+    </w:p>
+    <w:p>
+      <w:pPr>
+        <w:pStyle w:val="Heading3"/>
+      </w:pPr>
+      <w:r>
+        <w:rPr>
+          <w:rFonts w:ascii="Times New Roman" w:hAnsi="Times New Roman"/>
+          <w:color w:val="000000"/>
+        </w:rPr>
+        <w:t>1.2.4. Điều kiện ảnh hưởng và điều kiện khai thác</w:t>
+      </w:r>
+    </w:p>
+    <w:p>
+      <w:pPr>
+        <w:keepNext/>
+      </w:pPr>
+      <w:r>
+        <w:rPr>
+          <w:rFonts w:ascii="Times New Roman" w:hAnsi="Times New Roman"/>
+          <w:color w:val="000000"/>
+        </w:rPr>
+        <w:t>Trong đánh giá an ninh, cần phân định rõ giữa điều kiện để một hệ thống tồn tại lỗ hổng và điều kiện để tác động từ xa có thể xảy ra trên thực tế:</w:t>
+      </w:r>
+    </w:p>
+    <w:p>
+      <w:pPr/>
+      <w:r>
+        <w:rPr>
+          <w:rFonts w:ascii="Times New Roman" w:hAnsi="Times New Roman"/>
           <w:b/>
           <w:color w:val="000000"/>
         </w:rPr>
-        <w:t>CVE-2017-0144 (RCE):</w:t>
-      </w:r>
-      <w:r>
-        <w:rPr>
-          <w:rFonts w:ascii="Times New Roman" w:hAnsi="Times New Roman"/>
-          <w:color w:val="000000"/>
-        </w:rPr>
-        <w:t xml:space="preserve"> Lỗi tràn vùng đệm bộ nhớ nhân trong quá trình chuyển đổi danh sách thuộc tính tệp mở rộng (FEA) của SMBv1. Đây là lỗ hổng cốt lõi bị vũ khí hóa bởi mã khai thác EternalBlue.</w:t>
+        <w:t>Điều kiện hệ thống có thể bị ảnh hưởng:</w:t>
       </w:r>
     </w:p>
     <w:p>
@@ -1980,17 +2283,9 @@
       <w:r>
         <w:rPr>
           <w:rFonts w:ascii="Times New Roman" w:hAnsi="Times New Roman"/>
-          <w:b/>
-          <w:color w:val="000000"/>
-        </w:rPr>
-        <w:t>CVE-2017-0145 (RCE):</w:t>
-      </w:r>
-      <w:r>
-        <w:rPr>
-          <w:rFonts w:ascii="Times New Roman" w:hAnsi="Times New Roman"/>
-          <w:color w:val="000000"/>
-        </w:rPr>
-        <w:t xml:space="preserve"> Lỗi trong cách SMBv1 xử lý tham số bộ nhớ khi nhận các yêu cầu giao dịch bất thường, liên quan đến mã khai thác EternalRomance.</w:t>
+          <w:color w:val="000000"/>
+        </w:rPr>
+        <w:t>Hệ điều hành thuộc danh mục các phiên bản Windows chịu tác động của bản tin MS17-010.</w:t>
       </w:r>
     </w:p>
     <w:p>
@@ -2009,17 +2304,9 @@
       <w:r>
         <w:rPr>
           <w:rFonts w:ascii="Times New Roman" w:hAnsi="Times New Roman"/>
-          <w:b/>
-          <w:color w:val="000000"/>
-        </w:rPr>
-        <w:t>CVE-2017-0146 (RCE):</w:t>
-      </w:r>
-      <w:r>
-        <w:rPr>
-          <w:rFonts w:ascii="Times New Roman" w:hAnsi="Times New Roman"/>
-          <w:color w:val="000000"/>
-        </w:rPr>
-        <w:t xml:space="preserve"> Lỗi giải phóng và tái sử dụng con trỏ bộ nhớ không an toàn trong driver </w:t>
+          <w:color w:val="000000"/>
+        </w:rPr>
+        <w:t xml:space="preserve">Dịch vụ SMBv1 đang được kích hoạt và driver </w:t>
       </w:r>
       <w:r>
         <w:rPr>
@@ -2033,7 +2320,7 @@
           <w:rFonts w:ascii="Times New Roman" w:hAnsi="Times New Roman"/>
           <w:color w:val="000000"/>
         </w:rPr>
-        <w:t>, liên quan đến công cụ EternalChampion.</w:t>
+        <w:t xml:space="preserve"> đang hoạt động để tiếp nhận yêu cầu mạng.</w:t>
       </w:r>
     </w:p>
     <w:p>
@@ -2052,17 +2339,20 @@
       <w:r>
         <w:rPr>
           <w:rFonts w:ascii="Times New Roman" w:hAnsi="Times New Roman"/>
+          <w:color w:val="000000"/>
+        </w:rPr>
+        <w:t>Bản cập nhật an ninh MS17-010 tương ứng chưa được cài đặt trên hệ thống.</w:t>
+      </w:r>
+    </w:p>
+    <w:p>
+      <w:pPr/>
+      <w:r>
+        <w:rPr>
+          <w:rFonts w:ascii="Times New Roman" w:hAnsi="Times New Roman"/>
           <w:b/>
           <w:color w:val="000000"/>
         </w:rPr>
-        <w:t>CVE-2017-0147 (Information Disclosure):</w:t>
-      </w:r>
-      <w:r>
-        <w:rPr>
-          <w:rFonts w:ascii="Times New Roman" w:hAnsi="Times New Roman"/>
-          <w:color w:val="000000"/>
-        </w:rPr>
-        <w:t xml:space="preserve"> Lỗ hổng cho phép rò rỉ dữ liệu từ không gian bộ nhớ nhân về phía client thông qua các thông điệp phản hồi SMBv1 không được xóa trắng dữ liệu trước khi gửi.</w:t>
+        <w:t>Điều kiện để tác động từ xa có thể xảy ra:</w:t>
       </w:r>
     </w:p>
     <w:p>
@@ -2081,17 +2371,119 @@
       <w:r>
         <w:rPr>
           <w:rFonts w:ascii="Times New Roman" w:hAnsi="Times New Roman"/>
-          <w:b/>
-          <w:color w:val="000000"/>
-        </w:rPr>
-        <w:t>CVE-2017-0148 (RCE):</w:t>
-      </w:r>
-      <w:r>
-        <w:rPr>
-          <w:rFonts w:ascii="Times New Roman" w:hAnsi="Times New Roman"/>
-          <w:color w:val="000000"/>
-        </w:rPr>
-        <w:t xml:space="preserve"> Lỗi kiểm tra tính hợp lệ của tham số trong các gói tin giao dịch SMB liên tiếp, cho phép can thiệp vào luồng xử lý của hệ thống.</w:t>
+          <w:color w:val="000000"/>
+        </w:rPr>
+        <w:t>Trạm kiểm thử có đường truyền mạng thông suốt đến cổng dịch vụ SMB (TCP 445 hoặc TCP 139) của máy chủ mục tiêu.</w:t>
+      </w:r>
+    </w:p>
+    <w:p>
+      <w:pPr>
+        <w:spacing w:before="0" w:after="60"/>
+        <w:ind w:left="709" w:hanging="283"/>
+        <w:jc w:val="both"/>
+      </w:pPr>
+      <w:r>
+        <w:rPr>
+          <w:rFonts w:ascii="Times New Roman" w:hAnsi="Times New Roman"/>
+          <w:color w:val="000000"/>
+        </w:rPr>
+        <w:t xml:space="preserve">• </w:t>
+      </w:r>
+      <w:r>
+        <w:rPr>
+          <w:rFonts w:ascii="Times New Roman" w:hAnsi="Times New Roman"/>
+          <w:color w:val="000000"/>
+        </w:rPr>
+        <w:t>Các luồng giao tiếp SMB cần thiết không bị tường lửa mạng hoặc tường lửa cục bộ ngăn chặn.</w:t>
+      </w:r>
+    </w:p>
+    <w:p>
+      <w:pPr>
+        <w:spacing w:before="0" w:after="60"/>
+        <w:ind w:left="709" w:hanging="283"/>
+        <w:jc w:val="both"/>
+      </w:pPr>
+      <w:r>
+        <w:rPr>
+          <w:rFonts w:ascii="Times New Roman" w:hAnsi="Times New Roman"/>
+          <w:color w:val="000000"/>
+        </w:rPr>
+        <w:t xml:space="preserve">• </w:t>
+      </w:r>
+      <w:r>
+        <w:rPr>
+          <w:rFonts w:ascii="Times New Roman" w:hAnsi="Times New Roman"/>
+          <w:color w:val="000000"/>
+        </w:rPr>
+        <w:t>Phiên bản hệ điều hành, cấu trúc dịch vụ và trạng thái bộ nhớ của mục tiêu tương thích với kỹ thuật can thiệp được sử dụng.</w:t>
+      </w:r>
+    </w:p>
+    <w:p>
+      <w:pPr>
+        <w:keepNext/>
+      </w:pPr>
+      <w:r>
+        <w:rPr>
+          <w:rFonts w:ascii="Times New Roman" w:hAnsi="Times New Roman"/>
+          <w:color w:val="000000"/>
+        </w:rPr>
+        <w:t>Sự phân định này chỉ ra rằng trạng thái mở cổng TCP 445 chỉ là điều kiện tiếp cận ban đầu ở tầng giao vận:</w:t>
+      </w:r>
+    </w:p>
+    <w:p>
+      <w:pPr>
+        <w:spacing w:before="0" w:after="60"/>
+        <w:ind w:left="709" w:hanging="283"/>
+        <w:jc w:val="both"/>
+      </w:pPr>
+      <w:r>
+        <w:rPr>
+          <w:rFonts w:ascii="Times New Roman" w:hAnsi="Times New Roman"/>
+          <w:color w:val="000000"/>
+        </w:rPr>
+        <w:t xml:space="preserve">• </w:t>
+      </w:r>
+      <w:r>
+        <w:rPr>
+          <w:rFonts w:ascii="Times New Roman" w:hAnsi="Times New Roman"/>
+          <w:color w:val="000000"/>
+        </w:rPr>
+        <w:t xml:space="preserve">Một máy chủ mở cổng 445 và hỗ trợ SMBv1 nhưng đã được cập nhật bản vá thì lỗi xử lý dữ liệu trong </w:t>
+      </w:r>
+      <w:r>
+        <w:rPr>
+          <w:rFonts w:ascii="Times New Roman" w:hAnsi="Times New Roman"/>
+          <w:color w:val="000000"/>
+        </w:rPr>
+        <w:t>srv.sys</w:t>
+      </w:r>
+      <w:r>
+        <w:rPr>
+          <w:rFonts w:ascii="Times New Roman" w:hAnsi="Times New Roman"/>
+          <w:color w:val="000000"/>
+        </w:rPr>
+        <w:t xml:space="preserve"> đã được khắc phục.</w:t>
+      </w:r>
+    </w:p>
+    <w:p>
+      <w:pPr>
+        <w:spacing w:before="0" w:after="60"/>
+        <w:ind w:left="709" w:hanging="283"/>
+        <w:jc w:val="both"/>
+      </w:pPr>
+      <w:r>
+        <w:rPr>
+          <w:rFonts w:ascii="Times New Roman" w:hAnsi="Times New Roman"/>
+          <w:color w:val="000000"/>
+        </w:rPr>
+        <w:t xml:space="preserve">• </w:t>
+      </w:r>
+      <w:r>
+        <w:rPr>
+          <w:rFonts w:ascii="Times New Roman" w:hAnsi="Times New Roman"/>
+          <w:color w:val="000000"/>
+        </w:rPr>
+        <w:t>Ngược lại, một máy chủ tồn tại lỗ hổng nhưng đặt sau tường lửa chặn truy cập SMB từ bên ngoài thì tác động từ xa không thể thực hiện được qua ranh giới mạng đó.</w:t>
       </w:r>
     </w:p>
     <w:p>
@@ -2101,7 +2493,7 @@
           <w:rFonts w:ascii="Times New Roman" w:hAnsi="Times New Roman"/>
           <w:color w:val="000000"/>
         </w:rPr>
-        <w:t>Việc phân biệt các mã CVE giúp làm rõ rằng MS17-010 không đồng nhất hoàn toàn với chỉ một lỗ hổng. Trong số này, CVE-2017-0144 là lỗ hổng nguy hiểm nhất do có khả năng bị khai thác từ xa qua mạng mà không đòi hỏi tài khoản người dùng, đồng thời là đối tượng trung tâm được nhóm em phân tích kỹ thuật và thẩm định trong môi trường thực nghiệm.</w:t>
+        <w:t>Như vậy, mở cổng mạng không đồng nghĩa với việc hỗ trợ SMBv1, hỗ trợ SMBv1 không đồng nghĩa với hệ thống chưa vá, và sự tồn tại của lỗ hổng cũng không đồng nghĩa với việc khai thác chắc chắn thành công.</w:t>
       </w:r>
     </w:p>
     <w:p>
@@ -2113,7 +2505,106 @@
           <w:rFonts w:ascii="Times New Roman" w:hAnsi="Times New Roman"/>
           <w:color w:val="000000"/>
         </w:rPr>
-        <w:t>1.2.3. Cơ chế xử lý yêu cầu SMBv1 dẫn đến lỗ hổng</w:t>
+        <w:t>1.2.5. Tác động của lỗ hổng</w:t>
+      </w:r>
+    </w:p>
+    <w:p>
+      <w:pPr>
+        <w:keepNext/>
+      </w:pPr>
+      <w:r>
+        <w:rPr>
+          <w:rFonts w:ascii="Times New Roman" w:hAnsi="Times New Roman"/>
+          <w:color w:val="000000"/>
+        </w:rPr>
+        <w:t>Tác động của lỗ hổng CVE-2017-0144 thuộc nhóm MS17-010 được xem xét qua ba khía cạnh an toàn thông tin:</w:t>
+      </w:r>
+    </w:p>
+    <w:p>
+      <w:pPr>
+        <w:spacing w:before="0" w:after="60"/>
+        <w:ind w:left="709" w:hanging="283"/>
+        <w:jc w:val="both"/>
+      </w:pPr>
+      <w:r>
+        <w:rPr>
+          <w:rFonts w:ascii="Times New Roman" w:hAnsi="Times New Roman"/>
+          <w:color w:val="000000"/>
+        </w:rPr>
+        <w:t xml:space="preserve">• </w:t>
+      </w:r>
+      <w:r>
+        <w:rPr>
+          <w:rFonts w:ascii="Times New Roman" w:hAnsi="Times New Roman"/>
+          <w:b/>
+          <w:color w:val="000000"/>
+        </w:rPr>
+        <w:t>Tính bảo mật (Confidentiality):</w:t>
+      </w:r>
+      <w:r>
+        <w:rPr>
+          <w:rFonts w:ascii="Times New Roman" w:hAnsi="Times New Roman"/>
+          <w:color w:val="000000"/>
+        </w:rPr>
+        <w:t xml:space="preserve"> Nếu mã can thiệp thực thi thành công với đặc quyền cao trong nhân hệ điều hành, các dữ liệu lưu trữ trên máy chủ, thông tin xác thực tài khoản và cấu hình hệ thống đều có nguy cơ bị truy cập trái phép.</w:t>
+      </w:r>
+    </w:p>
+    <w:p>
+      <w:pPr>
+        <w:spacing w:before="0" w:after="60"/>
+        <w:ind w:left="709" w:hanging="283"/>
+        <w:jc w:val="both"/>
+      </w:pPr>
+      <w:r>
+        <w:rPr>
+          <w:rFonts w:ascii="Times New Roman" w:hAnsi="Times New Roman"/>
+          <w:color w:val="000000"/>
+        </w:rPr>
+        <w:t xml:space="preserve">• </w:t>
+      </w:r>
+      <w:r>
+        <w:rPr>
+          <w:rFonts w:ascii="Times New Roman" w:hAnsi="Times New Roman"/>
+          <w:b/>
+          <w:color w:val="000000"/>
+        </w:rPr>
+        <w:t>Tính toàn vẹn (Integrity):</w:t>
+      </w:r>
+      <w:r>
+        <w:rPr>
+          <w:rFonts w:ascii="Times New Roman" w:hAnsi="Times New Roman"/>
+          <w:color w:val="000000"/>
+        </w:rPr>
+        <w:t xml:space="preserve"> Kẻ tấn công có thể thay đổi dữ liệu, chỉnh sửa tệp tin hệ thống hoặc can thiệp vào các chính sách bảo mật trong phạm vi quyền hạn đạt được.</w:t>
+      </w:r>
+    </w:p>
+    <w:p>
+      <w:pPr>
+        <w:spacing w:before="0" w:after="60"/>
+        <w:ind w:left="709" w:hanging="283"/>
+        <w:jc w:val="both"/>
+      </w:pPr>
+      <w:r>
+        <w:rPr>
+          <w:rFonts w:ascii="Times New Roman" w:hAnsi="Times New Roman"/>
+          <w:color w:val="000000"/>
+        </w:rPr>
+        <w:t xml:space="preserve">• </w:t>
+      </w:r>
+      <w:r>
+        <w:rPr>
+          <w:rFonts w:ascii="Times New Roman" w:hAnsi="Times New Roman"/>
+          <w:b/>
+          <w:color w:val="000000"/>
+        </w:rPr>
+        <w:t>Tính sẵn sàng (Availability):</w:t>
+      </w:r>
+      <w:r>
+        <w:rPr>
+          <w:rFonts w:ascii="Times New Roman" w:hAnsi="Times New Roman"/>
+          <w:color w:val="000000"/>
+        </w:rPr>
+        <w:t xml:space="preserve"> Do can thiệp trực tiếp vào bộ nhớ cấp nhân, các thao tác xử lý không tương thích rất dễ dẫn đến lỗi dừng hệ thống (BSOD). Bên cạnh đó, kẻ tấn công có thể chủ động làm gián đoạn dịch vụ hoặc khóa tài nguyên.</w:t>
       </w:r>
     </w:p>
     <w:p>
@@ -2123,25 +2614,23 @@
           <w:rFonts w:ascii="Times New Roman" w:hAnsi="Times New Roman"/>
           <w:color w:val="000000"/>
         </w:rPr>
-        <w:t xml:space="preserve">Lỗ hổng CVE-2017-0144 phát sinh trong quá trình driver </w:t>
-      </w:r>
-      <w:r>
-        <w:rPr>
-          <w:rFonts w:ascii="Times New Roman" w:hAnsi="Times New Roman"/>
-          <w:color w:val="000000"/>
-        </w:rPr>
-        <w:t>srv.sys</w:t>
-      </w:r>
-      <w:r>
-        <w:rPr>
-          <w:rFonts w:ascii="Times New Roman" w:hAnsi="Times New Roman"/>
-          <w:color w:val="000000"/>
-        </w:rPr>
-        <w:t xml:space="preserve"> xử lý các thuộc tính tệp mở rộng (Full Extended Attributes - FEA). Đây là cấu trúc dữ liệu được SMBv1 hỗ trợ nhằm duy trì tính tương thích ngược với hệ điều hành OS/2 cũ.</w:t>
+        <w:t>Điểm đáng lưu ý là lỗ hổng này có thể kích hoạt từ xa qua gói tin mạng mà không bắt buộc phải có sự tương tác của người dùng hay tài khoản đăng nhập trước đó, khiến rủi ro lây lan tự động trở nên đặc biệt nghiêm trọng.</w:t>
       </w:r>
     </w:p>
     <w:p>
       <w:pPr>
+        <w:pStyle w:val="Heading3"/>
+      </w:pPr>
+      <w:r>
+        <w:rPr>
+          <w:rFonts w:ascii="Times New Roman" w:hAnsi="Times New Roman"/>
+          <w:color w:val="000000"/>
+        </w:rPr>
+        <w:t>1.2.6. Mối liên hệ với các cuộc tấn công thực tế</w:t>
+      </w:r>
+    </w:p>
+    <w:p>
+      <w:pPr>
         <w:keepNext/>
       </w:pPr>
       <w:r>
@@ -2149,77 +2638,7 @@
           <w:rFonts w:ascii="Times New Roman" w:hAnsi="Times New Roman"/>
           <w:color w:val="000000"/>
         </w:rPr>
-        <w:t xml:space="preserve">Khi client gửi một gói tin yêu cầu thuộc nhóm giao dịch (cụ thể là lệnh </w:t>
-      </w:r>
-      <w:r>
-        <w:rPr>
-          <w:rFonts w:ascii="Times New Roman" w:hAnsi="Times New Roman"/>
-          <w:color w:val="000000"/>
-        </w:rPr>
-        <w:t>SMB_COM_TRANSACTION2</w:t>
-      </w:r>
-      <w:r>
-        <w:rPr>
-          <w:rFonts w:ascii="Times New Roman" w:hAnsi="Times New Roman"/>
-          <w:color w:val="000000"/>
-        </w:rPr>
-        <w:t xml:space="preserve"> với hàm phụ </w:t>
-      </w:r>
-      <w:r>
-        <w:rPr>
-          <w:rFonts w:ascii="Times New Roman" w:hAnsi="Times New Roman"/>
-          <w:color w:val="000000"/>
-        </w:rPr>
-        <w:t>SMB2_TRANS2_SET_PATH_INFORMATION</w:t>
-      </w:r>
-      <w:r>
-        <w:rPr>
-          <w:rFonts w:ascii="Times New Roman" w:hAnsi="Times New Roman"/>
-          <w:color w:val="000000"/>
-        </w:rPr>
-        <w:t xml:space="preserve">), gói tin này mang theo một danh sách các thuộc tính FEA định dạng OS/2 (gọi là </w:t>
-      </w:r>
-      <w:r>
-        <w:rPr>
-          <w:rFonts w:ascii="Times New Roman" w:hAnsi="Times New Roman"/>
-          <w:color w:val="000000"/>
-        </w:rPr>
-        <w:t>FEA_LIST</w:t>
-      </w:r>
-      <w:r>
-        <w:rPr>
-          <w:rFonts w:ascii="Times New Roman" w:hAnsi="Times New Roman"/>
-          <w:color w:val="000000"/>
-        </w:rPr>
-        <w:t xml:space="preserve">). Để Windows hiểu và áp dụng được các thuộc tính này lên hệ thống tệp NTFS, driver </w:t>
-      </w:r>
-      <w:r>
-        <w:rPr>
-          <w:rFonts w:ascii="Times New Roman" w:hAnsi="Times New Roman"/>
-          <w:color w:val="000000"/>
-        </w:rPr>
-        <w:t>srv.sys</w:t>
-      </w:r>
-      <w:r>
-        <w:rPr>
-          <w:rFonts w:ascii="Times New Roman" w:hAnsi="Times New Roman"/>
-          <w:color w:val="000000"/>
-        </w:rPr>
-        <w:t xml:space="preserve"> phải chuyển đổi danh sách trên sang định dạng nội bộ của Windows NT (</w:t>
-      </w:r>
-      <w:r>
-        <w:rPr>
-          <w:rFonts w:ascii="Times New Roman" w:hAnsi="Times New Roman"/>
-          <w:color w:val="000000"/>
-        </w:rPr>
-        <w:t>FILE_FULL_EA_INFORMATION</w:t>
-      </w:r>
-      <w:r>
-        <w:rPr>
-          <w:rFonts w:ascii="Times New Roman" w:hAnsi="Times New Roman"/>
-          <w:color w:val="000000"/>
-        </w:rPr>
-        <w:t>). Quá trình này diễn ra qua hai hàm nội bộ liên tiếp trong nhân hệ điều hành:</w:t>
+        <w:t>Tác động thực tế của nhóm lỗ hổng MS17-010 đã được minh chứng qua các sự cố an ninh mạng diện rộng trong năm 2017:</w:t>
       </w:r>
     </w:p>
     <w:p>
@@ -2241,42 +2660,14 @@
           <w:b/>
           <w:color w:val="000000"/>
         </w:rPr>
-        <w:t>Khâu tính toán kích thước vùng đệm (`SrvOs2FeaListSizeToNt`):</w:t>
-      </w:r>
-      <w:r>
-        <w:rPr>
-          <w:rFonts w:ascii="Times New Roman" w:hAnsi="Times New Roman"/>
-          <w:color w:val="000000"/>
-        </w:rPr>
-        <w:t xml:space="preserve"> Hàm này duyệt qua từng phần tử trong danh sách </w:t>
-      </w:r>
-      <w:r>
-        <w:rPr>
-          <w:rFonts w:ascii="Times New Roman" w:hAnsi="Times New Roman"/>
-          <w:color w:val="000000"/>
-        </w:rPr>
-        <w:t>FEA_LIST</w:t>
-      </w:r>
-      <w:r>
-        <w:rPr>
-          <w:rFonts w:ascii="Times New Roman" w:hAnsi="Times New Roman"/>
-          <w:color w:val="000000"/>
-        </w:rPr>
-        <w:t xml:space="preserve"> để tính toán tổng số byte cần thiết nhằm cấp phát một vùng nhớ trong bộ nhớ nhân không phân trang (Non-Paged Pool). Tuy nhiên, biến lưu trữ kích thước đầu ra của hàm này được khai báo bằng kiểu số nguyên không dấu 16-bit (WORD / </w:t>
-      </w:r>
-      <w:r>
-        <w:rPr>
-          <w:rFonts w:ascii="Times New Roman" w:hAnsi="Times New Roman"/>
-          <w:color w:val="000000"/>
-        </w:rPr>
-        <w:t>unsigned short</w:t>
-      </w:r>
-      <w:r>
-        <w:rPr>
-          <w:rFonts w:ascii="Times New Roman" w:hAnsi="Times New Roman"/>
-          <w:color w:val="000000"/>
-        </w:rPr>
-        <w:t>), có giá trị tối đa là 65.535 byte (0xFFFF). Khi kẻ tấn công gửi một danh sách FEA được cố tình chế tạo với kích thước thực tế lớn hơn 65.535 byte, hiện tượng cắt ngắn số nguyên (Integer Truncation) sẽ xảy ra. Ví dụ, một danh sách có tổng kích thước thực tế là 0x10040 byte (65.600 byte) khi bị ép kiểu về 16-bit sẽ chỉ còn lại giá trị 0x0040 (64 byte).</w:t>
+        <w:t>Chiến dịch mã độc WannaCry (Tháng 05/2017):</w:t>
+      </w:r>
+      <w:r>
+        <w:rPr>
+          <w:rFonts w:ascii="Times New Roman" w:hAnsi="Times New Roman"/>
+          <w:color w:val="000000"/>
+        </w:rPr>
+        <w:t xml:space="preserve"> Mã khai thác EternalBlue bị rò rỉ đã được tích hợp vào cơ chế sâu mạng tự động. WannaCry quét cổng TCP 445 trên Internet và mạng nội bộ, tự động lây nhiễm vào các máy Windows chưa vá để mã hóa dữ liệu đòi tiền chuộc, gây ảnh hưởng đến hàng trăm nghìn hệ thống tại nhiều quốc gia.</w:t>
       </w:r>
     </w:p>
     <w:p>
@@ -2298,28 +2689,14 @@
           <w:b/>
           <w:color w:val="000000"/>
         </w:rPr>
-        <w:t>Khâu cấp phát và sao chép dữ liệu (`SrvOs2FeaToNt`):</w:t>
-      </w:r>
-      <w:r>
-        <w:rPr>
-          <w:rFonts w:ascii="Times New Roman" w:hAnsi="Times New Roman"/>
-          <w:color w:val="000000"/>
-        </w:rPr>
-        <w:t xml:space="preserve"> Dựa trên kết quả tính toán sai lệch của bước trước, hệ điều hành chỉ cấp phát một vùng đệm nhỏ có kích thước 64 byte trong Non-Paged Pool. Sau đó, hàm </w:t>
-      </w:r>
-      <w:r>
-        <w:rPr>
-          <w:rFonts w:ascii="Times New Roman" w:hAnsi="Times New Roman"/>
-          <w:color w:val="000000"/>
-        </w:rPr>
-        <w:t>SrvOs2FeaToNt</w:t>
-      </w:r>
-      <w:r>
-        <w:rPr>
-          <w:rFonts w:ascii="Times New Roman" w:hAnsi="Times New Roman"/>
-          <w:color w:val="000000"/>
-        </w:rPr>
-        <w:t xml:space="preserve"> thực hiện sao chép nội dung từng thuộc tính FEA vào vùng đệm này. Trong quá trình duyệt và sao chép dữ liệu, hàm lại sử dụng kích thước thực tế của từng phần tử FEA mà không kiểm tra lại biên tổng của vùng đệm đã cấp phát. Do đó, dữ liệu sao chép bị tràn ra ngoài phạm vi 64 byte được chỉ định, gây ra hiện tượng tràn vùng đệm nhân (Kernel Pool Overflow).</w:t>
+        <w:t>Chiến dịch mã độc NotPetya (Tháng 06/2017):</w:t>
+      </w:r>
+      <w:r>
+        <w:rPr>
+          <w:rFonts w:ascii="Times New Roman" w:hAnsi="Times New Roman"/>
+          <w:color w:val="000000"/>
+        </w:rPr>
+        <w:t xml:space="preserve"> NotPetya tiếp tục sử dụng các kỹ thuật khai thác trong nhóm MS17-010 để phát tán nhanh chóng trong mạng nội bộ. Mã độc nhắm vào việc phá hoại cấu trúc bản ghi khởi động (MBR) của ổ đĩa, khiến hệ thống không thể khởi động lại và gây gián đoạn hoạt động của nhiều tổ chức.</w:t>
       </w:r>
     </w:p>
     <w:p>
@@ -2329,35 +2706,31 @@
           <w:rFonts w:ascii="Times New Roman" w:hAnsi="Times New Roman"/>
           <w:color w:val="000000"/>
         </w:rPr>
-        <w:t xml:space="preserve">Dữ liệu tràn sẽ ghi đè lên các cấu trúc điều khiển bộ nhớ liền kề trong Non-Paged Pool. Trong các công cụ khai thác vũ khí hóa như EternalBlue, kẻ tấn công kết hợp lỗi này với kỹ thuật dàn xếp bộ nhớ nhân (Kernel Pool Grooming). Bằng cách gửi liên tục các gói tin mạng để sắp đặt vị trí các khối bộ đệm của driver mạng </w:t>
-      </w:r>
-      <w:r>
-        <w:rPr>
-          <w:rFonts w:ascii="Times New Roman" w:hAnsi="Times New Roman"/>
-          <w:color w:val="000000"/>
-        </w:rPr>
-        <w:t>srvnet.sys</w:t>
-      </w:r>
-      <w:r>
-        <w:rPr>
-          <w:rFonts w:ascii="Times New Roman" w:hAnsi="Times New Roman"/>
-          <w:color w:val="000000"/>
-        </w:rPr>
-        <w:t xml:space="preserve"> nằm ngay phía sau vùng đệm bị tràn, mã khai thác có thể ghi đè chính xác lên các con trỏ hàm tiếp nhận dữ liệu. Khi driver mạng gọi con trỏ hàm này để xử lý gói tin tiếp theo, luồng thực thi của CPU sẽ bị điều hướng sang đoạn mã tùy ý chạy dưới đặc quyền tối cao của nhân hệ điều hành (</w:t>
-      </w:r>
-      <w:r>
-        <w:rPr>
-          <w:rFonts w:ascii="Times New Roman" w:hAnsi="Times New Roman"/>
-          <w:color w:val="000000"/>
-        </w:rPr>
-        <w:t>NT AUTHORITY\SYSTEM</w:t>
-      </w:r>
-      <w:r>
-        <w:rPr>
-          <w:rFonts w:ascii="Times New Roman" w:hAnsi="Times New Roman"/>
-          <w:color w:val="000000"/>
-        </w:rPr>
-        <w:t>).</w:t>
+        <w:t>Các sự cố này cho thấy việc duy trì giao thức cũ SMBv1 kết hợp với sự chậm trễ trong cập nhật bản vá có thể tạo ra rủi ro an ninh nghiêm trọng cho toàn bộ hệ thống mạng. Thực tế đó dẫn đến nhu cầu cần có phương pháp kiểm tra, phân loại trạng thái dịch vụ SMB một cách an toàn và có kiểm soát.</w:t>
+      </w:r>
+    </w:p>
+    <w:p>
+      <w:pPr>
+        <w:pStyle w:val="Heading2"/>
+      </w:pPr>
+      <w:r>
+        <w:rPr>
+          <w:rFonts w:ascii="Times New Roman" w:hAnsi="Times New Roman"/>
+          <w:color w:val="000000"/>
+        </w:rPr>
+        <w:t>1.3. Công cụ phục vụ kiểm thử</w:t>
+      </w:r>
+    </w:p>
+    <w:p>
+      <w:pPr>
+        <w:pStyle w:val="Heading3"/>
+      </w:pPr>
+      <w:r>
+        <w:rPr>
+          <w:rFonts w:ascii="Times New Roman" w:hAnsi="Times New Roman"/>
+          <w:color w:val="000000"/>
+        </w:rPr>
+        <w:t>1.3.1. Kali Linux</w:t>
       </w:r>
     </w:p>
     <w:p>
@@ -2367,31 +2740,7 @@
           <w:rFonts w:ascii="Times New Roman" w:hAnsi="Times New Roman"/>
           <w:color w:val="000000"/>
         </w:rPr>
-        <w:t>Do lỗi xảy ra trực tiếp trong vùng nhớ Non-Paged Pool của nhân, nếu quá trình dàn xếp bộ nhớ gặp sai lệch, hệ điều hành sẽ phát sinh lỗi dừng và sập màn hình xanh (BSOD). Điều này giải thích vì sao các thao tác can thiệp vào lỗ hổng luôn đi kèm rủi ro lớn đối với tính sẵn sàng của máy chủ.</w:t>
-      </w:r>
-    </w:p>
-    <w:p>
-      <w:pPr>
-        <w:pStyle w:val="Heading3"/>
-      </w:pPr>
-      <w:r>
-        <w:rPr>
-          <w:rFonts w:ascii="Times New Roman" w:hAnsi="Times New Roman"/>
-          <w:color w:val="000000"/>
-        </w:rPr>
-        <w:t>1.2.4. Điều kiện ảnh hưởng và điều kiện khai thác</w:t>
-      </w:r>
-    </w:p>
-    <w:p>
-      <w:pPr>
-        <w:keepNext/>
-      </w:pPr>
-      <w:r>
-        <w:rPr>
-          <w:rFonts w:ascii="Times New Roman" w:hAnsi="Times New Roman"/>
-          <w:color w:val="000000"/>
-        </w:rPr>
-        <w:t>Trong đánh giá an ninh, việc phân định rạch ròi giữa điều kiện để một hệ thống tồn tại lỗ hổng và điều kiện để lỗ hổng đó có thể bị khai thác thực tế là yêu cầu bắt buộc:</w:t>
+        <w:t>Trong đồ án này, Kali Linux được nhóm em sử dụng làm trạm kiểm thử (Testing Workstation) chuyên dụng. Hệ điều hành cung cấp môi trường dòng lệnh tập trung, tích hợp sẵn các tiện ích mạng, thư viện và công cụ kiểm định bảo mật cần thiết để tương tác với máy chủ Windows mục tiêu.</w:t>
       </w:r>
     </w:p>
     <w:p>
@@ -2399,10 +2748,43 @@
       <w:r>
         <w:rPr>
           <w:rFonts w:ascii="Times New Roman" w:hAnsi="Times New Roman"/>
-          <w:b/>
-          <w:color w:val="000000"/>
-        </w:rPr>
-        <w:t>Điều kiện ảnh hưởng (Hệ thống có tồn tại lỗ hổng hay không):</w:t>
+          <w:color w:val="000000"/>
+        </w:rPr>
+        <w:t>Vai trò chính của trạm kiểm thử là khởi tạo các yêu cầu thăm dò, quản lý cấu hình kết nối mạng và ghi nhận nhật ký (log) của quá trình đánh giá. Bản thân Kali Linux chỉ đóng vai trò nền tảng điều khiển; việc đánh giá an ninh phụ thuộc vào phương pháp và kịch bản thực thi của từng công cụ cụ thể được triển khai bên trong.</w:t>
+      </w:r>
+    </w:p>
+    <w:p>
+      <w:pPr>
+        <w:pStyle w:val="Heading3"/>
+      </w:pPr>
+      <w:r>
+        <w:rPr>
+          <w:rFonts w:ascii="Times New Roman" w:hAnsi="Times New Roman"/>
+          <w:color w:val="000000"/>
+        </w:rPr>
+        <w:t>1.3.2. Nmap</w:t>
+      </w:r>
+    </w:p>
+    <w:p>
+      <w:pPr/>
+      <w:r>
+        <w:rPr>
+          <w:rFonts w:ascii="Times New Roman" w:hAnsi="Times New Roman"/>
+          <w:color w:val="000000"/>
+        </w:rPr>
+        <w:t>Nmap (Network Mapper) được nhóm em sử dụng cho bước trinh sát ban đầu nhằm xác định các máy chủ đang hoạt động và kiểm tra khả năng tiếp cận dịch vụ qua hai cổng mạng TCP 139 và TCP 445.</w:t>
+      </w:r>
+    </w:p>
+    <w:p>
+      <w:pPr>
+        <w:keepNext/>
+      </w:pPr>
+      <w:r>
+        <w:rPr>
+          <w:rFonts w:ascii="Times New Roman" w:hAnsi="Times New Roman"/>
+          <w:color w:val="000000"/>
+        </w:rPr>
+        <w:t>Dữ liệu do Nmap cung cấp phản ánh trạng thái cổng ở tầng giao vận:</w:t>
       </w:r>
     </w:p>
     <w:p>
@@ -2423,7 +2805,14 @@
           <w:rFonts w:ascii="Times New Roman" w:hAnsi="Times New Roman"/>
           <w:color w:val="000000"/>
         </w:rPr>
-        <w:t>Hệ điều hành đang chạy là phiên bản Windows nằm trong diện bị lỗi (chẳng hạn Windows 7 SP1 x64, Windows Server 2008 R2...).</w:t>
+        <w:t>Open</w:t>
+      </w:r>
+      <w:r>
+        <w:rPr>
+          <w:rFonts w:ascii="Times New Roman" w:hAnsi="Times New Roman"/>
+          <w:color w:val="000000"/>
+        </w:rPr>
+        <w:t>: Cổng mạng có tiến trình lắng nghe và tiếp nhận kết nối TCP (phản hồi gói tin TCP SYN-ACK trước yêu cầu SYN từ trạm kiểm thử).</w:t>
       </w:r>
     </w:p>
     <w:p>
@@ -2444,21 +2833,14 @@
           <w:rFonts w:ascii="Times New Roman" w:hAnsi="Times New Roman"/>
           <w:color w:val="000000"/>
         </w:rPr>
-        <w:t xml:space="preserve">Tính năng SMBv1 đang được bật và driver </w:t>
-      </w:r>
-      <w:r>
-        <w:rPr>
-          <w:rFonts w:ascii="Times New Roman" w:hAnsi="Times New Roman"/>
-          <w:color w:val="000000"/>
-        </w:rPr>
-        <w:t>srv.sys</w:t>
-      </w:r>
-      <w:r>
-        <w:rPr>
-          <w:rFonts w:ascii="Times New Roman" w:hAnsi="Times New Roman"/>
-          <w:color w:val="000000"/>
-        </w:rPr>
-        <w:t xml:space="preserve"> đang nạp trong nhân để xử lý các yêu cầu mạng.</w:t>
+        <w:t>Closed</w:t>
+      </w:r>
+      <w:r>
+        <w:rPr>
+          <w:rFonts w:ascii="Times New Roman" w:hAnsi="Times New Roman"/>
+          <w:color w:val="000000"/>
+        </w:rPr>
+        <w:t>: Cổng mạng không có dịch vụ nào tiếp nhận (phản hồi gói tin RST).</w:t>
       </w:r>
     </w:p>
     <w:p>
@@ -2479,7 +2861,14 @@
           <w:rFonts w:ascii="Times New Roman" w:hAnsi="Times New Roman"/>
           <w:color w:val="000000"/>
         </w:rPr>
-        <w:t>Hệ điều hành chưa được cài đặt bản cập nhật an ninh MS17-010 (ví dụ gói cập nhật KB4012212 hoặc KB4012215 đối với Windows 7).</w:t>
+        <w:t>Filtered</w:t>
+      </w:r>
+      <w:r>
+        <w:rPr>
+          <w:rFonts w:ascii="Times New Roman" w:hAnsi="Times New Roman"/>
+          <w:color w:val="000000"/>
+        </w:rPr>
+        <w:t>: Gói tin thăm dò không nhận được phản hồi hoặc bị chặn bởi chính sách tường lửa.</w:t>
       </w:r>
     </w:p>
     <w:p>
@@ -2487,10 +2876,89 @@
       <w:r>
         <w:rPr>
           <w:rFonts w:ascii="Times New Roman" w:hAnsi="Times New Roman"/>
-          <w:b/>
-          <w:color w:val="000000"/>
-        </w:rPr>
-        <w:t>Điều kiện khai thác (Cuộc tấn công có thể thực hiện thành công hay không):</w:t>
+          <w:color w:val="000000"/>
+        </w:rPr>
+        <w:t xml:space="preserve">Tùy chọn </w:t>
+      </w:r>
+      <w:r>
+        <w:rPr>
+          <w:rFonts w:ascii="Times New Roman" w:hAnsi="Times New Roman"/>
+          <w:color w:val="000000"/>
+        </w:rPr>
+        <w:t>-sV</w:t>
+      </w:r>
+      <w:r>
+        <w:rPr>
+          <w:rFonts w:ascii="Times New Roman" w:hAnsi="Times New Roman"/>
+          <w:color w:val="000000"/>
+        </w:rPr>
+        <w:t xml:space="preserve"> của Nmap hỗ trợ nhận diện sơ bộ tên dịch vụ ứng dụng như </w:t>
+      </w:r>
+      <w:r>
+        <w:rPr>
+          <w:rFonts w:ascii="Times New Roman" w:hAnsi="Times New Roman"/>
+          <w:color w:val="000000"/>
+        </w:rPr>
+        <w:t>microsoft-ds</w:t>
+      </w:r>
+      <w:r>
+        <w:rPr>
+          <w:rFonts w:ascii="Times New Roman" w:hAnsi="Times New Roman"/>
+          <w:color w:val="000000"/>
+        </w:rPr>
+        <w:t xml:space="preserve"> hoặc </w:t>
+      </w:r>
+      <w:r>
+        <w:rPr>
+          <w:rFonts w:ascii="Times New Roman" w:hAnsi="Times New Roman"/>
+          <w:color w:val="000000"/>
+        </w:rPr>
+        <w:t>netbios-ssn</w:t>
+      </w:r>
+      <w:r>
+        <w:rPr>
+          <w:rFonts w:ascii="Times New Roman" w:hAnsi="Times New Roman"/>
+          <w:color w:val="000000"/>
+        </w:rPr>
+        <w:t xml:space="preserve">. Tuy nhiên, kết quả từ Nmap chỉ xác nhận cổng dịch vụ có mở từ góc nhìn mạng hay không. Trạng thái cổng 445 </w:t>
+      </w:r>
+      <w:r>
+        <w:rPr>
+          <w:rFonts w:ascii="Times New Roman" w:hAnsi="Times New Roman"/>
+          <w:color w:val="000000"/>
+        </w:rPr>
+        <w:t>Open</w:t>
+      </w:r>
+      <w:r>
+        <w:rPr>
+          <w:rFonts w:ascii="Times New Roman" w:hAnsi="Times New Roman"/>
+          <w:color w:val="000000"/>
+        </w:rPr>
+        <w:t xml:space="preserve"> không đồng nghĩa với việc máy chủ hỗ trợ SMBv1, cũng không chứng minh hệ thống tồn tại lỗ hổng MS17-010 hay có thể bị khai thác. Nmap đóng vai trò sàng lọc ở bước đầu tiên để định vị mục tiêu.</w:t>
+      </w:r>
+    </w:p>
+    <w:p>
+      <w:pPr>
+        <w:pStyle w:val="Heading3"/>
+      </w:pPr>
+      <w:r>
+        <w:rPr>
+          <w:rFonts w:ascii="Times New Roman" w:hAnsi="Times New Roman"/>
+          <w:color w:val="000000"/>
+        </w:rPr>
+        <w:t>1.3.3. Nmap Scripting Engine</w:t>
+      </w:r>
+    </w:p>
+    <w:p>
+      <w:pPr>
+        <w:keepNext/>
+      </w:pPr>
+      <w:r>
+        <w:rPr>
+          <w:rFonts w:ascii="Times New Roman" w:hAnsi="Times New Roman"/>
+          <w:color w:val="000000"/>
+        </w:rPr>
+        <w:t>Nmap Scripting Engine (NSE) mở rộng khả năng kiểm tra của Nmap lên tầng ứng dụng thông qua các kịch bản viết bằng ngôn ngữ Lua. Trong đồ án, hai kịch bản chuyên biệt được nhóm em sử dụng gồm:</w:t>
       </w:r>
     </w:p>
     <w:p>
@@ -2509,9 +2977,45 @@
       <w:r>
         <w:rPr>
           <w:rFonts w:ascii="Times New Roman" w:hAnsi="Times New Roman"/>
-          <w:color w:val="000000"/>
-        </w:rPr>
-        <w:t>Kẻ tấn công có đường truyền mạng thông suốt tới cổng dịch vụ SMB (cổng TCP 445 hoặc TCP 139) của máy chủ mục tiêu.</w:t>
+          <w:b/>
+          <w:color w:val="000000"/>
+        </w:rPr>
+        <w:t>Kịch bản `smb-protocols.nse`:</w:t>
+      </w:r>
+      <w:r>
+        <w:rPr>
+          <w:rFonts w:ascii="Times New Roman" w:hAnsi="Times New Roman"/>
+          <w:color w:val="000000"/>
+        </w:rPr>
+        <w:t xml:space="preserve"> Gửi yêu cầu thương lượng (</w:t>
+      </w:r>
+      <w:r>
+        <w:rPr>
+          <w:rFonts w:ascii="Times New Roman" w:hAnsi="Times New Roman"/>
+          <w:color w:val="000000"/>
+        </w:rPr>
+        <w:t>Negotiate Protocol Request</w:t>
+      </w:r>
+      <w:r>
+        <w:rPr>
+          <w:rFonts w:ascii="Times New Roman" w:hAnsi="Times New Roman"/>
+          <w:color w:val="000000"/>
+        </w:rPr>
+        <w:t>) chứa danh sách dialect để phân tích phản hồi từ máy chủ, qua đó nhận diện hệ thống có chấp thuận giao thức SMBv1 (</w:t>
+      </w:r>
+      <w:r>
+        <w:rPr>
+          <w:rFonts w:ascii="Times New Roman" w:hAnsi="Times New Roman"/>
+          <w:color w:val="000000"/>
+        </w:rPr>
+        <w:t>NT LM 0.12</w:t>
+      </w:r>
+      <w:r>
+        <w:rPr>
+          <w:rFonts w:ascii="Times New Roman" w:hAnsi="Times New Roman"/>
+          <w:color w:val="000000"/>
+        </w:rPr>
+        <w:t>) hay không.</w:t>
       </w:r>
     </w:p>
     <w:p>
@@ -2530,9 +3034,29 @@
       <w:r>
         <w:rPr>
           <w:rFonts w:ascii="Times New Roman" w:hAnsi="Times New Roman"/>
-          <w:color w:val="000000"/>
-        </w:rPr>
-        <w:t>Tường lửa mạng hoặc tường lửa cục bộ Windows Firewall không chặn các cổng này và không lọc các gói tin giao dịch SMB bất thường.</w:t>
+          <w:b/>
+          <w:color w:val="000000"/>
+        </w:rPr>
+        <w:t>Kịch bản `smb-vuln-ms17-010.nse`:</w:t>
+      </w:r>
+      <w:r>
+        <w:rPr>
+          <w:rFonts w:ascii="Times New Roman" w:hAnsi="Times New Roman"/>
+          <w:color w:val="000000"/>
+        </w:rPr>
+        <w:t xml:space="preserve"> Thăm dò dấu hiệu của MS17-010 bằng cách gửi gói tin giao dịch kiểm tra logic qua giao diện SMB.</w:t>
+      </w:r>
+    </w:p>
+    <w:p>
+      <w:pPr>
+        <w:keepNext/>
+      </w:pPr>
+      <w:r>
+        <w:rPr>
+          <w:rFonts w:ascii="Times New Roman" w:hAnsi="Times New Roman"/>
+          <w:color w:val="000000"/>
+        </w:rPr>
+        <w:t>Kịch bản đánh giá dựa trên mã trạng thái NT Status trả về từ hệ điều hành máy chủ:</w:t>
       </w:r>
     </w:p>
     <w:p>
@@ -2553,21 +3077,49 @@
           <w:rFonts w:ascii="Times New Roman" w:hAnsi="Times New Roman"/>
           <w:color w:val="000000"/>
         </w:rPr>
-        <w:t>Máy chủ mục tiêu chấp nhận thương lượng dialect SMBv1 (</w:t>
-      </w:r>
-      <w:r>
-        <w:rPr>
-          <w:rFonts w:ascii="Times New Roman" w:hAnsi="Times New Roman"/>
-          <w:color w:val="000000"/>
-        </w:rPr>
-        <w:t>NT LM 0.12</w:t>
-      </w:r>
-      <w:r>
-        <w:rPr>
-          <w:rFonts w:ascii="Times New Roman" w:hAnsi="Times New Roman"/>
-          <w:color w:val="000000"/>
-        </w:rPr>
-        <w:t>).</w:t>
+        <w:t xml:space="preserve">Nếu nhận mã lỗi bộ nhớ </w:t>
+      </w:r>
+      <w:r>
+        <w:rPr>
+          <w:rFonts w:ascii="Times New Roman" w:hAnsi="Times New Roman"/>
+          <w:color w:val="000000"/>
+        </w:rPr>
+        <w:t>STATUS_INSUFF_SERVER_RESOURCES</w:t>
+      </w:r>
+      <w:r>
+        <w:rPr>
+          <w:rFonts w:ascii="Times New Roman" w:hAnsi="Times New Roman"/>
+          <w:color w:val="000000"/>
+        </w:rPr>
+        <w:t xml:space="preserve"> (</w:t>
+      </w:r>
+      <w:r>
+        <w:rPr>
+          <w:rFonts w:ascii="Times New Roman" w:hAnsi="Times New Roman"/>
+          <w:color w:val="000000"/>
+        </w:rPr>
+        <w:t>0xC0000205</w:t>
+      </w:r>
+      <w:r>
+        <w:rPr>
+          <w:rFonts w:ascii="Times New Roman" w:hAnsi="Times New Roman"/>
+          <w:color w:val="000000"/>
+        </w:rPr>
+        <w:t xml:space="preserve">), hệ thống bộc lộ dấu hiệu chưa được vá theo logic kiểm tra và kịch bản đưa ra cảnh báo </w:t>
+      </w:r>
+      <w:r>
+        <w:rPr>
+          <w:rFonts w:ascii="Times New Roman" w:hAnsi="Times New Roman"/>
+          <w:color w:val="000000"/>
+        </w:rPr>
+        <w:t>State: VULNERABLE</w:t>
+      </w:r>
+      <w:r>
+        <w:rPr>
+          <w:rFonts w:ascii="Times New Roman" w:hAnsi="Times New Roman"/>
+          <w:color w:val="000000"/>
+        </w:rPr>
+        <w:t>.</w:t>
       </w:r>
     </w:p>
     <w:p>
@@ -2588,21 +3140,69 @@
           <w:rFonts w:ascii="Times New Roman" w:hAnsi="Times New Roman"/>
           <w:color w:val="000000"/>
         </w:rPr>
-        <w:t xml:space="preserve">Máy chủ cho phép thiết lập phiên làm việc (kể cả phiên nặc danh Null Session) để kết nối tới tài nguyên chia sẻ quản trị liên tiến trình </w:t>
-      </w:r>
-      <w:r>
-        <w:rPr>
-          <w:rFonts w:ascii="Times New Roman" w:hAnsi="Times New Roman"/>
-          <w:color w:val="000000"/>
-        </w:rPr>
-        <w:t>IPC$</w:t>
-      </w:r>
-      <w:r>
-        <w:rPr>
-          <w:rFonts w:ascii="Times New Roman" w:hAnsi="Times New Roman"/>
-          <w:color w:val="000000"/>
-        </w:rPr>
-        <w:t>.</w:t>
+        <w:t xml:space="preserve">Nếu nhận mã lỗi </w:t>
+      </w:r>
+      <w:r>
+        <w:rPr>
+          <w:rFonts w:ascii="Times New Roman" w:hAnsi="Times New Roman"/>
+          <w:color w:val="000000"/>
+        </w:rPr>
+        <w:t>STATUS_ACCESS_DENIED</w:t>
+      </w:r>
+      <w:r>
+        <w:rPr>
+          <w:rFonts w:ascii="Times New Roman" w:hAnsi="Times New Roman"/>
+          <w:color w:val="000000"/>
+        </w:rPr>
+        <w:t xml:space="preserve"> (</w:t>
+      </w:r>
+      <w:r>
+        <w:rPr>
+          <w:rFonts w:ascii="Times New Roman" w:hAnsi="Times New Roman"/>
+          <w:color w:val="000000"/>
+        </w:rPr>
+        <w:t>0xC0000022</w:t>
+      </w:r>
+      <w:r>
+        <w:rPr>
+          <w:rFonts w:ascii="Times New Roman" w:hAnsi="Times New Roman"/>
+          <w:color w:val="000000"/>
+        </w:rPr>
+        <w:t>) hoặc yêu cầu bị từ chối, phản hồi này phù hợp với trạng thái không bộc lộ dấu hiệu vulnerable theo logic của script. Dù vậy, kết quả này chưa đủ để kết luận độc lập rằng hệ thống đã được vá, vì phản hồi còn chịu ảnh hưởng của chính sách truy cập và cấu hình dịch vụ.</w:t>
+      </w:r>
+    </w:p>
+    <w:p>
+      <w:pPr/>
+      <w:r>
+        <w:rPr>
+          <w:rFonts w:ascii="Times New Roman" w:hAnsi="Times New Roman"/>
+          <w:color w:val="000000"/>
+        </w:rPr>
+        <w:t>Cần nhấn mạnh rằng NSE chỉ phân tích mã lỗi logic từ một gói tin thăm dò chứ không thực hiện chuỗi khai thác thực tế. Vì vậy, kết quả từ NSE có giá trị như một chỉ báo kỹ thuật, không phải bằng chứng khẳng định việc khai thác chắc chắn thành công.</w:t>
+      </w:r>
+    </w:p>
+    <w:p>
+      <w:pPr>
+        <w:pStyle w:val="Heading3"/>
+      </w:pPr>
+      <w:r>
+        <w:rPr>
+          <w:rFonts w:ascii="Times New Roman" w:hAnsi="Times New Roman"/>
+          <w:color w:val="000000"/>
+        </w:rPr>
+        <w:t>1.3.4. Metasploit Framework</w:t>
+      </w:r>
+    </w:p>
+    <w:p>
+      <w:pPr>
+        <w:keepNext/>
+      </w:pPr>
+      <w:r>
+        <w:rPr>
+          <w:rFonts w:ascii="Times New Roman" w:hAnsi="Times New Roman"/>
+          <w:color w:val="000000"/>
+        </w:rPr>
+        <w:t>Metasploit Framework được nhóm em sử dụng như một công cụ đối chiếu và xác minh sâu hơn trong phạm vi thực nghiệm:</w:t>
       </w:r>
     </w:p>
     <w:p>
@@ -2621,9 +3221,74 @@
       <w:r>
         <w:rPr>
           <w:rFonts w:ascii="Times New Roman" w:hAnsi="Times New Roman"/>
-          <w:color w:val="000000"/>
-        </w:rPr>
-        <w:t>Trạng thái phân bổ bộ nhớ nhân của máy chủ đủ ổn định để kỹ thuật dàn xếp Non-Paged Pool hoàn tất mà không kích hoạt lỗi màn hình xanh BSOD.</w:t>
+          <w:b/>
+          <w:color w:val="000000"/>
+        </w:rPr>
+        <w:t>Mô-đun phụ trợ (Auxiliary Module):</w:t>
+      </w:r>
+      <w:r>
+        <w:rPr>
+          <w:rFonts w:ascii="Times New Roman" w:hAnsi="Times New Roman"/>
+          <w:color w:val="000000"/>
+        </w:rPr>
+        <w:t xml:space="preserve"> Mô-đun </w:t>
+      </w:r>
+      <w:r>
+        <w:rPr>
+          <w:rFonts w:ascii="Times New Roman" w:hAnsi="Times New Roman"/>
+          <w:color w:val="000000"/>
+        </w:rPr>
+        <w:t>auxiliary/scanner/smb/smb_ms17_010</w:t>
+      </w:r>
+      <w:r>
+        <w:rPr>
+          <w:rFonts w:ascii="Times New Roman" w:hAnsi="Times New Roman"/>
+          <w:color w:val="000000"/>
+        </w:rPr>
+        <w:t xml:space="preserve"> thực hiện quét độc lập, cung cấp dữ liệu đối chiếu chéo với kịch bản NSE nhằm tăng độ tin cậy của chỉ báo lỗ hổng.</w:t>
+      </w:r>
+    </w:p>
+    <w:p>
+      <w:pPr>
+        <w:spacing w:before="0" w:after="60"/>
+        <w:ind w:left="709" w:hanging="283"/>
+        <w:jc w:val="both"/>
+      </w:pPr>
+      <w:r>
+        <w:rPr>
+          <w:rFonts w:ascii="Times New Roman" w:hAnsi="Times New Roman"/>
+          <w:color w:val="000000"/>
+        </w:rPr>
+        <w:t xml:space="preserve">• </w:t>
+      </w:r>
+      <w:r>
+        <w:rPr>
+          <w:rFonts w:ascii="Times New Roman" w:hAnsi="Times New Roman"/>
+          <w:b/>
+          <w:color w:val="000000"/>
+        </w:rPr>
+        <w:t>Mô-đun khai thác có kiểm soát (Exploit Module):</w:t>
+      </w:r>
+      <w:r>
+        <w:rPr>
+          <w:rFonts w:ascii="Times New Roman" w:hAnsi="Times New Roman"/>
+          <w:color w:val="000000"/>
+        </w:rPr>
+        <w:t xml:space="preserve"> Mô-đun </w:t>
+      </w:r>
+      <w:r>
+        <w:rPr>
+          <w:rFonts w:ascii="Times New Roman" w:hAnsi="Times New Roman"/>
+          <w:color w:val="000000"/>
+        </w:rPr>
+        <w:t>exploit/windows/smb/ms17_010_eternalblue</w:t>
+      </w:r>
+      <w:r>
+        <w:rPr>
+          <w:rFonts w:ascii="Times New Roman" w:hAnsi="Times New Roman"/>
+          <w:color w:val="000000"/>
+        </w:rPr>
+        <w:t xml:space="preserve"> thuộc bước xác minh tác động ở mức sâu hơn, phục vụ việc đánh giá khả năng thực thi mã trên máy chủ mục tiêu.</w:t>
       </w:r>
     </w:p>
     <w:p>
@@ -2633,21 +3298,7 @@
           <w:rFonts w:ascii="Times New Roman" w:hAnsi="Times New Roman"/>
           <w:color w:val="000000"/>
         </w:rPr>
-        <w:t xml:space="preserve">Từ sự phân định trên, có thể thấy trạng thái mở cổng TCP 445 và bật SMBv1 chỉ là điều kiện cần về mặt kết nối dịch vụ. Một máy tính dù đang mở cổng 445 và bật SMBv1 nhưng đã được cập nhật bản vá KB tương ứng thì driver </w:t>
-      </w:r>
-      <w:r>
-        <w:rPr>
-          <w:rFonts w:ascii="Times New Roman" w:hAnsi="Times New Roman"/>
-          <w:color w:val="000000"/>
-        </w:rPr>
-        <w:t>srv.sys</w:t>
-      </w:r>
-      <w:r>
-        <w:rPr>
-          <w:rFonts w:ascii="Times New Roman" w:hAnsi="Times New Roman"/>
-          <w:color w:val="000000"/>
-        </w:rPr>
-        <w:t xml:space="preserve"> đã được sửa đổi để kiểm tra chặt chẽ kích thước FEA, do đó hoàn toàn không thể bị khai thác. Ngược lại, một máy tính tồn tại lỗ hổng nhưng đặt sau tường lửa chặn cổng 445 thì kẻ tấn công từ bên ngoài phân vùng mạng cũng không thể tiếp cận để khai thác.</w:t>
+        <w:t>Khác với các công cụ quét thụ động, mô-đun khai thác tác động trực tiếp vào luồng xử lý bộ nhớ của hệ thống. Kết quả thu được dù thành công, thất bại hay gây mất ổn định dịch vụ đều phải được diễn giải thận trọng cùng với phiên bản hệ điều hành, cấu hình dịch vụ và các điều kiện kỹ thuật đi kèm.</w:t>
       </w:r>
     </w:p>
     <w:p>
@@ -2659,7 +3310,7 @@
           <w:rFonts w:ascii="Times New Roman" w:hAnsi="Times New Roman"/>
           <w:color w:val="000000"/>
         </w:rPr>
-        <w:t>1.2.5. Tác động của lỗ hổng</w:t>
+        <w:t>1.3.5. Vai trò của các công cụ trong quy trình kiểm thử</w:t>
       </w:r>
     </w:p>
     <w:p>
@@ -2671,7 +3322,7 @@
           <w:rFonts w:ascii="Times New Roman" w:hAnsi="Times New Roman"/>
           <w:color w:val="000000"/>
         </w:rPr>
-        <w:t>Tác động của lỗ hổng CVE-2017-0144 thuộc nhóm MS17-010 được xem xét toàn diện qua ba yếu tố bảo đảm an toàn thông tin:</w:t>
+        <w:t>Các công cụ được nhóm em phối hợp theo một chuỗi quy trình có thứ tự logic:</w:t>
       </w:r>
     </w:p>
     <w:p>
@@ -2693,42 +3344,14 @@
           <w:b/>
           <w:color w:val="000000"/>
         </w:rPr>
-        <w:t>Tính bảo mật (Confidentiality):</w:t>
-      </w:r>
-      <w:r>
-        <w:rPr>
-          <w:rFonts w:ascii="Times New Roman" w:hAnsi="Times New Roman"/>
-          <w:color w:val="000000"/>
-        </w:rPr>
-        <w:t xml:space="preserve"> Mức độ ảnh hưởng là tối đa. Khi mã khai thác thực thi trong không gian nhân với quyền </w:t>
-      </w:r>
-      <w:r>
-        <w:rPr>
-          <w:rFonts w:ascii="Times New Roman" w:hAnsi="Times New Roman"/>
-          <w:color w:val="000000"/>
-        </w:rPr>
-        <w:t>SYSTEM</w:t>
-      </w:r>
-      <w:r>
-        <w:rPr>
-          <w:rFonts w:ascii="Times New Roman" w:hAnsi="Times New Roman"/>
-          <w:color w:val="000000"/>
-        </w:rPr>
-        <w:t xml:space="preserve">, kẻ tấn công có thể đọc toàn bộ dữ liệu lưu trữ trên các ổ đĩa, truy cập trực tiếp vào bộ nhớ của tiến trình xác thực </w:t>
-      </w:r>
-      <w:r>
-        <w:rPr>
-          <w:rFonts w:ascii="Times New Roman" w:hAnsi="Times New Roman"/>
-          <w:color w:val="000000"/>
-        </w:rPr>
-        <w:t>lsass.exe</w:t>
-      </w:r>
-      <w:r>
-        <w:rPr>
-          <w:rFonts w:ascii="Times New Roman" w:hAnsi="Times New Roman"/>
-          <w:color w:val="000000"/>
-        </w:rPr>
-        <w:t xml:space="preserve"> để trích xuất mật khẩu dạng văn bản rõ hoặc mã băm NTLM của các tài khoản đăng nhập trên máy.</w:t>
+        <w:t>Trạm kiểm thử Kali Linux:</w:t>
+      </w:r>
+      <w:r>
+        <w:rPr>
+          <w:rFonts w:ascii="Times New Roman" w:hAnsi="Times New Roman"/>
+          <w:color w:val="000000"/>
+        </w:rPr>
+        <w:t xml:space="preserve"> Cung cấp môi trường điều hành để thực thi đồng bộ các công cụ và ghi nhận dữ liệu.</w:t>
       </w:r>
     </w:p>
     <w:p>
@@ -2750,14 +3373,14 @@
           <w:b/>
           <w:color w:val="000000"/>
         </w:rPr>
-        <w:t>Tính toàn vẹn (Integrity):</w:t>
-      </w:r>
-      <w:r>
-        <w:rPr>
-          <w:rFonts w:ascii="Times New Roman" w:hAnsi="Times New Roman"/>
-          <w:color w:val="000000"/>
-        </w:rPr>
-        <w:t xml:space="preserve"> Bị can thiệp tuyệt đối. Kẻ tấn công có toàn quyền sửa đổi, xóa bỏ tệp tin hệ thống, thay đổi chính sách bảo mật, cài đặt các phần mềm độc hại hoặc cấy cửa sau (backdoor) chạy ngầm để duy trì quyền kiểm soát lâu dài.</w:t>
+        <w:t>Nmap:</w:t>
+      </w:r>
+      <w:r>
+        <w:rPr>
+          <w:rFonts w:ascii="Times New Roman" w:hAnsi="Times New Roman"/>
+          <w:color w:val="000000"/>
+        </w:rPr>
+        <w:t xml:space="preserve"> Xác định khả năng tiếp cận dịch vụ qua việc phát hiện các cổng mạng đang mở.</w:t>
       </w:r>
     </w:p>
     <w:p>
@@ -2779,14 +3402,43 @@
           <w:b/>
           <w:color w:val="000000"/>
         </w:rPr>
-        <w:t>Tính sẵn sàng (Availability):</w:t>
-      </w:r>
-      <w:r>
-        <w:rPr>
-          <w:rFonts w:ascii="Times New Roman" w:hAnsi="Times New Roman"/>
-          <w:color w:val="000000"/>
-        </w:rPr>
-        <w:t xml:space="preserve"> Bị đe dọa nghiêm trọng. Quá trình khai thác bộ nhớ nhân rất dễ dẫn đến lỗi làm sập hệ thống (BSOD) khiến dịch vụ bị gián đoạn tức thì. Ngoài ra, kẻ tấn công có thể cố tình tắt máy, khóa dịch vụ hoặc mã hóa toàn bộ dữ liệu máy chủ để tống tiền.</w:t>
+        <w:t>Nmap Scripting Engine:</w:t>
+      </w:r>
+      <w:r>
+        <w:rPr>
+          <w:rFonts w:ascii="Times New Roman" w:hAnsi="Times New Roman"/>
+          <w:color w:val="000000"/>
+        </w:rPr>
+        <w:t xml:space="preserve"> Tương tác ở tầng ứng dụng để nhận diện việc hỗ trợ SMBv1 và thu thập dấu hiệu của MS17-010.</w:t>
+      </w:r>
+    </w:p>
+    <w:p>
+      <w:pPr>
+        <w:spacing w:before="0" w:after="60"/>
+        <w:ind w:left="709" w:hanging="283"/>
+        <w:jc w:val="both"/>
+      </w:pPr>
+      <w:r>
+        <w:rPr>
+          <w:rFonts w:ascii="Times New Roman" w:hAnsi="Times New Roman"/>
+          <w:color w:val="000000"/>
+        </w:rPr>
+        <w:t xml:space="preserve">• </w:t>
+      </w:r>
+      <w:r>
+        <w:rPr>
+          <w:rFonts w:ascii="Times New Roman" w:hAnsi="Times New Roman"/>
+          <w:b/>
+          <w:color w:val="000000"/>
+        </w:rPr>
+        <w:t>Metasploit Framework:</w:t>
+      </w:r>
+      <w:r>
+        <w:rPr>
+          <w:rFonts w:ascii="Times New Roman" w:hAnsi="Times New Roman"/>
+          <w:color w:val="000000"/>
+        </w:rPr>
+        <w:t xml:space="preserve"> Đóng vai trò đối chiếu độc lập và thực hiện bước xác minh sâu hơn khi các dấu hiệu trước đó đã được xác lập.</w:t>
       </w:r>
     </w:p>
     <w:p>
@@ -2796,23 +3448,35 @@
           <w:rFonts w:ascii="Times New Roman" w:hAnsi="Times New Roman"/>
           <w:color w:val="000000"/>
         </w:rPr>
-        <w:t>Đặc điểm khiến CVE-2017-0144 trở nên đặc biệt nguy hiểm là lỗ hổng này không đòi hỏi bất kỳ sự tương tác nào từ phía người dùng (Zero-click) và không yêu cầu cung cấp tài khoản hay mật khẩu hợp lệ trước đó. Đây là đặc tính kỹ thuật biến lỗ hổng thành cửa ngõ lý tưởng cho các cuộc tấn công tự động trên quy mô lớn.</w:t>
+        <w:t>Sự liên kết này bảo đảm quá trình kiểm tra diễn ra từ diện rộng đến chuyên sâu, giúp người kiểm thử hiểu rõ bản chất từng lớp thông tin trước khi đưa ra nhận định về an ninh của hệ thống. Đây là cơ sở trực tiếp để xây dựng khung tiêu chí phân loại trạng thái trong mục tiếp theo.</w:t>
       </w:r>
     </w:p>
     <w:p>
       <w:pPr>
-        <w:pStyle w:val="Heading3"/>
-      </w:pPr>
-      <w:r>
-        <w:rPr>
-          <w:rFonts w:ascii="Times New Roman" w:hAnsi="Times New Roman"/>
-          <w:color w:val="000000"/>
-        </w:rPr>
-        <w:t>1.2.6. Mối liên hệ với các cuộc tấn công thực tế</w:t>
+        <w:pStyle w:val="Heading2"/>
+      </w:pPr>
+      <w:r>
+        <w:rPr>
+          <w:rFonts w:ascii="Times New Roman" w:hAnsi="Times New Roman"/>
+          <w:color w:val="000000"/>
+        </w:rPr>
+        <w:t>1.4. Tiêu chí xác minh trạng thái SMB và MS17-010</w:t>
       </w:r>
     </w:p>
     <w:p>
       <w:pPr>
+        <w:pStyle w:val="Heading3"/>
+      </w:pPr>
+      <w:r>
+        <w:rPr>
+          <w:rFonts w:ascii="Times New Roman" w:hAnsi="Times New Roman"/>
+          <w:color w:val="000000"/>
+        </w:rPr>
+        <w:t>1.4.1. Phát hiện dịch vụ SMB</w:t>
+      </w:r>
+    </w:p>
+    <w:p>
+      <w:pPr>
         <w:keepNext/>
       </w:pPr>
       <w:r>
@@ -2820,7 +3484,7 @@
           <w:rFonts w:ascii="Times New Roman" w:hAnsi="Times New Roman"/>
           <w:color w:val="000000"/>
         </w:rPr>
-        <w:t>Nguy cơ kỹ thuật của MS17-010 đã được minh chứng cụ thể thông qua các sự cố an ninh mạng chấn động thế giới xuất hiện vào năm 2017:</w:t>
+        <w:t>Mức 1 xác định sự hiện diện của dịch vụ SMB trên đường truyền mạng giữa trạm kiểm thử và máy chủ mục tiêu:</w:t>
       </w:r>
     </w:p>
     <w:p>
@@ -2842,14 +3506,28 @@
           <w:b/>
           <w:color w:val="000000"/>
         </w:rPr>
-        <w:t>Chiến dịch mã độc tống tiền WannaCry (Tháng 05/2017):</w:t>
-      </w:r>
-      <w:r>
-        <w:rPr>
-          <w:rFonts w:ascii="Times New Roman" w:hAnsi="Times New Roman"/>
-          <w:color w:val="000000"/>
-        </w:rPr>
-        <w:t xml:space="preserve"> Mã khai thác EternalBlue bị nhóm tin tặc Shadow Brokers làm rò rỉ vào tháng 04/2017. Chỉ một tháng sau, tác giả của WannaCry đã tích hợp mã khai thác này vào một sâu mạng (worm) tự động. WannaCry quét liên tục các cổng TCP 445 trên Internet và mạng nội bộ, tự động xâm nhập các máy Windows chưa vá và mã hóa toàn bộ dữ liệu để đòi tiền chuộc. Vụ tấn công đã lây nhiễm hàng trăm nghìn máy tính tại hơn 150 quốc gia, làm tê liệt hệ thống của nhiều bệnh viện, ngân hàng và cơ quan công quyền.</w:t>
+        <w:t>Dấu hiệu quan sát:</w:t>
+      </w:r>
+      <w:r>
+        <w:rPr>
+          <w:rFonts w:ascii="Times New Roman" w:hAnsi="Times New Roman"/>
+          <w:color w:val="000000"/>
+        </w:rPr>
+        <w:t xml:space="preserve"> Trạm kiểm thử gửi gói tin TCP SYN tới cổng TCP 445 hoặc TCP 139. Trạng thái cổng được ghi nhận là </w:t>
+      </w:r>
+      <w:r>
+        <w:rPr>
+          <w:rFonts w:ascii="Times New Roman" w:hAnsi="Times New Roman"/>
+          <w:color w:val="000000"/>
+        </w:rPr>
+        <w:t>Open</w:t>
+      </w:r>
+      <w:r>
+        <w:rPr>
+          <w:rFonts w:ascii="Times New Roman" w:hAnsi="Times New Roman"/>
+          <w:color w:val="000000"/>
+        </w:rPr>
+        <w:t xml:space="preserve"> khi máy chủ phản hồi gói tin TCP SYN-ACK.</w:t>
       </w:r>
     </w:p>
     <w:p>
@@ -2871,14 +3549,801 @@
           <w:b/>
           <w:color w:val="000000"/>
         </w:rPr>
-        <w:t>Chiến dịch mã độc NotPetya (Tháng 06/2017):</w:t>
-      </w:r>
-      <w:r>
-        <w:rPr>
-          <w:rFonts w:ascii="Times New Roman" w:hAnsi="Times New Roman"/>
-          <w:color w:val="000000"/>
-        </w:rPr>
-        <w:t xml:space="preserve"> NotPetya tiếp tục sử dụng các mã khai thác trong nhóm MS17-010 (kết hợp giữa EternalBlue và EternalRomance) để lây lan với tốc độ cao trong mạng nội bộ của các tập đoàn đa quốc gia. Khác với WannaCry, NotPetya ngụy trang dưới dạng mã độc tống tiền nhưng mục tiêu thực chất là phá hoại: mã độc cố tình ghi đè Master Boot Record (MBR) của ổ cứng, khiến dữ liệu không thể phục hồi và gây thiệt hại kinh tế ước tính hàng tỷ USD.</w:t>
+        <w:t>Ý nghĩa:</w:t>
+      </w:r>
+      <w:r>
+        <w:rPr>
+          <w:rFonts w:ascii="Times New Roman" w:hAnsi="Times New Roman"/>
+          <w:color w:val="000000"/>
+        </w:rPr>
+        <w:t xml:space="preserve"> Chứng minh máy chủ đang vận hành một dịch vụ mạng sẵn sàng tiếp nhận kết nối SMB từ bên ngoài.</w:t>
+      </w:r>
+    </w:p>
+    <w:p>
+      <w:pPr>
+        <w:spacing w:before="0" w:after="60"/>
+        <w:ind w:left="709" w:hanging="283"/>
+        <w:jc w:val="both"/>
+      </w:pPr>
+      <w:r>
+        <w:rPr>
+          <w:rFonts w:ascii="Times New Roman" w:hAnsi="Times New Roman"/>
+          <w:color w:val="000000"/>
+        </w:rPr>
+        <w:t xml:space="preserve">• </w:t>
+      </w:r>
+      <w:r>
+        <w:rPr>
+          <w:rFonts w:ascii="Times New Roman" w:hAnsi="Times New Roman"/>
+          <w:b/>
+          <w:color w:val="000000"/>
+        </w:rPr>
+        <w:t>Ranh giới kết luận:</w:t>
+      </w:r>
+      <w:r>
+        <w:rPr>
+          <w:rFonts w:ascii="Times New Roman" w:hAnsi="Times New Roman"/>
+          <w:color w:val="000000"/>
+        </w:rPr>
+        <w:t xml:space="preserve"> Trạng thái mở cổng 445 hoặc 139 chỉ phản ánh khả năng kết nối ở tầng giao vận, hoàn toàn không đồng nghĩa với việc hệ thống có lỗ hổng. Mọi máy chủ Windows đang chia sẻ tệp tin hoặc máy in hợp lệ đều mở các cổng này.</w:t>
+      </w:r>
+    </w:p>
+    <w:p>
+      <w:pPr>
+        <w:pStyle w:val="Heading3"/>
+      </w:pPr>
+      <w:r>
+        <w:rPr>
+          <w:rFonts w:ascii="Times New Roman" w:hAnsi="Times New Roman"/>
+          <w:color w:val="000000"/>
+        </w:rPr>
+        <w:t>1.4.2. Nhận diện SMBv1</w:t>
+      </w:r>
+    </w:p>
+    <w:p>
+      <w:pPr>
+        <w:keepNext/>
+      </w:pPr>
+      <w:r>
+        <w:rPr>
+          <w:rFonts w:ascii="Times New Roman" w:hAnsi="Times New Roman"/>
+          <w:color w:val="000000"/>
+        </w:rPr>
+        <w:t>Mức 2 kiểm tra xem dịch vụ SMB của máy chủ có chấp thuận giao tiếp bằng phiên bản cũ SMBv1 hay không:</w:t>
+      </w:r>
+    </w:p>
+    <w:p>
+      <w:pPr>
+        <w:spacing w:before="0" w:after="60"/>
+        <w:ind w:left="709" w:hanging="283"/>
+        <w:jc w:val="both"/>
+      </w:pPr>
+      <w:r>
+        <w:rPr>
+          <w:rFonts w:ascii="Times New Roman" w:hAnsi="Times New Roman"/>
+          <w:color w:val="000000"/>
+        </w:rPr>
+        <w:t xml:space="preserve">• </w:t>
+      </w:r>
+      <w:r>
+        <w:rPr>
+          <w:rFonts w:ascii="Times New Roman" w:hAnsi="Times New Roman"/>
+          <w:b/>
+          <w:color w:val="000000"/>
+        </w:rPr>
+        <w:t>Tiêu chí giao thức:</w:t>
+      </w:r>
+      <w:r>
+        <w:rPr>
+          <w:rFonts w:ascii="Times New Roman" w:hAnsi="Times New Roman"/>
+          <w:color w:val="000000"/>
+        </w:rPr>
+        <w:t xml:space="preserve"> Trạm kiểm thử gửi gói tin </w:t>
+      </w:r>
+      <w:r>
+        <w:rPr>
+          <w:rFonts w:ascii="Times New Roman" w:hAnsi="Times New Roman"/>
+          <w:color w:val="000000"/>
+        </w:rPr>
+        <w:t>Negotiate Protocol Request</w:t>
+      </w:r>
+      <w:r>
+        <w:rPr>
+          <w:rFonts w:ascii="Times New Roman" w:hAnsi="Times New Roman"/>
+          <w:color w:val="000000"/>
+        </w:rPr>
+        <w:t xml:space="preserve"> chứa danh sách các dialect. Hệ thống được xác nhận có hỗ trợ SMBv1 khi phản hồi bằng gói tin lựa chọn dialect </w:t>
+      </w:r>
+      <w:r>
+        <w:rPr>
+          <w:rFonts w:ascii="Times New Roman" w:hAnsi="Times New Roman"/>
+          <w:color w:val="000000"/>
+        </w:rPr>
+        <w:t>NT LM 0.12</w:t>
+      </w:r>
+      <w:r>
+        <w:rPr>
+          <w:rFonts w:ascii="Times New Roman" w:hAnsi="Times New Roman"/>
+          <w:color w:val="000000"/>
+        </w:rPr>
+        <w:t>.</w:t>
+      </w:r>
+    </w:p>
+    <w:p>
+      <w:pPr>
+        <w:spacing w:before="0" w:after="60"/>
+        <w:ind w:left="709" w:hanging="283"/>
+        <w:jc w:val="both"/>
+      </w:pPr>
+      <w:r>
+        <w:rPr>
+          <w:rFonts w:ascii="Times New Roman" w:hAnsi="Times New Roman"/>
+          <w:color w:val="000000"/>
+        </w:rPr>
+        <w:t xml:space="preserve">• </w:t>
+      </w:r>
+      <w:r>
+        <w:rPr>
+          <w:rFonts w:ascii="Times New Roman" w:hAnsi="Times New Roman"/>
+          <w:b/>
+          <w:color w:val="000000"/>
+        </w:rPr>
+        <w:t>Ý nghĩa:</w:t>
+      </w:r>
+      <w:r>
+        <w:rPr>
+          <w:rFonts w:ascii="Times New Roman" w:hAnsi="Times New Roman"/>
+          <w:color w:val="000000"/>
+        </w:rPr>
+        <w:t xml:space="preserve"> Khẳng định máy chủ duy trì giao thức legacy và nạp driver </w:t>
+      </w:r>
+      <w:r>
+        <w:rPr>
+          <w:rFonts w:ascii="Times New Roman" w:hAnsi="Times New Roman"/>
+          <w:color w:val="000000"/>
+        </w:rPr>
+        <w:t>srv.sys</w:t>
+      </w:r>
+      <w:r>
+        <w:rPr>
+          <w:rFonts w:ascii="Times New Roman" w:hAnsi="Times New Roman"/>
+          <w:color w:val="000000"/>
+        </w:rPr>
+        <w:t xml:space="preserve"> để xử lý các gói tin này.</w:t>
+      </w:r>
+    </w:p>
+    <w:p>
+      <w:pPr>
+        <w:spacing w:before="0" w:after="60"/>
+        <w:ind w:left="709" w:hanging="283"/>
+        <w:jc w:val="both"/>
+      </w:pPr>
+      <w:r>
+        <w:rPr>
+          <w:rFonts w:ascii="Times New Roman" w:hAnsi="Times New Roman"/>
+          <w:color w:val="000000"/>
+        </w:rPr>
+        <w:t xml:space="preserve">• </w:t>
+      </w:r>
+      <w:r>
+        <w:rPr>
+          <w:rFonts w:ascii="Times New Roman" w:hAnsi="Times New Roman"/>
+          <w:b/>
+          <w:color w:val="000000"/>
+        </w:rPr>
+        <w:t>Ranh giới kết luận:</w:t>
+      </w:r>
+      <w:r>
+        <w:rPr>
+          <w:rFonts w:ascii="Times New Roman" w:hAnsi="Times New Roman"/>
+          <w:color w:val="000000"/>
+        </w:rPr>
+        <w:t xml:space="preserve"> Hỗ trợ SMBv1 là điều kiện cần về giao thức, nhưng chưa đủ cơ sở để khẳng định hệ thống tồn tại lỗ hổng MS17-010. Một máy chủ Windows đã cập nhật bản vá vẫn có thể bật SMBv1 để phục vụ tương thích nghiệp vụ mà vẫn an toàn trước lỗi xử lý bộ nhớ.</w:t>
+      </w:r>
+    </w:p>
+    <w:p>
+      <w:pPr>
+        <w:pStyle w:val="Heading3"/>
+      </w:pPr>
+      <w:r>
+        <w:rPr>
+          <w:rFonts w:ascii="Times New Roman" w:hAnsi="Times New Roman"/>
+          <w:color w:val="000000"/>
+        </w:rPr>
+        <w:t>1.4.3. Xác định dấu hiệu lỗ hổng</w:t>
+      </w:r>
+    </w:p>
+    <w:p>
+      <w:pPr>
+        <w:keepNext/>
+      </w:pPr>
+      <w:r>
+        <w:rPr>
+          <w:rFonts w:ascii="Times New Roman" w:hAnsi="Times New Roman"/>
+          <w:color w:val="000000"/>
+        </w:rPr>
+        <w:t xml:space="preserve">Mức 3 thu thập các phản hồi kỹ thuật để nhận diện dấu hiệu driver </w:t>
+      </w:r>
+      <w:r>
+        <w:rPr>
+          <w:rFonts w:ascii="Times New Roman" w:hAnsi="Times New Roman"/>
+          <w:color w:val="000000"/>
+        </w:rPr>
+        <w:t>srv.sys</w:t>
+      </w:r>
+      <w:r>
+        <w:rPr>
+          <w:rFonts w:ascii="Times New Roman" w:hAnsi="Times New Roman"/>
+          <w:color w:val="000000"/>
+        </w:rPr>
+        <w:t xml:space="preserve"> chưa được cập nhật bản vá an ninh:</w:t>
+      </w:r>
+    </w:p>
+    <w:p>
+      <w:pPr>
+        <w:spacing w:before="0" w:after="60"/>
+        <w:ind w:left="709" w:hanging="283"/>
+        <w:jc w:val="both"/>
+      </w:pPr>
+      <w:r>
+        <w:rPr>
+          <w:rFonts w:ascii="Times New Roman" w:hAnsi="Times New Roman"/>
+          <w:color w:val="000000"/>
+        </w:rPr>
+        <w:t xml:space="preserve">• </w:t>
+      </w:r>
+      <w:r>
+        <w:rPr>
+          <w:rFonts w:ascii="Times New Roman" w:hAnsi="Times New Roman"/>
+          <w:b/>
+          <w:color w:val="000000"/>
+        </w:rPr>
+        <w:t>Phản hồi dịch vụ:</w:t>
+      </w:r>
+      <w:r>
+        <w:rPr>
+          <w:rFonts w:ascii="Times New Roman" w:hAnsi="Times New Roman"/>
+          <w:color w:val="000000"/>
+        </w:rPr>
+        <w:t xml:space="preserve"> Trạm kiểm thử gửi gói tin giao dịch thăm dò an toàn qua giao diện SMB:</w:t>
+      </w:r>
+    </w:p>
+    <w:p>
+      <w:pPr>
+        <w:spacing w:before="0" w:after="60"/>
+        <w:ind w:left="992" w:hanging="283"/>
+        <w:jc w:val="both"/>
+      </w:pPr>
+      <w:r>
+        <w:rPr>
+          <w:rFonts w:ascii="Times New Roman" w:hAnsi="Times New Roman"/>
+          <w:color w:val="000000"/>
+        </w:rPr>
+        <w:t xml:space="preserve">– </w:t>
+      </w:r>
+      <w:r>
+        <w:rPr>
+          <w:rFonts w:ascii="Times New Roman" w:hAnsi="Times New Roman"/>
+          <w:i/>
+          <w:color w:val="000000"/>
+        </w:rPr>
+        <w:t>Dấu hiệu chưa vá:</w:t>
+      </w:r>
+      <w:r>
+        <w:rPr>
+          <w:rFonts w:ascii="Times New Roman" w:hAnsi="Times New Roman"/>
+          <w:color w:val="000000"/>
+        </w:rPr>
+        <w:t xml:space="preserve"> Máy chủ phản hồi mã trạng thái </w:t>
+      </w:r>
+      <w:r>
+        <w:rPr>
+          <w:rFonts w:ascii="Times New Roman" w:hAnsi="Times New Roman"/>
+          <w:color w:val="000000"/>
+        </w:rPr>
+        <w:t>STATUS_INSUFF_SERVER_RESOURCES</w:t>
+      </w:r>
+      <w:r>
+        <w:rPr>
+          <w:rFonts w:ascii="Times New Roman" w:hAnsi="Times New Roman"/>
+          <w:color w:val="000000"/>
+        </w:rPr>
+        <w:t xml:space="preserve"> (</w:t>
+      </w:r>
+      <w:r>
+        <w:rPr>
+          <w:rFonts w:ascii="Times New Roman" w:hAnsi="Times New Roman"/>
+          <w:color w:val="000000"/>
+        </w:rPr>
+        <w:t>0xC0000205</w:t>
+      </w:r>
+      <w:r>
+        <w:rPr>
+          <w:rFonts w:ascii="Times New Roman" w:hAnsi="Times New Roman"/>
+          <w:color w:val="000000"/>
+        </w:rPr>
+        <w:t>), phản ánh việc nhánh mã xử lý cũ đang vận hành.</w:t>
+      </w:r>
+    </w:p>
+    <w:p>
+      <w:pPr>
+        <w:spacing w:before="0" w:after="60"/>
+        <w:ind w:left="992" w:hanging="283"/>
+        <w:jc w:val="both"/>
+      </w:pPr>
+      <w:r>
+        <w:rPr>
+          <w:rFonts w:ascii="Times New Roman" w:hAnsi="Times New Roman"/>
+          <w:color w:val="000000"/>
+        </w:rPr>
+        <w:t xml:space="preserve">– </w:t>
+      </w:r>
+      <w:r>
+        <w:rPr>
+          <w:rFonts w:ascii="Times New Roman" w:hAnsi="Times New Roman"/>
+          <w:i/>
+          <w:color w:val="000000"/>
+        </w:rPr>
+        <w:t>Dấu hiệu không bộc lộ lỗ hổng:</w:t>
+      </w:r>
+      <w:r>
+        <w:rPr>
+          <w:rFonts w:ascii="Times New Roman" w:hAnsi="Times New Roman"/>
+          <w:color w:val="000000"/>
+        </w:rPr>
+        <w:t xml:space="preserve"> Máy chủ phản hồi mã lỗi </w:t>
+      </w:r>
+      <w:r>
+        <w:rPr>
+          <w:rFonts w:ascii="Times New Roman" w:hAnsi="Times New Roman"/>
+          <w:color w:val="000000"/>
+        </w:rPr>
+        <w:t>STATUS_ACCESS_DENIED</w:t>
+      </w:r>
+      <w:r>
+        <w:rPr>
+          <w:rFonts w:ascii="Times New Roman" w:hAnsi="Times New Roman"/>
+          <w:color w:val="000000"/>
+        </w:rPr>
+        <w:t xml:space="preserve"> (</w:t>
+      </w:r>
+      <w:r>
+        <w:rPr>
+          <w:rFonts w:ascii="Times New Roman" w:hAnsi="Times New Roman"/>
+          <w:color w:val="000000"/>
+        </w:rPr>
+        <w:t>0xC0000022</w:t>
+      </w:r>
+      <w:r>
+        <w:rPr>
+          <w:rFonts w:ascii="Times New Roman" w:hAnsi="Times New Roman"/>
+          <w:color w:val="000000"/>
+        </w:rPr>
+        <w:t>) hoặc từ chối xử lý yêu cầu thăm dò.</w:t>
+      </w:r>
+    </w:p>
+    <w:p>
+      <w:pPr>
+        <w:spacing w:before="0" w:after="60"/>
+        <w:ind w:left="709" w:hanging="283"/>
+        <w:jc w:val="both"/>
+      </w:pPr>
+      <w:r>
+        <w:rPr>
+          <w:rFonts w:ascii="Times New Roman" w:hAnsi="Times New Roman"/>
+          <w:color w:val="000000"/>
+        </w:rPr>
+        <w:t xml:space="preserve">• </w:t>
+      </w:r>
+      <w:r>
+        <w:rPr>
+          <w:rFonts w:ascii="Times New Roman" w:hAnsi="Times New Roman"/>
+          <w:b/>
+          <w:color w:val="000000"/>
+        </w:rPr>
+        <w:t>Ý nghĩa:</w:t>
+      </w:r>
+      <w:r>
+        <w:rPr>
+          <w:rFonts w:ascii="Times New Roman" w:hAnsi="Times New Roman"/>
+          <w:color w:val="000000"/>
+        </w:rPr>
+        <w:t xml:space="preserve"> Cung cấp chỉ báo kỹ thuật về khả năng hệ thống đang thiếu bản cập nhật an ninh tương ứng.</w:t>
+      </w:r>
+    </w:p>
+    <w:p>
+      <w:pPr>
+        <w:spacing w:before="0" w:after="60"/>
+        <w:ind w:left="709" w:hanging="283"/>
+        <w:jc w:val="both"/>
+      </w:pPr>
+      <w:r>
+        <w:rPr>
+          <w:rFonts w:ascii="Times New Roman" w:hAnsi="Times New Roman"/>
+          <w:color w:val="000000"/>
+        </w:rPr>
+        <w:t xml:space="preserve">• </w:t>
+      </w:r>
+      <w:r>
+        <w:rPr>
+          <w:rFonts w:ascii="Times New Roman" w:hAnsi="Times New Roman"/>
+          <w:b/>
+          <w:color w:val="000000"/>
+        </w:rPr>
+        <w:t>Ranh giới kết luận:</w:t>
+      </w:r>
+      <w:r>
+        <w:rPr>
+          <w:rFonts w:ascii="Times New Roman" w:hAnsi="Times New Roman"/>
+          <w:color w:val="000000"/>
+        </w:rPr>
+        <w:t xml:space="preserve"> Dấu hiệu ở Mức 3 mới dừng ở mức suy đoán có căn cứ từ một yêu cầu thăm dò, không phải là bằng chứng khẳng định việc khai thác chắc chắn thành công. Kết quả này còn chịu ảnh hưởng bởi cấu hình kiểm soát truy cập của máy chủ.</w:t>
+      </w:r>
+    </w:p>
+    <w:p>
+      <w:pPr>
+        <w:pStyle w:val="Heading3"/>
+      </w:pPr>
+      <w:r>
+        <w:rPr>
+          <w:rFonts w:ascii="Times New Roman" w:hAnsi="Times New Roman"/>
+          <w:color w:val="000000"/>
+        </w:rPr>
+        <w:t>1.4.4. Xác minh lỗ hổng</w:t>
+      </w:r>
+    </w:p>
+    <w:p>
+      <w:pPr>
+        <w:keepNext/>
+      </w:pPr>
+      <w:r>
+        <w:rPr>
+          <w:rFonts w:ascii="Times New Roman" w:hAnsi="Times New Roman"/>
+          <w:color w:val="000000"/>
+        </w:rPr>
+        <w:t>Mức 4 đại diện cho bước kiểm chứng sâu hơn về khả năng tác động thực tế của lỗ hổng trong phạm vi thử nghiệm được kiểm soát:</w:t>
+      </w:r>
+    </w:p>
+    <w:p>
+      <w:pPr>
+        <w:spacing w:before="0" w:after="60"/>
+        <w:ind w:left="709" w:hanging="283"/>
+        <w:jc w:val="both"/>
+      </w:pPr>
+      <w:r>
+        <w:rPr>
+          <w:rFonts w:ascii="Times New Roman" w:hAnsi="Times New Roman"/>
+          <w:color w:val="000000"/>
+        </w:rPr>
+        <w:t xml:space="preserve">• </w:t>
+      </w:r>
+      <w:r>
+        <w:rPr>
+          <w:rFonts w:ascii="Times New Roman" w:hAnsi="Times New Roman"/>
+          <w:b/>
+          <w:color w:val="000000"/>
+        </w:rPr>
+        <w:t>Phương pháp kiểm chứng:</w:t>
+      </w:r>
+      <w:r>
+        <w:rPr>
+          <w:rFonts w:ascii="Times New Roman" w:hAnsi="Times New Roman"/>
+          <w:color w:val="000000"/>
+        </w:rPr>
+        <w:t xml:space="preserve"> Kích hoạt mô-đun kiểm chứng để đánh giá phản ứng thực tế của máy chủ mục tiêu trước yêu cầu can thiệp. Kết quả được phân định theo ba trạng thái:</w:t>
+      </w:r>
+    </w:p>
+    <w:p>
+      <w:pPr>
+        <w:spacing w:before="0" w:after="60"/>
+        <w:ind w:left="992" w:hanging="283"/>
+        <w:jc w:val="both"/>
+      </w:pPr>
+      <w:r>
+        <w:rPr>
+          <w:rFonts w:ascii="Times New Roman" w:hAnsi="Times New Roman"/>
+          <w:color w:val="000000"/>
+        </w:rPr>
+        <w:t xml:space="preserve">– </w:t>
+      </w:r>
+      <w:r>
+        <w:rPr>
+          <w:rFonts w:ascii="Times New Roman" w:hAnsi="Times New Roman"/>
+          <w:i/>
+          <w:color w:val="000000"/>
+        </w:rPr>
+        <w:t>Xác minh thành công:</w:t>
+      </w:r>
+      <w:r>
+        <w:rPr>
+          <w:rFonts w:ascii="Times New Roman" w:hAnsi="Times New Roman"/>
+          <w:color w:val="000000"/>
+        </w:rPr>
+        <w:t xml:space="preserve"> Thiết lập được quyền điều khiển tương tác trên máy chủ mục tiêu, chứng minh lỗ hổng có thể bị lợi dụng để thực thi mã từ xa.</w:t>
+      </w:r>
+    </w:p>
+    <w:p>
+      <w:pPr>
+        <w:spacing w:before="0" w:after="60"/>
+        <w:ind w:left="992" w:hanging="283"/>
+        <w:jc w:val="both"/>
+      </w:pPr>
+      <w:r>
+        <w:rPr>
+          <w:rFonts w:ascii="Times New Roman" w:hAnsi="Times New Roman"/>
+          <w:color w:val="000000"/>
+        </w:rPr>
+        <w:t xml:space="preserve">– </w:t>
+      </w:r>
+      <w:r>
+        <w:rPr>
+          <w:rFonts w:ascii="Times New Roman" w:hAnsi="Times New Roman"/>
+          <w:i/>
+          <w:color w:val="000000"/>
+        </w:rPr>
+        <w:t>Không xác minh được:</w:t>
+      </w:r>
+      <w:r>
+        <w:rPr>
+          <w:rFonts w:ascii="Times New Roman" w:hAnsi="Times New Roman"/>
+          <w:color w:val="000000"/>
+        </w:rPr>
+        <w:t xml:space="preserve"> Quá trình can thiệp bị từ chối, kết nối bị đóng hoặc hệ thống không phản hồi, cho thấy điều kiện mục tiêu không phù hợp để thực hiện tác động.</w:t>
+      </w:r>
+    </w:p>
+    <w:p>
+      <w:pPr>
+        <w:spacing w:before="0" w:after="60"/>
+        <w:ind w:left="992" w:hanging="283"/>
+        <w:jc w:val="both"/>
+      </w:pPr>
+      <w:r>
+        <w:rPr>
+          <w:rFonts w:ascii="Times New Roman" w:hAnsi="Times New Roman"/>
+          <w:color w:val="000000"/>
+        </w:rPr>
+        <w:t xml:space="preserve">– </w:t>
+      </w:r>
+      <w:r>
+        <w:rPr>
+          <w:rFonts w:ascii="Times New Roman" w:hAnsi="Times New Roman"/>
+          <w:i/>
+          <w:color w:val="000000"/>
+        </w:rPr>
+        <w:t>Hệ thống mất ổn định:</w:t>
+      </w:r>
+      <w:r>
+        <w:rPr>
+          <w:rFonts w:ascii="Times New Roman" w:hAnsi="Times New Roman"/>
+          <w:color w:val="000000"/>
+        </w:rPr>
+        <w:t xml:space="preserve"> Máy chủ bị treo hoặc phát sinh lỗi màn hình xanh (BSOD). Hiện tượng này chứng minh hệ thống bị ảnh hưởng về tính sẵn sàng, nhưng không được coi là xác minh thực thi mã thành công.</w:t>
+      </w:r>
+    </w:p>
+    <w:p>
+      <w:pPr>
+        <w:spacing w:before="0" w:after="60"/>
+        <w:ind w:left="709" w:hanging="283"/>
+        <w:jc w:val="both"/>
+      </w:pPr>
+      <w:r>
+        <w:rPr>
+          <w:rFonts w:ascii="Times New Roman" w:hAnsi="Times New Roman"/>
+          <w:color w:val="000000"/>
+        </w:rPr>
+        <w:t xml:space="preserve">• </w:t>
+      </w:r>
+      <w:r>
+        <w:rPr>
+          <w:rFonts w:ascii="Times New Roman" w:hAnsi="Times New Roman"/>
+          <w:b/>
+          <w:color w:val="000000"/>
+        </w:rPr>
+        <w:t>Ý nghĩa:</w:t>
+      </w:r>
+      <w:r>
+        <w:rPr>
+          <w:rFonts w:ascii="Times New Roman" w:hAnsi="Times New Roman"/>
+          <w:color w:val="000000"/>
+        </w:rPr>
+        <w:t xml:space="preserve"> Cung cấp cơ sở thực nghiệm rõ ràng nhất để phân biệt giữa việc chỉ tồn tại dấu hiệu và khả năng tác động thực tế.</w:t>
+      </w:r>
+    </w:p>
+    <w:p>
+      <w:pPr>
+        <w:spacing w:before="0" w:after="60"/>
+        <w:ind w:left="709" w:hanging="283"/>
+        <w:jc w:val="both"/>
+      </w:pPr>
+      <w:r>
+        <w:rPr>
+          <w:rFonts w:ascii="Times New Roman" w:hAnsi="Times New Roman"/>
+          <w:color w:val="000000"/>
+        </w:rPr>
+        <w:t xml:space="preserve">• </w:t>
+      </w:r>
+      <w:r>
+        <w:rPr>
+          <w:rFonts w:ascii="Times New Roman" w:hAnsi="Times New Roman"/>
+          <w:b/>
+          <w:color w:val="000000"/>
+        </w:rPr>
+        <w:t>Ranh giới kết luận:</w:t>
+      </w:r>
+      <w:r>
+        <w:rPr>
+          <w:rFonts w:ascii="Times New Roman" w:hAnsi="Times New Roman"/>
+          <w:color w:val="000000"/>
+        </w:rPr>
+        <w:t xml:space="preserve"> Thao tác ở Mức 4 có tính xâm nhập cao, chỉ được triển khai trong phạm vi môi trường thử nghiệm có kiểm soát chặt chẽ.</w:t>
+      </w:r>
+    </w:p>
+    <w:p>
+      <w:pPr>
+        <w:pStyle w:val="Heading3"/>
+      </w:pPr>
+      <w:r>
+        <w:rPr>
+          <w:rFonts w:ascii="Times New Roman" w:hAnsi="Times New Roman"/>
+          <w:color w:val="000000"/>
+        </w:rPr>
+        <w:t>1.4.5. Giới hạn của phương pháp xác minh</w:t>
+      </w:r>
+    </w:p>
+    <w:p>
+      <w:pPr>
+        <w:keepNext/>
+      </w:pPr>
+      <w:r>
+        <w:rPr>
+          <w:rFonts w:ascii="Times New Roman" w:hAnsi="Times New Roman"/>
+          <w:color w:val="000000"/>
+        </w:rPr>
+        <w:t>Khi đánh giá kết quả, cần lưu ý một số giới hạn kỹ thuật sau:</w:t>
+      </w:r>
+    </w:p>
+    <w:p>
+      <w:pPr>
+        <w:spacing w:before="0" w:after="60"/>
+        <w:ind w:left="709" w:hanging="283"/>
+        <w:jc w:val="both"/>
+      </w:pPr>
+      <w:r>
+        <w:rPr>
+          <w:rFonts w:ascii="Times New Roman" w:hAnsi="Times New Roman"/>
+          <w:color w:val="000000"/>
+        </w:rPr>
+        <w:t xml:space="preserve">• </w:t>
+      </w:r>
+      <w:r>
+        <w:rPr>
+          <w:rFonts w:ascii="Times New Roman" w:hAnsi="Times New Roman"/>
+          <w:b/>
+          <w:color w:val="000000"/>
+        </w:rPr>
+        <w:t>Ảnh hưởng của tường lửa:</w:t>
+      </w:r>
+      <w:r>
+        <w:rPr>
+          <w:rFonts w:ascii="Times New Roman" w:hAnsi="Times New Roman"/>
+          <w:color w:val="000000"/>
+        </w:rPr>
+        <w:t xml:space="preserve"> Tường lửa mạng hoặc tường lửa cục bộ nếu chặn cổng hoặc lọc gói tin sẽ làm xuất hiện trạng thái </w:t>
+      </w:r>
+      <w:r>
+        <w:rPr>
+          <w:rFonts w:ascii="Times New Roman" w:hAnsi="Times New Roman"/>
+          <w:color w:val="000000"/>
+        </w:rPr>
+        <w:t>Filtered</w:t>
+      </w:r>
+      <w:r>
+        <w:rPr>
+          <w:rFonts w:ascii="Times New Roman" w:hAnsi="Times New Roman"/>
+          <w:color w:val="000000"/>
+        </w:rPr>
+        <w:t>. Trạng thái này chỉ phản ánh đường truyền bị chặn từ góc nhìn của trạm kiểm thử, không phản ánh cấu hình an ninh nội tại của máy chủ.</w:t>
+      </w:r>
+    </w:p>
+    <w:p>
+      <w:pPr>
+        <w:spacing w:before="0" w:after="60"/>
+        <w:ind w:left="709" w:hanging="283"/>
+        <w:jc w:val="both"/>
+      </w:pPr>
+      <w:r>
+        <w:rPr>
+          <w:rFonts w:ascii="Times New Roman" w:hAnsi="Times New Roman"/>
+          <w:color w:val="000000"/>
+        </w:rPr>
+        <w:t xml:space="preserve">• </w:t>
+      </w:r>
+      <w:r>
+        <w:rPr>
+          <w:rFonts w:ascii="Times New Roman" w:hAnsi="Times New Roman"/>
+          <w:b/>
+          <w:color w:val="000000"/>
+        </w:rPr>
+        <w:t>Chính sách kiểm soát truy cập:</w:t>
+      </w:r>
+      <w:r>
+        <w:rPr>
+          <w:rFonts w:ascii="Times New Roman" w:hAnsi="Times New Roman"/>
+          <w:color w:val="000000"/>
+        </w:rPr>
+        <w:t xml:space="preserve"> Khi máy chủ áp dụng chính sách hạn chế kết nối nặc danh (Null Session) vào tài nguyên </w:t>
+      </w:r>
+      <w:r>
+        <w:rPr>
+          <w:rFonts w:ascii="Times New Roman" w:hAnsi="Times New Roman"/>
+          <w:color w:val="000000"/>
+        </w:rPr>
+        <w:t>IPC$</w:t>
+      </w:r>
+      <w:r>
+        <w:rPr>
+          <w:rFonts w:ascii="Times New Roman" w:hAnsi="Times New Roman"/>
+          <w:color w:val="000000"/>
+        </w:rPr>
+        <w:t>, các kịch bản thăm dò ở Mức 3 có thể không nhận được mã phản hồi mong muốn. Tình huống này dễ dẫn đến nguy cơ âm tính giả dù hệ điều hành mục tiêu chưa được cập nhật bản vá.</w:t>
+      </w:r>
+    </w:p>
+    <w:p>
+      <w:pPr>
+        <w:spacing w:before="0" w:after="60"/>
+        <w:ind w:left="709" w:hanging="283"/>
+        <w:jc w:val="both"/>
+      </w:pPr>
+      <w:r>
+        <w:rPr>
+          <w:rFonts w:ascii="Times New Roman" w:hAnsi="Times New Roman"/>
+          <w:color w:val="000000"/>
+        </w:rPr>
+        <w:t xml:space="preserve">• </w:t>
+      </w:r>
+      <w:r>
+        <w:rPr>
+          <w:rFonts w:ascii="Times New Roman" w:hAnsi="Times New Roman"/>
+          <w:b/>
+          <w:color w:val="000000"/>
+        </w:rPr>
+        <w:t>Khác biệt giữa các phiên bản hệ điều hành:</w:t>
+      </w:r>
+      <w:r>
+        <w:rPr>
+          <w:rFonts w:ascii="Times New Roman" w:hAnsi="Times New Roman"/>
+          <w:color w:val="000000"/>
+        </w:rPr>
+        <w:t xml:space="preserve"> Cơ chế quản lý bộ nhớ nhân giữa các thế hệ Windows có sự khác biệt rõ rệt. Một kỹ thuật kiểm chứng có tác động trên phiên bản này có thể chỉ gây lỗi dừng hoặc không hoạt động trên phiên bản khác.</w:t>
+      </w:r>
+    </w:p>
+    <w:p>
+      <w:pPr>
+        <w:spacing w:before="0" w:after="60"/>
+        <w:ind w:left="709" w:hanging="283"/>
+        <w:jc w:val="both"/>
+      </w:pPr>
+      <w:r>
+        <w:rPr>
+          <w:rFonts w:ascii="Times New Roman" w:hAnsi="Times New Roman"/>
+          <w:color w:val="000000"/>
+        </w:rPr>
+        <w:t xml:space="preserve">• </w:t>
+      </w:r>
+      <w:r>
+        <w:rPr>
+          <w:rFonts w:ascii="Times New Roman" w:hAnsi="Times New Roman"/>
+          <w:b/>
+          <w:color w:val="000000"/>
+        </w:rPr>
+        <w:t>Giới hạn của việc quan sát từ bên ngoài (Black-box):</w:t>
+      </w:r>
+      <w:r>
+        <w:rPr>
+          <w:rFonts w:ascii="Times New Roman" w:hAnsi="Times New Roman"/>
+          <w:color w:val="000000"/>
+        </w:rPr>
+        <w:t xml:space="preserve"> Mọi phép đo từ xa chỉ ghi nhận phản hồi trên đường truyền mạng. Để có kết luận chính xác, kết quả kiểm tra từ xa nên được đối chiếu với trạng thái nội tại của máy chủ (White-box), bao gồm danh mục bản vá KB đã cài đặt và trạng thái kích hoạt thực tế của dịch vụ SMBv1.</w:t>
       </w:r>
     </w:p>
     <w:p>
@@ -2888,1860 +4353,7 @@
           <w:rFonts w:ascii="Times New Roman" w:hAnsi="Times New Roman"/>
           <w:color w:val="000000"/>
         </w:rPr>
-        <w:t>Các chiến dịch thực tế này phản ánh bài học quản trị sâu sắc: lỗ hổng giao thức kết hợp với sự chậm trễ cập nhật bản vá và việc duy trì SMBv1 có thể biến mạng nội bộ thành môi trường lây nhiễm diện rộng. Nhận thức rõ điều này, nhóm em xác định việc xây dựng phương pháp kiểm tra an toàn và có kiểm soát là yêu cầu cấp thiết để nhận diện và phòng vệ dịch vụ SMB.</w:t>
-      </w:r>
-    </w:p>
-    <w:p>
-      <w:pPr>
-        <w:pStyle w:val="Heading2"/>
-      </w:pPr>
-      <w:r>
-        <w:rPr>
-          <w:rFonts w:ascii="Times New Roman" w:hAnsi="Times New Roman"/>
-          <w:color w:val="000000"/>
-        </w:rPr>
-        <w:t>1.3. Công cụ phục vụ kiểm thử</w:t>
-      </w:r>
-    </w:p>
-    <w:p>
-      <w:pPr>
-        <w:pStyle w:val="Heading3"/>
-      </w:pPr>
-      <w:r>
-        <w:rPr>
-          <w:rFonts w:ascii="Times New Roman" w:hAnsi="Times New Roman"/>
-          <w:color w:val="000000"/>
-        </w:rPr>
-        <w:t>1.3.1. Kali Linux</w:t>
-      </w:r>
-    </w:p>
-    <w:p>
-      <w:pPr/>
-      <w:r>
-        <w:rPr>
-          <w:rFonts w:ascii="Times New Roman" w:hAnsi="Times New Roman"/>
-          <w:color w:val="000000"/>
-        </w:rPr>
-        <w:t>Trong đồ án này, Kali Linux được nhóm em sử dụng làm trạm kiểm thử (Testing Workstation) chuyên dụng. Hệ điều hành cung cấp nền tảng dòng lệnh tập trung, cho phép thực thi đồng bộ các công cụ mạng, quản lý cấu hình giao tiếp và ghi nhận nhật ký (log) chi tiết trong suốt quá trình thử nghiệm.</w:t>
-      </w:r>
-    </w:p>
-    <w:p>
-      <w:pPr/>
-      <w:r>
-        <w:rPr>
-          <w:rFonts w:ascii="Times New Roman" w:hAnsi="Times New Roman"/>
-          <w:color w:val="000000"/>
-        </w:rPr>
-        <w:t>Tuy nhiên, bản thân Kali Linux chỉ là môi trường vận hành chứ không tự động phát hiện hay phân tích lỗ hổng của mục tiêu. Độ chính xác và tính an toàn của quá trình đánh giá phụ thuộc hoàn toàn vào cách thiết lập từng công cụ cụ thể. Nhóm em cấu hình card mạng ảo của trạm kiểm thử ở chế độ nội bộ cô lập (Host-only Network hoặc Internal Network) nhằm ngăn chặn triệt để nguy cơ các gói tin thăm dò thoát ra hạ tầng mạng bên ngoài.</w:t>
-      </w:r>
-    </w:p>
-    <w:p>
-      <w:pPr/>
-      <w:r>
-        <w:rPr>
-          <w:rFonts w:ascii="Times New Roman" w:hAnsi="Times New Roman"/>
-          <w:color w:val="000000"/>
-        </w:rPr>
-        <w:t>Với vai trò điểm xuất phát trong chuỗi kiểm tra, Kali Linux là nơi khởi tạo mọi kết nối trinh sát và phân tích lưu lượng đến máy chủ Windows mục tiêu.</w:t>
-      </w:r>
-    </w:p>
-    <w:p>
-      <w:pPr>
-        <w:pStyle w:val="Heading3"/>
-      </w:pPr>
-      <w:r>
-        <w:rPr>
-          <w:rFonts w:ascii="Times New Roman" w:hAnsi="Times New Roman"/>
-          <w:color w:val="000000"/>
-        </w:rPr>
-        <w:t>1.3.2. Nmap</w:t>
-      </w:r>
-    </w:p>
-    <w:p>
-      <w:pPr/>
-      <w:r>
-        <w:rPr>
-          <w:rFonts w:ascii="Times New Roman" w:hAnsi="Times New Roman"/>
-          <w:color w:val="000000"/>
-        </w:rPr>
-        <w:t>Nhóm em sử dụng Nmap (Network Mapper) cho bước trinh sát mạng ban đầu nhằm xác định các máy chủ đang hoạt động và kiểm tra trạng thái của hai cổng dịch vụ TCP 139 và TCP 445.</w:t>
-      </w:r>
-    </w:p>
-    <w:p>
-      <w:pPr>
-        <w:keepNext/>
-      </w:pPr>
-      <w:r>
-        <w:rPr>
-          <w:rFonts w:ascii="Times New Roman" w:hAnsi="Times New Roman"/>
-          <w:color w:val="000000"/>
-        </w:rPr>
-        <w:t>Dữ liệu thu được từ Nmap phản ánh khả năng tiếp cận dịch vụ ở tầng giao vận:</w:t>
-      </w:r>
-    </w:p>
-    <w:p>
-      <w:pPr>
-        <w:spacing w:before="0" w:after="60"/>
-        <w:ind w:left="709" w:hanging="283"/>
-        <w:jc w:val="both"/>
-      </w:pPr>
-      <w:r>
-        <w:rPr>
-          <w:rFonts w:ascii="Times New Roman" w:hAnsi="Times New Roman"/>
-          <w:color w:val="000000"/>
-        </w:rPr>
-        <w:t xml:space="preserve">• </w:t>
-      </w:r>
-      <w:r>
-        <w:rPr>
-          <w:rFonts w:ascii="Times New Roman" w:hAnsi="Times New Roman"/>
-          <w:color w:val="000000"/>
-        </w:rPr>
-        <w:t>Open</w:t>
-      </w:r>
-      <w:r>
-        <w:rPr>
-          <w:rFonts w:ascii="Times New Roman" w:hAnsi="Times New Roman"/>
-          <w:color w:val="000000"/>
-        </w:rPr>
-        <w:t>: Cổng mạng đang có tiến trình lắng nghe và phản hồi gói tin TCP SYN-ACK trước yêu cầu SYN từ trạm kiểm thử.</w:t>
-      </w:r>
-    </w:p>
-    <w:p>
-      <w:pPr>
-        <w:spacing w:before="0" w:after="60"/>
-        <w:ind w:left="709" w:hanging="283"/>
-        <w:jc w:val="both"/>
-      </w:pPr>
-      <w:r>
-        <w:rPr>
-          <w:rFonts w:ascii="Times New Roman" w:hAnsi="Times New Roman"/>
-          <w:color w:val="000000"/>
-        </w:rPr>
-        <w:t xml:space="preserve">• </w:t>
-      </w:r>
-      <w:r>
-        <w:rPr>
-          <w:rFonts w:ascii="Times New Roman" w:hAnsi="Times New Roman"/>
-          <w:color w:val="000000"/>
-        </w:rPr>
-        <w:t>Closed</w:t>
-      </w:r>
-      <w:r>
-        <w:rPr>
-          <w:rFonts w:ascii="Times New Roman" w:hAnsi="Times New Roman"/>
-          <w:color w:val="000000"/>
-        </w:rPr>
-        <w:t>: Cổng mạng phản hồi gói tin RST, cho thấy không có dịch vụ nào đang tiếp nhận kết nối.</w:t>
-      </w:r>
-    </w:p>
-    <w:p>
-      <w:pPr>
-        <w:spacing w:before="0" w:after="60"/>
-        <w:ind w:left="709" w:hanging="283"/>
-        <w:jc w:val="both"/>
-      </w:pPr>
-      <w:r>
-        <w:rPr>
-          <w:rFonts w:ascii="Times New Roman" w:hAnsi="Times New Roman"/>
-          <w:color w:val="000000"/>
-        </w:rPr>
-        <w:t xml:space="preserve">• </w:t>
-      </w:r>
-      <w:r>
-        <w:rPr>
-          <w:rFonts w:ascii="Times New Roman" w:hAnsi="Times New Roman"/>
-          <w:color w:val="000000"/>
-        </w:rPr>
-        <w:t>Filtered</w:t>
-      </w:r>
-      <w:r>
-        <w:rPr>
-          <w:rFonts w:ascii="Times New Roman" w:hAnsi="Times New Roman"/>
-          <w:color w:val="000000"/>
-        </w:rPr>
-        <w:t>: Gói tin thăm dò bị hủy bỏ hoặc nhận thông báo ICMP Unreachable do tường lửa ngăn chặn.</w:t>
-      </w:r>
-    </w:p>
-    <w:p>
-      <w:pPr/>
-      <w:r>
-        <w:rPr>
-          <w:rFonts w:ascii="Times New Roman" w:hAnsi="Times New Roman"/>
-          <w:color w:val="000000"/>
-        </w:rPr>
-        <w:t xml:space="preserve">Bên cạnh đó, tùy chọn </w:t>
-      </w:r>
-      <w:r>
-        <w:rPr>
-          <w:rFonts w:ascii="Times New Roman" w:hAnsi="Times New Roman"/>
-          <w:color w:val="000000"/>
-        </w:rPr>
-        <w:t>-sV</w:t>
-      </w:r>
-      <w:r>
-        <w:rPr>
-          <w:rFonts w:ascii="Times New Roman" w:hAnsi="Times New Roman"/>
-          <w:color w:val="000000"/>
-        </w:rPr>
-        <w:t xml:space="preserve"> giúp định danh sơ bộ tên dịch vụ ứng dụng như </w:t>
-      </w:r>
-      <w:r>
-        <w:rPr>
-          <w:rFonts w:ascii="Times New Roman" w:hAnsi="Times New Roman"/>
-          <w:color w:val="000000"/>
-        </w:rPr>
-        <w:t>microsoft-ds</w:t>
-      </w:r>
-      <w:r>
-        <w:rPr>
-          <w:rFonts w:ascii="Times New Roman" w:hAnsi="Times New Roman"/>
-          <w:color w:val="000000"/>
-        </w:rPr>
-        <w:t xml:space="preserve"> hoặc </w:t>
-      </w:r>
-      <w:r>
-        <w:rPr>
-          <w:rFonts w:ascii="Times New Roman" w:hAnsi="Times New Roman"/>
-          <w:color w:val="000000"/>
-        </w:rPr>
-        <w:t>netbios-ssn</w:t>
-      </w:r>
-      <w:r>
-        <w:rPr>
-          <w:rFonts w:ascii="Times New Roman" w:hAnsi="Times New Roman"/>
-          <w:color w:val="000000"/>
-        </w:rPr>
-        <w:t>.</w:t>
-      </w:r>
-    </w:p>
-    <w:p>
-      <w:pPr/>
-      <w:r>
-        <w:rPr>
-          <w:rFonts w:ascii="Times New Roman" w:hAnsi="Times New Roman"/>
-          <w:color w:val="000000"/>
-        </w:rPr>
-        <w:t xml:space="preserve">Mặc dù vậy, kết quả từ Nmap chỉ dừng lại ở việc xác nhận cổng dịch vụ có mở hay không từ góc nhìn mạng. Trạng thái cổng 445 </w:t>
-      </w:r>
-      <w:r>
-        <w:rPr>
-          <w:rFonts w:ascii="Times New Roman" w:hAnsi="Times New Roman"/>
-          <w:color w:val="000000"/>
-        </w:rPr>
-        <w:t>Open</w:t>
-      </w:r>
-      <w:r>
-        <w:rPr>
-          <w:rFonts w:ascii="Times New Roman" w:hAnsi="Times New Roman"/>
-          <w:color w:val="000000"/>
-        </w:rPr>
-        <w:t xml:space="preserve"> không đồng nghĩa với việc máy chủ hỗ trợ SMBv1 hay tồn tại lỗ hổng MS17-010. Do đó, Nmap đảm nhiệm vai trò sàng lọc ở Mức 1, làm tiền đề để lựa chọn mục tiêu cho các bước phân tích sâu hơn.</w:t>
-      </w:r>
-    </w:p>
-    <w:p>
-      <w:pPr>
-        <w:pStyle w:val="Heading3"/>
-      </w:pPr>
-      <w:r>
-        <w:rPr>
-          <w:rFonts w:ascii="Times New Roman" w:hAnsi="Times New Roman"/>
-          <w:color w:val="000000"/>
-        </w:rPr>
-        <w:t>1.3.3. Nmap Scripting Engine</w:t>
-      </w:r>
-    </w:p>
-    <w:p>
-      <w:pPr>
-        <w:keepNext/>
-      </w:pPr>
-      <w:r>
-        <w:rPr>
-          <w:rFonts w:ascii="Times New Roman" w:hAnsi="Times New Roman"/>
-          <w:color w:val="000000"/>
-        </w:rPr>
-        <w:t>Nmap Scripting Engine (NSE) mở rộng khả năng tương tác của Nmap lên tầng ứng dụng thông qua các kịch bản viết bằng ngôn ngữ Lua. Trong đồ án, hai kịch bản chuyên biệt được nhóm em sử dụng gồm:</w:t>
-      </w:r>
-    </w:p>
-    <w:p>
-      <w:pPr>
-        <w:spacing w:before="0" w:after="60"/>
-        <w:ind w:left="709" w:hanging="283"/>
-        <w:jc w:val="both"/>
-      </w:pPr>
-      <w:r>
-        <w:rPr>
-          <w:rFonts w:ascii="Times New Roman" w:hAnsi="Times New Roman"/>
-          <w:color w:val="000000"/>
-        </w:rPr>
-        <w:t xml:space="preserve">• </w:t>
-      </w:r>
-      <w:r>
-        <w:rPr>
-          <w:rFonts w:ascii="Times New Roman" w:hAnsi="Times New Roman"/>
-          <w:b/>
-          <w:color w:val="000000"/>
-        </w:rPr>
-        <w:t>Kịch bản `smb-protocols.nse`:</w:t>
-      </w:r>
-      <w:r>
-        <w:rPr>
-          <w:rFonts w:ascii="Times New Roman" w:hAnsi="Times New Roman"/>
-          <w:color w:val="000000"/>
-        </w:rPr>
-        <w:t xml:space="preserve"> Gửi gói tin </w:t>
-      </w:r>
-      <w:r>
-        <w:rPr>
-          <w:rFonts w:ascii="Times New Roman" w:hAnsi="Times New Roman"/>
-          <w:color w:val="000000"/>
-        </w:rPr>
-        <w:t>Negotiate Protocol Request</w:t>
-      </w:r>
-      <w:r>
-        <w:rPr>
-          <w:rFonts w:ascii="Times New Roman" w:hAnsi="Times New Roman"/>
-          <w:color w:val="000000"/>
-        </w:rPr>
-        <w:t xml:space="preserve"> mang danh sách các dialect SMB để phân tích gói tin phản hồi từ máy chủ, qua đó nhận diện việc hệ thống có chấp thuận giao thức SMBv1 (</w:t>
-      </w:r>
-      <w:r>
-        <w:rPr>
-          <w:rFonts w:ascii="Times New Roman" w:hAnsi="Times New Roman"/>
-          <w:color w:val="000000"/>
-        </w:rPr>
-        <w:t>NT LM 0.12</w:t>
-      </w:r>
-      <w:r>
-        <w:rPr>
-          <w:rFonts w:ascii="Times New Roman" w:hAnsi="Times New Roman"/>
-          <w:color w:val="000000"/>
-        </w:rPr>
-        <w:t>) hay không.</w:t>
-      </w:r>
-    </w:p>
-    <w:p>
-      <w:pPr>
-        <w:spacing w:before="0" w:after="60"/>
-        <w:ind w:left="709" w:hanging="283"/>
-        <w:jc w:val="both"/>
-      </w:pPr>
-      <w:r>
-        <w:rPr>
-          <w:rFonts w:ascii="Times New Roman" w:hAnsi="Times New Roman"/>
-          <w:color w:val="000000"/>
-        </w:rPr>
-        <w:t xml:space="preserve">• </w:t>
-      </w:r>
-      <w:r>
-        <w:rPr>
-          <w:rFonts w:ascii="Times New Roman" w:hAnsi="Times New Roman"/>
-          <w:b/>
-          <w:color w:val="000000"/>
-        </w:rPr>
-        <w:t>Kịch bản `smb-vuln-ms17-010.nse`:</w:t>
-      </w:r>
-      <w:r>
-        <w:rPr>
-          <w:rFonts w:ascii="Times New Roman" w:hAnsi="Times New Roman"/>
-          <w:color w:val="000000"/>
-        </w:rPr>
-        <w:t xml:space="preserve"> Thăm dò an toàn dấu hiệu của bản tin MS17-010 bằng cách kết nối vào tài nguyên chia sẻ quản trị </w:t>
-      </w:r>
-      <w:r>
-        <w:rPr>
-          <w:rFonts w:ascii="Times New Roman" w:hAnsi="Times New Roman"/>
-          <w:color w:val="000000"/>
-        </w:rPr>
-        <w:t>IPC$</w:t>
-      </w:r>
-      <w:r>
-        <w:rPr>
-          <w:rFonts w:ascii="Times New Roman" w:hAnsi="Times New Roman"/>
-          <w:color w:val="000000"/>
-        </w:rPr>
-        <w:t xml:space="preserve"> và gửi yêu cầu kiểm tra qua Named Pipe (sử dụng lệnh </w:t>
-      </w:r>
-      <w:r>
-        <w:rPr>
-          <w:rFonts w:ascii="Times New Roman" w:hAnsi="Times New Roman"/>
-          <w:color w:val="000000"/>
-        </w:rPr>
-        <w:t>SMB_COM_TRANSACTION2</w:t>
-      </w:r>
-      <w:r>
-        <w:rPr>
-          <w:rFonts w:ascii="Times New Roman" w:hAnsi="Times New Roman"/>
-          <w:color w:val="000000"/>
-        </w:rPr>
-        <w:t xml:space="preserve"> với hàm </w:t>
-      </w:r>
-      <w:r>
-        <w:rPr>
-          <w:rFonts w:ascii="Times New Roman" w:hAnsi="Times New Roman"/>
-          <w:color w:val="000000"/>
-        </w:rPr>
-        <w:t>PeekNamedPipe</w:t>
-      </w:r>
-      <w:r>
-        <w:rPr>
-          <w:rFonts w:ascii="Times New Roman" w:hAnsi="Times New Roman"/>
-          <w:color w:val="000000"/>
-        </w:rPr>
-        <w:t>).</w:t>
-      </w:r>
-    </w:p>
-    <w:p>
-      <w:pPr>
-        <w:keepNext/>
-      </w:pPr>
-      <w:r>
-        <w:rPr>
-          <w:rFonts w:ascii="Times New Roman" w:hAnsi="Times New Roman"/>
-          <w:color w:val="000000"/>
-        </w:rPr>
-        <w:t>Kịch bản đưa ra đánh giá dựa trên mã trạng thái NT Status trả về từ nhân hệ điều hành:</w:t>
-      </w:r>
-    </w:p>
-    <w:p>
-      <w:pPr>
-        <w:spacing w:before="0" w:after="60"/>
-        <w:ind w:left="709" w:hanging="283"/>
-        <w:jc w:val="both"/>
-      </w:pPr>
-      <w:r>
-        <w:rPr>
-          <w:rFonts w:ascii="Times New Roman" w:hAnsi="Times New Roman"/>
-          <w:color w:val="000000"/>
-        </w:rPr>
-        <w:t xml:space="preserve">• </w:t>
-      </w:r>
-      <w:r>
-        <w:rPr>
-          <w:rFonts w:ascii="Times New Roman" w:hAnsi="Times New Roman"/>
-          <w:color w:val="000000"/>
-        </w:rPr>
-        <w:t xml:space="preserve">Nếu nhận mã lỗi bộ nhớ </w:t>
-      </w:r>
-      <w:r>
-        <w:rPr>
-          <w:rFonts w:ascii="Times New Roman" w:hAnsi="Times New Roman"/>
-          <w:color w:val="000000"/>
-        </w:rPr>
-        <w:t>STATUS_INSUFF_SERVER_RESOURCES</w:t>
-      </w:r>
-      <w:r>
-        <w:rPr>
-          <w:rFonts w:ascii="Times New Roman" w:hAnsi="Times New Roman"/>
-          <w:color w:val="000000"/>
-        </w:rPr>
-        <w:t xml:space="preserve"> (</w:t>
-      </w:r>
-      <w:r>
-        <w:rPr>
-          <w:rFonts w:ascii="Times New Roman" w:hAnsi="Times New Roman"/>
-          <w:color w:val="000000"/>
-        </w:rPr>
-        <w:t>0xC0000205</w:t>
-      </w:r>
-      <w:r>
-        <w:rPr>
-          <w:rFonts w:ascii="Times New Roman" w:hAnsi="Times New Roman"/>
-          <w:color w:val="000000"/>
-        </w:rPr>
-        <w:t xml:space="preserve">), hệ thống bộc lộ dấu hiệu chưa được cài đặt bản vá MS17-010 và kịch bản xuất kết luận </w:t>
-      </w:r>
-      <w:r>
-        <w:rPr>
-          <w:rFonts w:ascii="Times New Roman" w:hAnsi="Times New Roman"/>
-          <w:color w:val="000000"/>
-        </w:rPr>
-        <w:t>State: VULNERABLE</w:t>
-      </w:r>
-      <w:r>
-        <w:rPr>
-          <w:rFonts w:ascii="Times New Roman" w:hAnsi="Times New Roman"/>
-          <w:color w:val="000000"/>
-        </w:rPr>
-        <w:t>.</w:t>
-      </w:r>
-    </w:p>
-    <w:p>
-      <w:pPr>
-        <w:spacing w:before="0" w:after="60"/>
-        <w:ind w:left="709" w:hanging="283"/>
-        <w:jc w:val="both"/>
-      </w:pPr>
-      <w:r>
-        <w:rPr>
-          <w:rFonts w:ascii="Times New Roman" w:hAnsi="Times New Roman"/>
-          <w:color w:val="000000"/>
-        </w:rPr>
-        <w:t xml:space="preserve">• </w:t>
-      </w:r>
-      <w:r>
-        <w:rPr>
-          <w:rFonts w:ascii="Times New Roman" w:hAnsi="Times New Roman"/>
-          <w:color w:val="000000"/>
-        </w:rPr>
-        <w:t xml:space="preserve">Nếu nhận mã lỗi truy cập </w:t>
-      </w:r>
-      <w:r>
-        <w:rPr>
-          <w:rFonts w:ascii="Times New Roman" w:hAnsi="Times New Roman"/>
-          <w:color w:val="000000"/>
-        </w:rPr>
-        <w:t>STATUS_ACCESS_DENIED</w:t>
-      </w:r>
-      <w:r>
-        <w:rPr>
-          <w:rFonts w:ascii="Times New Roman" w:hAnsi="Times New Roman"/>
-          <w:color w:val="000000"/>
-        </w:rPr>
-        <w:t xml:space="preserve"> (</w:t>
-      </w:r>
-      <w:r>
-        <w:rPr>
-          <w:rFonts w:ascii="Times New Roman" w:hAnsi="Times New Roman"/>
-          <w:color w:val="000000"/>
-        </w:rPr>
-        <w:t>0xC0000022</w:t>
-      </w:r>
-      <w:r>
-        <w:rPr>
-          <w:rFonts w:ascii="Times New Roman" w:hAnsi="Times New Roman"/>
-          <w:color w:val="000000"/>
-        </w:rPr>
-        <w:t>) hoặc yêu cầu bị từ chối, hệ thống có dấu hiệu đã được cập nhật an toàn.</w:t>
-      </w:r>
-    </w:p>
-    <w:p>
-      <w:pPr/>
-      <w:r>
-        <w:rPr>
-          <w:rFonts w:ascii="Times New Roman" w:hAnsi="Times New Roman"/>
-          <w:color w:val="000000"/>
-        </w:rPr>
-        <w:t xml:space="preserve">Điểm cần lưu ý là kịch bản NSE chỉ phân tích mã lỗi logic từ một gói tin thăm dò chứ không tiến hành khai thác bộ nhớ. Kết quả này có thể phát sinh âm tính giả nếu máy chủ chặn kết nối nặc danh vào </w:t>
-      </w:r>
-      <w:r>
-        <w:rPr>
-          <w:rFonts w:ascii="Times New Roman" w:hAnsi="Times New Roman"/>
-          <w:color w:val="000000"/>
-        </w:rPr>
-        <w:t>IPC$</w:t>
-      </w:r>
-      <w:r>
-        <w:rPr>
-          <w:rFonts w:ascii="Times New Roman" w:hAnsi="Times New Roman"/>
-          <w:color w:val="000000"/>
-        </w:rPr>
-        <w:t>. Vì vậy, NSE đóng vai trò cầu nối ở Mức 2 và Mức 3, cung cấp các chỉ báo kỹ thuật quan trọng trước khi quyết định thực hiện các bước xác minh sâu hơn.</w:t>
-      </w:r>
-    </w:p>
-    <w:p>
-      <w:pPr>
-        <w:pStyle w:val="Heading3"/>
-      </w:pPr>
-      <w:r>
-        <w:rPr>
-          <w:rFonts w:ascii="Times New Roman" w:hAnsi="Times New Roman"/>
-          <w:color w:val="000000"/>
-        </w:rPr>
-        <w:t>1.3.4. Metasploit Framework</w:t>
-      </w:r>
-    </w:p>
-    <w:p>
-      <w:pPr>
-        <w:keepNext/>
-      </w:pPr>
-      <w:r>
-        <w:rPr>
-          <w:rFonts w:ascii="Times New Roman" w:hAnsi="Times New Roman"/>
-          <w:color w:val="000000"/>
-        </w:rPr>
-        <w:t>Metasploit Framework được nhóm em sử dụng trong phạm vi lab cô lập nhằm thực hiện các tác vụ quét đối chiếu và khai thác kiểm chứng. Khung công cụ này được áp dụng theo hai hướng:</w:t>
-      </w:r>
-    </w:p>
-    <w:p>
-      <w:pPr>
-        <w:spacing w:before="0" w:after="60"/>
-        <w:ind w:left="709" w:hanging="283"/>
-        <w:jc w:val="both"/>
-      </w:pPr>
-      <w:r>
-        <w:rPr>
-          <w:rFonts w:ascii="Times New Roman" w:hAnsi="Times New Roman"/>
-          <w:color w:val="000000"/>
-        </w:rPr>
-        <w:t xml:space="preserve">• </w:t>
-      </w:r>
-      <w:r>
-        <w:rPr>
-          <w:rFonts w:ascii="Times New Roman" w:hAnsi="Times New Roman"/>
-          <w:b/>
-          <w:color w:val="000000"/>
-        </w:rPr>
-        <w:t>Mô-đun phụ trợ (Auxiliary Module):</w:t>
-      </w:r>
-      <w:r>
-        <w:rPr>
-          <w:rFonts w:ascii="Times New Roman" w:hAnsi="Times New Roman"/>
-          <w:color w:val="000000"/>
-        </w:rPr>
-        <w:t xml:space="preserve"> Sử dụng </w:t>
-      </w:r>
-      <w:r>
-        <w:rPr>
-          <w:rFonts w:ascii="Times New Roman" w:hAnsi="Times New Roman"/>
-          <w:color w:val="000000"/>
-        </w:rPr>
-        <w:t>auxiliary/scanner/smb/smb_ms17_010</w:t>
-      </w:r>
-      <w:r>
-        <w:rPr>
-          <w:rFonts w:ascii="Times New Roman" w:hAnsi="Times New Roman"/>
-          <w:color w:val="000000"/>
-        </w:rPr>
-        <w:t xml:space="preserve"> để rà quét độc lập, tạo nguồn dữ liệu đối chiếu chéo với kịch bản NSE nhằm nâng cao độ tin cậy của chỉ báo lỗ hổng.</w:t>
-      </w:r>
-    </w:p>
-    <w:p>
-      <w:pPr>
-        <w:spacing w:before="0" w:after="60"/>
-        <w:ind w:left="709" w:hanging="283"/>
-        <w:jc w:val="both"/>
-      </w:pPr>
-      <w:r>
-        <w:rPr>
-          <w:rFonts w:ascii="Times New Roman" w:hAnsi="Times New Roman"/>
-          <w:color w:val="000000"/>
-        </w:rPr>
-        <w:t xml:space="preserve">• </w:t>
-      </w:r>
-      <w:r>
-        <w:rPr>
-          <w:rFonts w:ascii="Times New Roman" w:hAnsi="Times New Roman"/>
-          <w:b/>
-          <w:color w:val="000000"/>
-        </w:rPr>
-        <w:t>Mô-đun khai thác có kiểm soát (Exploit Module):</w:t>
-      </w:r>
-      <w:r>
-        <w:rPr>
-          <w:rFonts w:ascii="Times New Roman" w:hAnsi="Times New Roman"/>
-          <w:color w:val="000000"/>
-        </w:rPr>
-        <w:t xml:space="preserve"> Sử dụng </w:t>
-      </w:r>
-      <w:r>
-        <w:rPr>
-          <w:rFonts w:ascii="Times New Roman" w:hAnsi="Times New Roman"/>
-          <w:color w:val="000000"/>
-        </w:rPr>
-        <w:t>exploit/windows/smb/ms17_010_eternalblue</w:t>
-      </w:r>
-      <w:r>
-        <w:rPr>
-          <w:rFonts w:ascii="Times New Roman" w:hAnsi="Times New Roman"/>
-          <w:color w:val="000000"/>
-        </w:rPr>
-        <w:t xml:space="preserve"> để xác minh trực tiếp khả năng thực thi mã lệnh của CVE-2017-0144 trên máy ảo mục tiêu.</w:t>
-      </w:r>
-    </w:p>
-    <w:p>
-      <w:pPr/>
-      <w:r>
-        <w:rPr>
-          <w:rFonts w:ascii="Times New Roman" w:hAnsi="Times New Roman"/>
-          <w:color w:val="000000"/>
-        </w:rPr>
-        <w:t xml:space="preserve">Khác với các công cụ quét thụ động, Metasploit cung cấp bằng chứng trực tiếp về mức độ ảnh hưởng. Việc mở thành công phiên tương tác với đặc quyền </w:t>
-      </w:r>
-      <w:r>
-        <w:rPr>
-          <w:rFonts w:ascii="Times New Roman" w:hAnsi="Times New Roman"/>
-          <w:color w:val="000000"/>
-        </w:rPr>
-        <w:t>NT AUTHORITY\SYSTEM</w:t>
-      </w:r>
-      <w:r>
-        <w:rPr>
-          <w:rFonts w:ascii="Times New Roman" w:hAnsi="Times New Roman"/>
-          <w:color w:val="000000"/>
-        </w:rPr>
-        <w:t xml:space="preserve"> khẳng định lỗ hổng có thể bị lợi dụng để chiếm quyền kiểm soát máy chủ hoàn toàn. Ngược lại, nếu quá trình can thiệp thất bại, công cụ cũng ghi nhận các phản ứng bất thường của hệ thống.</w:t>
-      </w:r>
-    </w:p>
-    <w:p>
-      <w:pPr/>
-      <w:r>
-        <w:rPr>
-          <w:rFonts w:ascii="Times New Roman" w:hAnsi="Times New Roman"/>
-          <w:color w:val="000000"/>
-        </w:rPr>
-        <w:t>Do việc can thiệp vào bộ nhớ Non-Paged Pool tiềm ẩn rủi ro gây sập hệ điều hành (BSOD), mô-đun khai thác chỉ được nhóm em vận hành trên các máy ảo đã lưu ảnh chụp trạng thái (snapshot) và tuân thủ nghiêm ngặt nguyên tắc an toàn lab. Trong chuỗi đánh giá, Metasploit giữ vai trò công cụ thẩm định ở Mức 4.</w:t>
-      </w:r>
-    </w:p>
-    <w:p>
-      <w:pPr>
-        <w:pStyle w:val="Heading3"/>
-      </w:pPr>
-      <w:r>
-        <w:rPr>
-          <w:rFonts w:ascii="Times New Roman" w:hAnsi="Times New Roman"/>
-          <w:color w:val="000000"/>
-        </w:rPr>
-        <w:t>1.3.5. Vai trò của các công cụ trong quy trình kiểm thử</w:t>
-      </w:r>
-    </w:p>
-    <w:p>
-      <w:pPr>
-        <w:keepNext/>
-      </w:pPr>
-      <w:r>
-        <w:rPr>
-          <w:rFonts w:ascii="Times New Roman" w:hAnsi="Times New Roman"/>
-          <w:color w:val="000000"/>
-        </w:rPr>
-        <w:t>Các công cụ nêu trên không hoạt động rời rạc mà được nhóm em phối hợp thành một chuỗi quy trình 4 giai đoạn nối tiếp nhau một cách chặt chẽ:</w:t>
-      </w:r>
-    </w:p>
-    <w:p>
-      <w:pPr>
-        <w:spacing w:before="0" w:after="60"/>
-        <w:ind w:left="709" w:hanging="283"/>
-        <w:jc w:val="both"/>
-      </w:pPr>
-      <w:r>
-        <w:rPr>
-          <w:rFonts w:ascii="Times New Roman" w:hAnsi="Times New Roman"/>
-          <w:color w:val="000000"/>
-        </w:rPr>
-        <w:t xml:space="preserve">• </w:t>
-      </w:r>
-      <w:r>
-        <w:rPr>
-          <w:rFonts w:ascii="Times New Roman" w:hAnsi="Times New Roman"/>
-          <w:b/>
-          <w:color w:val="000000"/>
-        </w:rPr>
-        <w:t>Giai đoạn 1 - Khởi tạo và thiết lập:</w:t>
-      </w:r>
-      <w:r>
-        <w:rPr>
-          <w:rFonts w:ascii="Times New Roman" w:hAnsi="Times New Roman"/>
-          <w:color w:val="000000"/>
-        </w:rPr>
-        <w:t xml:space="preserve"> Hệ điều hành Kali Linux cung cấp môi trường thực nghiệm an toàn, cô lập với mạng ngoài, định tuyến kết nối tới dải mạng máy ảo mục tiêu.</w:t>
-      </w:r>
-    </w:p>
-    <w:p>
-      <w:pPr>
-        <w:spacing w:before="0" w:after="60"/>
-        <w:ind w:left="709" w:hanging="283"/>
-        <w:jc w:val="both"/>
-      </w:pPr>
-      <w:r>
-        <w:rPr>
-          <w:rFonts w:ascii="Times New Roman" w:hAnsi="Times New Roman"/>
-          <w:color w:val="000000"/>
-        </w:rPr>
-        <w:t xml:space="preserve">• </w:t>
-      </w:r>
-      <w:r>
-        <w:rPr>
-          <w:rFonts w:ascii="Times New Roman" w:hAnsi="Times New Roman"/>
-          <w:b/>
-          <w:color w:val="000000"/>
-        </w:rPr>
-        <w:t>Giai đoạn 2 - Quét mạng và xác định cổng:</w:t>
-      </w:r>
-      <w:r>
-        <w:rPr>
-          <w:rFonts w:ascii="Times New Roman" w:hAnsi="Times New Roman"/>
-          <w:color w:val="000000"/>
-        </w:rPr>
-        <w:t xml:space="preserve"> Nmap thực hiện quét cổng TCP 139 và 445 để xác định máy chủ mục tiêu có mở dịch vụ SMB hay không. Nếu cổng đóng hoặc bị lọc, quy trình dừng lại để ghi nhận trạng thái mạng.</w:t>
-      </w:r>
-    </w:p>
-    <w:p>
-      <w:pPr>
-        <w:spacing w:before="0" w:after="60"/>
-        <w:ind w:left="709" w:hanging="283"/>
-        <w:jc w:val="both"/>
-      </w:pPr>
-      <w:r>
-        <w:rPr>
-          <w:rFonts w:ascii="Times New Roman" w:hAnsi="Times New Roman"/>
-          <w:color w:val="000000"/>
-        </w:rPr>
-        <w:t xml:space="preserve">• </w:t>
-      </w:r>
-      <w:r>
-        <w:rPr>
-          <w:rFonts w:ascii="Times New Roman" w:hAnsi="Times New Roman"/>
-          <w:b/>
-          <w:color w:val="000000"/>
-        </w:rPr>
-        <w:t>Giai đoạn 3 - Nhận diện dialect và thăm dò dấu hiệu:</w:t>
-      </w:r>
-      <w:r>
-        <w:rPr>
-          <w:rFonts w:ascii="Times New Roman" w:hAnsi="Times New Roman"/>
-          <w:color w:val="000000"/>
-        </w:rPr>
-        <w:t xml:space="preserve"> Nmap NSE (kịch bản </w:t>
-      </w:r>
-      <w:r>
-        <w:rPr>
-          <w:rFonts w:ascii="Times New Roman" w:hAnsi="Times New Roman"/>
-          <w:color w:val="000000"/>
-        </w:rPr>
-        <w:t>smb-protocols</w:t>
-      </w:r>
-      <w:r>
-        <w:rPr>
-          <w:rFonts w:ascii="Times New Roman" w:hAnsi="Times New Roman"/>
-          <w:color w:val="000000"/>
-        </w:rPr>
-        <w:t xml:space="preserve"> và </w:t>
-      </w:r>
-      <w:r>
-        <w:rPr>
-          <w:rFonts w:ascii="Times New Roman" w:hAnsi="Times New Roman"/>
-          <w:color w:val="000000"/>
-        </w:rPr>
-        <w:t>smb-vuln-ms17-010</w:t>
-      </w:r>
-      <w:r>
-        <w:rPr>
-          <w:rFonts w:ascii="Times New Roman" w:hAnsi="Times New Roman"/>
-          <w:color w:val="000000"/>
-        </w:rPr>
-        <w:t>) cùng Metasploit Auxiliary kiểm tra xem máy chủ có hỗ trợ SMBv1 và có phản hồi mã lỗi đặc trưng của bản tin MS17-010 hay không.</w:t>
-      </w:r>
-    </w:p>
-    <w:p>
-      <w:pPr>
-        <w:spacing w:before="0" w:after="60"/>
-        <w:ind w:left="709" w:hanging="283"/>
-        <w:jc w:val="both"/>
-      </w:pPr>
-      <w:r>
-        <w:rPr>
-          <w:rFonts w:ascii="Times New Roman" w:hAnsi="Times New Roman"/>
-          <w:color w:val="000000"/>
-        </w:rPr>
-        <w:t xml:space="preserve">• </w:t>
-      </w:r>
-      <w:r>
-        <w:rPr>
-          <w:rFonts w:ascii="Times New Roman" w:hAnsi="Times New Roman"/>
-          <w:b/>
-          <w:color w:val="000000"/>
-        </w:rPr>
-        <w:t>Giai đoạn 4 - Thẩm định có kiểm soát:</w:t>
-      </w:r>
-      <w:r>
-        <w:rPr>
-          <w:rFonts w:ascii="Times New Roman" w:hAnsi="Times New Roman"/>
-          <w:color w:val="000000"/>
-        </w:rPr>
-        <w:t xml:space="preserve"> Khi các dấu hiệu kỹ thuật ở Giai đoạn 3 trùng khớp, Metasploit Exploit được kích hoạt trên môi trường lab đã lưu snapshot để xác minh khả năng thực thi mã thực tế.</w:t>
-      </w:r>
-    </w:p>
-    <w:p>
-      <w:pPr/>
-      <w:r>
-        <w:rPr>
-          <w:rFonts w:ascii="Times New Roman" w:hAnsi="Times New Roman"/>
-          <w:color w:val="000000"/>
-        </w:rPr>
-        <w:t>Cách tiếp cận đa tầng này giúp quy trình kiểm thử của nhóm em tránh được sai lầm phổ biến là vội vàng kích hoạt mã khai thác khi chưa hiểu rõ trạng thái dịch vụ. Đồng thời, phương pháp này bảo đảm mỗi kết luận an ninh đều có căn cứ kỹ thuật rõ ràng tương ứng với từng lớp công cụ.</w:t>
-      </w:r>
-    </w:p>
-    <w:p>
-      <w:pPr>
-        <w:pStyle w:val="Heading2"/>
-      </w:pPr>
-      <w:r>
-        <w:rPr>
-          <w:rFonts w:ascii="Times New Roman" w:hAnsi="Times New Roman"/>
-          <w:color w:val="000000"/>
-        </w:rPr>
-        <w:t>1.4. Tiêu chí xác minh trạng thái SMB và MS17-010</w:t>
-      </w:r>
-    </w:p>
-    <w:p>
-      <w:pPr>
-        <w:pStyle w:val="Heading3"/>
-      </w:pPr>
-      <w:r>
-        <w:rPr>
-          <w:rFonts w:ascii="Times New Roman" w:hAnsi="Times New Roman"/>
-          <w:color w:val="000000"/>
-        </w:rPr>
-        <w:t>1.4.1. Phát hiện dịch vụ SMB</w:t>
-      </w:r>
-    </w:p>
-    <w:p>
-      <w:pPr/>
-      <w:r>
-        <w:rPr>
-          <w:rFonts w:ascii="Times New Roman" w:hAnsi="Times New Roman"/>
-          <w:color w:val="000000"/>
-        </w:rPr>
-        <w:t>Tiêu chí Mức 1 tập trung xác định sự hiện diện của dịch vụ SMB trên đường truyền mạng giữa trạm kiểm thử và máy chủ mục tiêu.</w:t>
-      </w:r>
-    </w:p>
-    <w:p>
-      <w:pPr>
-        <w:spacing w:before="0" w:after="60"/>
-        <w:ind w:left="709" w:hanging="283"/>
-        <w:jc w:val="both"/>
-      </w:pPr>
-      <w:r>
-        <w:rPr>
-          <w:rFonts w:ascii="Times New Roman" w:hAnsi="Times New Roman"/>
-          <w:color w:val="000000"/>
-        </w:rPr>
-        <w:t xml:space="preserve">• </w:t>
-      </w:r>
-      <w:r>
-        <w:rPr>
-          <w:rFonts w:ascii="Times New Roman" w:hAnsi="Times New Roman"/>
-          <w:b/>
-          <w:color w:val="000000"/>
-        </w:rPr>
-        <w:t>Dấu hiệu kỹ thuật:</w:t>
-      </w:r>
-      <w:r>
-        <w:rPr>
-          <w:rFonts w:ascii="Times New Roman" w:hAnsi="Times New Roman"/>
-          <w:color w:val="000000"/>
-        </w:rPr>
-        <w:t xml:space="preserve"> Trạm kiểm thử gửi các gói tin TCP SYN tới cổng TCP 445 (Direct-hosted SMB) hoặc TCP 139 (NetBIOS Session Service). Trạng thái cổng được xác nhận là </w:t>
-      </w:r>
-      <w:r>
-        <w:rPr>
-          <w:rFonts w:ascii="Times New Roman" w:hAnsi="Times New Roman"/>
-          <w:color w:val="000000"/>
-        </w:rPr>
-        <w:t>Open</w:t>
-      </w:r>
-      <w:r>
-        <w:rPr>
-          <w:rFonts w:ascii="Times New Roman" w:hAnsi="Times New Roman"/>
-          <w:color w:val="000000"/>
-        </w:rPr>
-        <w:t xml:space="preserve"> khi máy chủ phản hồi gói tin TCP SYN-ACK.</w:t>
-      </w:r>
-    </w:p>
-    <w:p>
-      <w:pPr>
-        <w:spacing w:before="0" w:after="60"/>
-        <w:ind w:left="709" w:hanging="283"/>
-        <w:jc w:val="both"/>
-      </w:pPr>
-      <w:r>
-        <w:rPr>
-          <w:rFonts w:ascii="Times New Roman" w:hAnsi="Times New Roman"/>
-          <w:color w:val="000000"/>
-        </w:rPr>
-        <w:t xml:space="preserve">• </w:t>
-      </w:r>
-      <w:r>
-        <w:rPr>
-          <w:rFonts w:ascii="Times New Roman" w:hAnsi="Times New Roman"/>
-          <w:b/>
-          <w:color w:val="000000"/>
-        </w:rPr>
-        <w:t>Ý nghĩa an ninh:</w:t>
-      </w:r>
-      <w:r>
-        <w:rPr>
-          <w:rFonts w:ascii="Times New Roman" w:hAnsi="Times New Roman"/>
-          <w:color w:val="000000"/>
-        </w:rPr>
-        <w:t xml:space="preserve"> Kết quả này chứng minh máy chủ đang vận hành một dịch vụ lắng nghe trên cổng SMB và trạm kiểm thử có thể tiếp cận được dịch vụ đó qua mạng.</w:t>
-      </w:r>
-    </w:p>
-    <w:p>
-      <w:pPr>
-        <w:spacing w:before="0" w:after="60"/>
-        <w:ind w:left="709" w:hanging="283"/>
-        <w:jc w:val="both"/>
-      </w:pPr>
-      <w:r>
-        <w:rPr>
-          <w:rFonts w:ascii="Times New Roman" w:hAnsi="Times New Roman"/>
-          <w:color w:val="000000"/>
-        </w:rPr>
-        <w:t xml:space="preserve">• </w:t>
-      </w:r>
-      <w:r>
-        <w:rPr>
-          <w:rFonts w:ascii="Times New Roman" w:hAnsi="Times New Roman"/>
-          <w:b/>
-          <w:color w:val="000000"/>
-        </w:rPr>
-        <w:t>Ranh giới đánh giá:</w:t>
-      </w:r>
-      <w:r>
-        <w:rPr>
-          <w:rFonts w:ascii="Times New Roman" w:hAnsi="Times New Roman"/>
-          <w:color w:val="000000"/>
-        </w:rPr>
-        <w:t xml:space="preserve"> Việc mở cổng 445 hoặc 139 </w:t>
-      </w:r>
-      <w:r>
-        <w:rPr>
-          <w:rFonts w:ascii="Times New Roman" w:hAnsi="Times New Roman"/>
-          <w:b/>
-          <w:color w:val="000000"/>
-        </w:rPr>
-        <w:t>hoàn toàn không đồng nghĩa với việc hệ thống có lỗ hổng</w:t>
-      </w:r>
-      <w:r>
-        <w:rPr>
-          <w:rFonts w:ascii="Times New Roman" w:hAnsi="Times New Roman"/>
-          <w:color w:val="000000"/>
-        </w:rPr>
-        <w:t>. Bất kỳ máy chủ Windows nào có chia sẻ dữ liệu hoặc tham gia quản trị nội bộ đều mở các cổng này. Đây là điều kiện cần về khả năng tiếp cận mạng trước khi tiến hành các bước kiểm tra tiếp theo.</w:t>
-      </w:r>
-    </w:p>
-    <w:p>
-      <w:pPr>
-        <w:pStyle w:val="Heading3"/>
-      </w:pPr>
-      <w:r>
-        <w:rPr>
-          <w:rFonts w:ascii="Times New Roman" w:hAnsi="Times New Roman"/>
-          <w:color w:val="000000"/>
-        </w:rPr>
-        <w:t>1.4.2. Nhận diện SMBv1</w:t>
-      </w:r>
-    </w:p>
-    <w:p>
-      <w:pPr/>
-      <w:r>
-        <w:rPr>
-          <w:rFonts w:ascii="Times New Roman" w:hAnsi="Times New Roman"/>
-          <w:color w:val="000000"/>
-        </w:rPr>
-        <w:t>Sau khi xác định cổng dịch vụ mở, Mức 2 kiểm tra xem dịch vụ SMB của máy chủ có chấp thuận giao tiếp bằng giao thức cũ SMBv1 hay không.</w:t>
-      </w:r>
-    </w:p>
-    <w:p>
-      <w:pPr>
-        <w:spacing w:before="0" w:after="60"/>
-        <w:ind w:left="709" w:hanging="283"/>
-        <w:jc w:val="both"/>
-      </w:pPr>
-      <w:r>
-        <w:rPr>
-          <w:rFonts w:ascii="Times New Roman" w:hAnsi="Times New Roman"/>
-          <w:color w:val="000000"/>
-        </w:rPr>
-        <w:t xml:space="preserve">• </w:t>
-      </w:r>
-      <w:r>
-        <w:rPr>
-          <w:rFonts w:ascii="Times New Roman" w:hAnsi="Times New Roman"/>
-          <w:b/>
-          <w:color w:val="000000"/>
-        </w:rPr>
-        <w:t>Tiêu chí giao thức:</w:t>
-      </w:r>
-      <w:r>
-        <w:rPr>
-          <w:rFonts w:ascii="Times New Roman" w:hAnsi="Times New Roman"/>
-          <w:color w:val="000000"/>
-        </w:rPr>
-        <w:t xml:space="preserve"> Trạm kiểm thử gửi gói tin </w:t>
-      </w:r>
-      <w:r>
-        <w:rPr>
-          <w:rFonts w:ascii="Times New Roman" w:hAnsi="Times New Roman"/>
-          <w:color w:val="000000"/>
-        </w:rPr>
-        <w:t>Negotiate Protocol Request</w:t>
-      </w:r>
-      <w:r>
-        <w:rPr>
-          <w:rFonts w:ascii="Times New Roman" w:hAnsi="Times New Roman"/>
-          <w:color w:val="000000"/>
-        </w:rPr>
-        <w:t xml:space="preserve"> chứa danh sách các dialect SMB, bao gồm chuỗi định danh </w:t>
-      </w:r>
-      <w:r>
-        <w:rPr>
-          <w:rFonts w:ascii="Times New Roman" w:hAnsi="Times New Roman"/>
-          <w:color w:val="000000"/>
-        </w:rPr>
-        <w:t>NT LM 0.12</w:t>
-      </w:r>
-      <w:r>
-        <w:rPr>
-          <w:rFonts w:ascii="Times New Roman" w:hAnsi="Times New Roman"/>
-          <w:color w:val="000000"/>
-        </w:rPr>
-        <w:t xml:space="preserve">. Nếu máy chủ phản hồi bằng gói tin </w:t>
-      </w:r>
-      <w:r>
-        <w:rPr>
-          <w:rFonts w:ascii="Times New Roman" w:hAnsi="Times New Roman"/>
-          <w:color w:val="000000"/>
-        </w:rPr>
-        <w:t>Negotiate Protocol Response</w:t>
-      </w:r>
-      <w:r>
-        <w:rPr>
-          <w:rFonts w:ascii="Times New Roman" w:hAnsi="Times New Roman"/>
-          <w:color w:val="000000"/>
-        </w:rPr>
-        <w:t xml:space="preserve"> lựa chọn dialect này, hệ thống được ghi nhận là có hỗ trợ SMBv1.</w:t>
-      </w:r>
-    </w:p>
-    <w:p>
-      <w:pPr>
-        <w:spacing w:before="0" w:after="60"/>
-        <w:ind w:left="709" w:hanging="283"/>
-        <w:jc w:val="both"/>
-      </w:pPr>
-      <w:r>
-        <w:rPr>
-          <w:rFonts w:ascii="Times New Roman" w:hAnsi="Times New Roman"/>
-          <w:color w:val="000000"/>
-        </w:rPr>
-        <w:t xml:space="preserve">• </w:t>
-      </w:r>
-      <w:r>
-        <w:rPr>
-          <w:rFonts w:ascii="Times New Roman" w:hAnsi="Times New Roman"/>
-          <w:b/>
-          <w:color w:val="000000"/>
-        </w:rPr>
-        <w:t>Bản chất rủi ro:</w:t>
-      </w:r>
-      <w:r>
-        <w:rPr>
-          <w:rFonts w:ascii="Times New Roman" w:hAnsi="Times New Roman"/>
-          <w:color w:val="000000"/>
-        </w:rPr>
-        <w:t xml:space="preserve"> Kết quả này khẳng định máy chủ đang duy trì giao thức legacy với cơ chế bảo mật yếu, đồng thời driver </w:t>
-      </w:r>
-      <w:r>
-        <w:rPr>
-          <w:rFonts w:ascii="Times New Roman" w:hAnsi="Times New Roman"/>
-          <w:color w:val="000000"/>
-        </w:rPr>
-        <w:t>srv.sys</w:t>
-      </w:r>
-      <w:r>
-        <w:rPr>
-          <w:rFonts w:ascii="Times New Roman" w:hAnsi="Times New Roman"/>
-          <w:color w:val="000000"/>
-        </w:rPr>
-        <w:t xml:space="preserve"> đang được nạp trong bộ nhớ nhân để xử lý các gói tin này.</w:t>
-      </w:r>
-    </w:p>
-    <w:p>
-      <w:pPr>
-        <w:spacing w:before="0" w:after="60"/>
-        <w:ind w:left="709" w:hanging="283"/>
-        <w:jc w:val="both"/>
-      </w:pPr>
-      <w:r>
-        <w:rPr>
-          <w:rFonts w:ascii="Times New Roman" w:hAnsi="Times New Roman"/>
-          <w:color w:val="000000"/>
-        </w:rPr>
-        <w:t xml:space="preserve">• </w:t>
-      </w:r>
-      <w:r>
-        <w:rPr>
-          <w:rFonts w:ascii="Times New Roman" w:hAnsi="Times New Roman"/>
-          <w:b/>
-          <w:color w:val="000000"/>
-        </w:rPr>
-        <w:t>Ranh giới kết luận:</w:t>
-      </w:r>
-      <w:r>
-        <w:rPr>
-          <w:rFonts w:ascii="Times New Roman" w:hAnsi="Times New Roman"/>
-          <w:color w:val="000000"/>
-        </w:rPr>
-        <w:t xml:space="preserve"> Máy chủ chấp thuận SMBv1 </w:t>
-      </w:r>
-      <w:r>
-        <w:rPr>
-          <w:rFonts w:ascii="Times New Roman" w:hAnsi="Times New Roman"/>
-          <w:b/>
-          <w:color w:val="000000"/>
-        </w:rPr>
-        <w:t>chưa đủ cơ sở để khẳng định hệ thống tồn tại lỗ hổng MS17-010</w:t>
-      </w:r>
-      <w:r>
-        <w:rPr>
-          <w:rFonts w:ascii="Times New Roman" w:hAnsi="Times New Roman"/>
-          <w:color w:val="000000"/>
-        </w:rPr>
-        <w:t xml:space="preserve">. Nhiều hệ thống Windows đã được cập nhật bản vá an ninh nhưng vẫn bật SMBv1 để duy trì tương thích với thiết bị mạng cũ. Khi đó, mã nguồn xử lý trong </w:t>
-      </w:r>
-      <w:r>
-        <w:rPr>
-          <w:rFonts w:ascii="Times New Roman" w:hAnsi="Times New Roman"/>
-          <w:color w:val="000000"/>
-        </w:rPr>
-        <w:t>srv.sys</w:t>
-      </w:r>
-      <w:r>
-        <w:rPr>
-          <w:rFonts w:ascii="Times New Roman" w:hAnsi="Times New Roman"/>
-          <w:color w:val="000000"/>
-        </w:rPr>
-        <w:t xml:space="preserve"> đã được Microsoft sửa đổi an toàn.</w:t>
-      </w:r>
-    </w:p>
-    <w:p>
-      <w:pPr>
-        <w:pStyle w:val="Heading3"/>
-      </w:pPr>
-      <w:r>
-        <w:rPr>
-          <w:rFonts w:ascii="Times New Roman" w:hAnsi="Times New Roman"/>
-          <w:color w:val="000000"/>
-        </w:rPr>
-        <w:t>1.4.3. Xác định dấu hiệu lỗ hổng</w:t>
-      </w:r>
-    </w:p>
-    <w:p>
-      <w:pPr/>
-      <w:r>
-        <w:rPr>
-          <w:rFonts w:ascii="Times New Roman" w:hAnsi="Times New Roman"/>
-          <w:color w:val="000000"/>
-        </w:rPr>
-        <w:t xml:space="preserve">Mức 3 đi sâu vào việc thu thập các phản hồi kỹ thuật để nhận diện dấu hiệu driver </w:t>
-      </w:r>
-      <w:r>
-        <w:rPr>
-          <w:rFonts w:ascii="Times New Roman" w:hAnsi="Times New Roman"/>
-          <w:color w:val="000000"/>
-        </w:rPr>
-        <w:t>srv.sys</w:t>
-      </w:r>
-      <w:r>
-        <w:rPr>
-          <w:rFonts w:ascii="Times New Roman" w:hAnsi="Times New Roman"/>
-          <w:color w:val="000000"/>
-        </w:rPr>
-        <w:t xml:space="preserve"> chưa được cài đặt bản cập nhật an ninh MS17-010.</w:t>
-      </w:r>
-    </w:p>
-    <w:p>
-      <w:pPr>
-        <w:spacing w:before="0" w:after="60"/>
-        <w:ind w:left="709" w:hanging="283"/>
-        <w:jc w:val="both"/>
-      </w:pPr>
-      <w:r>
-        <w:rPr>
-          <w:rFonts w:ascii="Times New Roman" w:hAnsi="Times New Roman"/>
-          <w:color w:val="000000"/>
-        </w:rPr>
-        <w:t xml:space="preserve">• </w:t>
-      </w:r>
-      <w:r>
-        <w:rPr>
-          <w:rFonts w:ascii="Times New Roman" w:hAnsi="Times New Roman"/>
-          <w:b/>
-          <w:color w:val="000000"/>
-        </w:rPr>
-        <w:t>Phản hồi từ dịch vụ:</w:t>
-      </w:r>
-      <w:r>
-        <w:rPr>
-          <w:rFonts w:ascii="Times New Roman" w:hAnsi="Times New Roman"/>
-          <w:color w:val="000000"/>
-        </w:rPr>
-        <w:t xml:space="preserve"> Trạm kiểm thử thiết lập phiên kết nối tới tài nguyên chia sẻ quản trị </w:t>
-      </w:r>
-      <w:r>
-        <w:rPr>
-          <w:rFonts w:ascii="Times New Roman" w:hAnsi="Times New Roman"/>
-          <w:color w:val="000000"/>
-        </w:rPr>
-        <w:t>IPC$</w:t>
-      </w:r>
-      <w:r>
-        <w:rPr>
-          <w:rFonts w:ascii="Times New Roman" w:hAnsi="Times New Roman"/>
-          <w:color w:val="000000"/>
-        </w:rPr>
-        <w:t xml:space="preserve"> và gửi gói tin giao dịch thăm dò an toàn qua Named Pipe:</w:t>
-      </w:r>
-    </w:p>
-    <w:p>
-      <w:pPr>
-        <w:spacing w:before="0" w:after="60"/>
-        <w:ind w:left="992" w:hanging="283"/>
-        <w:jc w:val="both"/>
-      </w:pPr>
-      <w:r>
-        <w:rPr>
-          <w:rFonts w:ascii="Times New Roman" w:hAnsi="Times New Roman"/>
-          <w:color w:val="000000"/>
-        </w:rPr>
-        <w:t xml:space="preserve">– </w:t>
-      </w:r>
-      <w:r>
-        <w:rPr>
-          <w:rFonts w:ascii="Times New Roman" w:hAnsi="Times New Roman"/>
-          <w:i/>
-          <w:color w:val="000000"/>
-        </w:rPr>
-        <w:t>Dấu hiệu chưa vá:</w:t>
-      </w:r>
-      <w:r>
-        <w:rPr>
-          <w:rFonts w:ascii="Times New Roman" w:hAnsi="Times New Roman"/>
-          <w:color w:val="000000"/>
-        </w:rPr>
-        <w:t xml:space="preserve"> Máy chủ phản hồi mã trạng thái </w:t>
-      </w:r>
-      <w:r>
-        <w:rPr>
-          <w:rFonts w:ascii="Times New Roman" w:hAnsi="Times New Roman"/>
-          <w:color w:val="000000"/>
-        </w:rPr>
-        <w:t>STATUS_INSUFF_SERVER_RESOURCES</w:t>
-      </w:r>
-      <w:r>
-        <w:rPr>
-          <w:rFonts w:ascii="Times New Roman" w:hAnsi="Times New Roman"/>
-          <w:color w:val="000000"/>
-        </w:rPr>
-        <w:t xml:space="preserve"> (</w:t>
-      </w:r>
-      <w:r>
-        <w:rPr>
-          <w:rFonts w:ascii="Times New Roman" w:hAnsi="Times New Roman"/>
-          <w:color w:val="000000"/>
-        </w:rPr>
-        <w:t>0xC0000205</w:t>
-      </w:r>
-      <w:r>
-        <w:rPr>
-          <w:rFonts w:ascii="Times New Roman" w:hAnsi="Times New Roman"/>
-          <w:color w:val="000000"/>
-        </w:rPr>
-        <w:t xml:space="preserve">). Đây là phản xạ đặc trưng của nhánh mã </w:t>
-      </w:r>
-      <w:r>
-        <w:rPr>
-          <w:rFonts w:ascii="Times New Roman" w:hAnsi="Times New Roman"/>
-          <w:color w:val="000000"/>
-        </w:rPr>
-        <w:t>srv.sys</w:t>
-      </w:r>
-      <w:r>
-        <w:rPr>
-          <w:rFonts w:ascii="Times New Roman" w:hAnsi="Times New Roman"/>
-          <w:color w:val="000000"/>
-        </w:rPr>
-        <w:t xml:space="preserve"> cũ khi xử lý yêu cầu bộ nhớ bất thường.</w:t>
-      </w:r>
-    </w:p>
-    <w:p>
-      <w:pPr>
-        <w:spacing w:before="0" w:after="60"/>
-        <w:ind w:left="992" w:hanging="283"/>
-        <w:jc w:val="both"/>
-      </w:pPr>
-      <w:r>
-        <w:rPr>
-          <w:rFonts w:ascii="Times New Roman" w:hAnsi="Times New Roman"/>
-          <w:color w:val="000000"/>
-        </w:rPr>
-        <w:t xml:space="preserve">– </w:t>
-      </w:r>
-      <w:r>
-        <w:rPr>
-          <w:rFonts w:ascii="Times New Roman" w:hAnsi="Times New Roman"/>
-          <w:i/>
-          <w:color w:val="000000"/>
-        </w:rPr>
-        <w:t>Dấu hiệu đã vá hoặc an toàn:</w:t>
-      </w:r>
-      <w:r>
-        <w:rPr>
-          <w:rFonts w:ascii="Times New Roman" w:hAnsi="Times New Roman"/>
-          <w:color w:val="000000"/>
-        </w:rPr>
-        <w:t xml:space="preserve"> Máy chủ phản hồi mã lỗi </w:t>
-      </w:r>
-      <w:r>
-        <w:rPr>
-          <w:rFonts w:ascii="Times New Roman" w:hAnsi="Times New Roman"/>
-          <w:color w:val="000000"/>
-        </w:rPr>
-        <w:t>STATUS_ACCESS_DENIED</w:t>
-      </w:r>
-      <w:r>
-        <w:rPr>
-          <w:rFonts w:ascii="Times New Roman" w:hAnsi="Times New Roman"/>
-          <w:color w:val="000000"/>
-        </w:rPr>
-        <w:t xml:space="preserve"> (</w:t>
-      </w:r>
-      <w:r>
-        <w:rPr>
-          <w:rFonts w:ascii="Times New Roman" w:hAnsi="Times New Roman"/>
-          <w:color w:val="000000"/>
-        </w:rPr>
-        <w:t>0xC0000022</w:t>
-      </w:r>
-      <w:r>
-        <w:rPr>
-          <w:rFonts w:ascii="Times New Roman" w:hAnsi="Times New Roman"/>
-          <w:color w:val="000000"/>
-        </w:rPr>
-        <w:t>), mã lỗi handle không hợp lệ, hoặc từ chối thực hiện yêu cầu giao dịch.</w:t>
-      </w:r>
-    </w:p>
-    <w:p>
-      <w:pPr>
-        <w:spacing w:before="0" w:after="60"/>
-        <w:ind w:left="709" w:hanging="283"/>
-        <w:jc w:val="both"/>
-      </w:pPr>
-      <w:r>
-        <w:rPr>
-          <w:rFonts w:ascii="Times New Roman" w:hAnsi="Times New Roman"/>
-          <w:color w:val="000000"/>
-        </w:rPr>
-        <w:t xml:space="preserve">• </w:t>
-      </w:r>
-      <w:r>
-        <w:rPr>
-          <w:rFonts w:ascii="Times New Roman" w:hAnsi="Times New Roman"/>
-          <w:b/>
-          <w:color w:val="000000"/>
-        </w:rPr>
-        <w:t>Mức độ tin cậy:</w:t>
-      </w:r>
-      <w:r>
-        <w:rPr>
-          <w:rFonts w:ascii="Times New Roman" w:hAnsi="Times New Roman"/>
-          <w:color w:val="000000"/>
-        </w:rPr>
-        <w:t xml:space="preserve"> Cung cấp chỉ báo có độ tin cậy kỹ thuật cao về việc hệ thống mục tiêu đang thiếu gói cập nhật bảo mật của Microsoft.</w:t>
-      </w:r>
-    </w:p>
-    <w:p>
-      <w:pPr>
-        <w:spacing w:before="0" w:after="60"/>
-        <w:ind w:left="709" w:hanging="283"/>
-        <w:jc w:val="both"/>
-      </w:pPr>
-      <w:r>
-        <w:rPr>
-          <w:rFonts w:ascii="Times New Roman" w:hAnsi="Times New Roman"/>
-          <w:color w:val="000000"/>
-        </w:rPr>
-        <w:t xml:space="preserve">• </w:t>
-      </w:r>
-      <w:r>
-        <w:rPr>
-          <w:rFonts w:ascii="Times New Roman" w:hAnsi="Times New Roman"/>
-          <w:b/>
-          <w:color w:val="000000"/>
-        </w:rPr>
-        <w:t>Ranh giới suy luận:</w:t>
-      </w:r>
-      <w:r>
-        <w:rPr>
-          <w:rFonts w:ascii="Times New Roman" w:hAnsi="Times New Roman"/>
-          <w:color w:val="000000"/>
-        </w:rPr>
-        <w:t xml:space="preserve"> Dấu hiệu ở Mức 3 </w:t>
-      </w:r>
-      <w:r>
-        <w:rPr>
-          <w:rFonts w:ascii="Times New Roman" w:hAnsi="Times New Roman"/>
-          <w:b/>
-          <w:color w:val="000000"/>
-        </w:rPr>
-        <w:t>mới dừng lại ở mức độ suy đoán có căn cứ, chưa phải bằng chứng khẳng định việc khai thác chắc chắn thành công</w:t>
-      </w:r>
-      <w:r>
-        <w:rPr>
-          <w:rFonts w:ascii="Times New Roman" w:hAnsi="Times New Roman"/>
-          <w:color w:val="000000"/>
-        </w:rPr>
-        <w:t>. Kết quả này có thể bị sai lệch nếu máy chủ áp dụng chính sách chặn kết nối nặc danh hoặc có thiết bị giám sát lưu lượng mạng can thiệp.</w:t>
-      </w:r>
-    </w:p>
-    <w:p>
-      <w:pPr>
-        <w:pStyle w:val="Heading3"/>
-      </w:pPr>
-      <w:r>
-        <w:rPr>
-          <w:rFonts w:ascii="Times New Roman" w:hAnsi="Times New Roman"/>
-          <w:color w:val="000000"/>
-        </w:rPr>
-        <w:t>1.4.4. Xác minh lỗ hổng</w:t>
-      </w:r>
-    </w:p>
-    <w:p>
-      <w:pPr/>
-      <w:r>
-        <w:rPr>
-          <w:rFonts w:ascii="Times New Roman" w:hAnsi="Times New Roman"/>
-          <w:color w:val="000000"/>
-        </w:rPr>
-        <w:t>Mức 4 là bước xác thực thực nghiệm nhằm làm rõ khả năng can thiệp bộ nhớ và thực thi mã tùy ý của lỗ hổng CVE-2017-0144 trong môi trường lab cô lập.</w:t>
-      </w:r>
-    </w:p>
-    <w:p>
-      <w:pPr>
-        <w:spacing w:before="0" w:after="60"/>
-        <w:ind w:left="709" w:hanging="283"/>
-        <w:jc w:val="both"/>
-      </w:pPr>
-      <w:r>
-        <w:rPr>
-          <w:rFonts w:ascii="Times New Roman" w:hAnsi="Times New Roman"/>
-          <w:color w:val="000000"/>
-        </w:rPr>
-        <w:t xml:space="preserve">• </w:t>
-      </w:r>
-      <w:r>
-        <w:rPr>
-          <w:rFonts w:ascii="Times New Roman" w:hAnsi="Times New Roman"/>
-          <w:b/>
-          <w:color w:val="000000"/>
-        </w:rPr>
-        <w:t>Xác minh thực nghiệm:</w:t>
-      </w:r>
-      <w:r>
-        <w:rPr>
-          <w:rFonts w:ascii="Times New Roman" w:hAnsi="Times New Roman"/>
-          <w:color w:val="000000"/>
-        </w:rPr>
-        <w:t xml:space="preserve"> Kích hoạt mô-đun khai thác có kiểm soát để gửi gói tin kích hoạt lỗi tràn vùng đệm Non-Paged Pool:</w:t>
-      </w:r>
-    </w:p>
-    <w:p>
-      <w:pPr>
-        <w:spacing w:before="0" w:after="60"/>
-        <w:ind w:left="992" w:hanging="283"/>
-        <w:jc w:val="both"/>
-      </w:pPr>
-      <w:r>
-        <w:rPr>
-          <w:rFonts w:ascii="Times New Roman" w:hAnsi="Times New Roman"/>
-          <w:color w:val="000000"/>
-        </w:rPr>
-        <w:t xml:space="preserve">– </w:t>
-      </w:r>
-      <w:r>
-        <w:rPr>
-          <w:rFonts w:ascii="Times New Roman" w:hAnsi="Times New Roman"/>
-          <w:i/>
-          <w:color w:val="000000"/>
-        </w:rPr>
-        <w:t>Xác minh thành công:</w:t>
-      </w:r>
-      <w:r>
-        <w:rPr>
-          <w:rFonts w:ascii="Times New Roman" w:hAnsi="Times New Roman"/>
-          <w:color w:val="000000"/>
-        </w:rPr>
-        <w:t xml:space="preserve"> Trạm kiểm thử thiết lập được phiên điều khiển tương tác từ xa (Command Shell hoặc Meterpreter) với đặc quyền </w:t>
-      </w:r>
-      <w:r>
-        <w:rPr>
-          <w:rFonts w:ascii="Times New Roman" w:hAnsi="Times New Roman"/>
-          <w:color w:val="000000"/>
-        </w:rPr>
-        <w:t>NT AUTHORITY\SYSTEM</w:t>
-      </w:r>
-      <w:r>
-        <w:rPr>
-          <w:rFonts w:ascii="Times New Roman" w:hAnsi="Times New Roman"/>
-          <w:color w:val="000000"/>
-        </w:rPr>
-        <w:t>.</w:t>
-      </w:r>
-    </w:p>
-    <w:p>
-      <w:pPr>
-        <w:spacing w:before="0" w:after="60"/>
-        <w:ind w:left="992" w:hanging="283"/>
-        <w:jc w:val="both"/>
-      </w:pPr>
-      <w:r>
-        <w:rPr>
-          <w:rFonts w:ascii="Times New Roman" w:hAnsi="Times New Roman"/>
-          <w:color w:val="000000"/>
-        </w:rPr>
-        <w:t xml:space="preserve">– </w:t>
-      </w:r>
-      <w:r>
-        <w:rPr>
-          <w:rFonts w:ascii="Times New Roman" w:hAnsi="Times New Roman"/>
-          <w:i/>
-          <w:color w:val="000000"/>
-        </w:rPr>
-        <w:t>Gián đoạn dịch vụ:</w:t>
-      </w:r>
-      <w:r>
-        <w:rPr>
-          <w:rFonts w:ascii="Times New Roman" w:hAnsi="Times New Roman"/>
-          <w:color w:val="000000"/>
-        </w:rPr>
-        <w:t xml:space="preserve"> Quá trình can thiệp bộ nhớ thất bại làm máy chủ mục tiêu bị treo cứng hoặc gặp lỗi dừng màn hình xanh (BSOD).</w:t>
-      </w:r>
-    </w:p>
-    <w:p>
-      <w:pPr>
-        <w:spacing w:before="0" w:after="60"/>
-        <w:ind w:left="709" w:hanging="283"/>
-        <w:jc w:val="both"/>
-      </w:pPr>
-      <w:r>
-        <w:rPr>
-          <w:rFonts w:ascii="Times New Roman" w:hAnsi="Times New Roman"/>
-          <w:color w:val="000000"/>
-        </w:rPr>
-        <w:t xml:space="preserve">• </w:t>
-      </w:r>
-      <w:r>
-        <w:rPr>
-          <w:rFonts w:ascii="Times New Roman" w:hAnsi="Times New Roman"/>
-          <w:b/>
-          <w:color w:val="000000"/>
-        </w:rPr>
-        <w:t>Hệ quả thực tế:</w:t>
-      </w:r>
-      <w:r>
-        <w:rPr>
-          <w:rFonts w:ascii="Times New Roman" w:hAnsi="Times New Roman"/>
-          <w:color w:val="000000"/>
-        </w:rPr>
-        <w:t xml:space="preserve"> Cung cấp minh chứng thực nghiệm xác thực nhất về việc lỗ hổng có thể bị lợi dụng để chiếm đoạt quyền điều khiển cao nhất, đồng thời cảnh báo rủi ro làm tê liệt tính sẵn sàng của máy chủ.</w:t>
-      </w:r>
-    </w:p>
-    <w:p>
-      <w:pPr>
-        <w:spacing w:before="0" w:after="60"/>
-        <w:ind w:left="709" w:hanging="283"/>
-        <w:jc w:val="both"/>
-      </w:pPr>
-      <w:r>
-        <w:rPr>
-          <w:rFonts w:ascii="Times New Roman" w:hAnsi="Times New Roman"/>
-          <w:color w:val="000000"/>
-        </w:rPr>
-        <w:t xml:space="preserve">• </w:t>
-      </w:r>
-      <w:r>
-        <w:rPr>
-          <w:rFonts w:ascii="Times New Roman" w:hAnsi="Times New Roman"/>
-          <w:b/>
-          <w:color w:val="000000"/>
-        </w:rPr>
-        <w:t>Phạm vi áp dụng:</w:t>
-      </w:r>
-      <w:r>
-        <w:rPr>
-          <w:rFonts w:ascii="Times New Roman" w:hAnsi="Times New Roman"/>
-          <w:color w:val="000000"/>
-        </w:rPr>
-        <w:t xml:space="preserve"> Do can thiệp trực tiếp vào bộ nhớ nhân, việc kiểm tra ở Mức 4 tuyệt đối không được thực hiện trên môi trường thực tế mà chỉ triển khai trong mạng lab cô lập, sau khi đã sao lưu trạng thái máy ảo bằng snapshot.</w:t>
-      </w:r>
-    </w:p>
-    <w:p>
-      <w:pPr>
-        <w:pStyle w:val="Heading3"/>
-      </w:pPr>
-      <w:r>
-        <w:rPr>
-          <w:rFonts w:ascii="Times New Roman" w:hAnsi="Times New Roman"/>
-          <w:color w:val="000000"/>
-        </w:rPr>
-        <w:t>1.4.5. Giới hạn của phương pháp xác minh</w:t>
-      </w:r>
-    </w:p>
-    <w:p>
-      <w:pPr>
-        <w:keepNext/>
-      </w:pPr>
-      <w:r>
-        <w:rPr>
-          <w:rFonts w:ascii="Times New Roman" w:hAnsi="Times New Roman"/>
-          <w:color w:val="000000"/>
-        </w:rPr>
-        <w:t>Để bảo đảm tính khách quan và khoa học, nhóm em xác lập các giới hạn kỹ thuật cần tính đến khi đánh giá kết quả kiểm thử:</w:t>
-      </w:r>
-    </w:p>
-    <w:p>
-      <w:pPr>
-        <w:spacing w:before="0" w:after="60"/>
-        <w:ind w:left="709" w:hanging="283"/>
-        <w:jc w:val="both"/>
-      </w:pPr>
-      <w:r>
-        <w:rPr>
-          <w:rFonts w:ascii="Times New Roman" w:hAnsi="Times New Roman"/>
-          <w:color w:val="000000"/>
-        </w:rPr>
-        <w:t xml:space="preserve">• </w:t>
-      </w:r>
-      <w:r>
-        <w:rPr>
-          <w:rFonts w:ascii="Times New Roman" w:hAnsi="Times New Roman"/>
-          <w:b/>
-          <w:color w:val="000000"/>
-        </w:rPr>
-        <w:t>Ảnh hưởng của tường lửa:</w:t>
-      </w:r>
-      <w:r>
-        <w:rPr>
-          <w:rFonts w:ascii="Times New Roman" w:hAnsi="Times New Roman"/>
-          <w:color w:val="000000"/>
-        </w:rPr>
-        <w:t xml:space="preserve"> Tường lửa mạng hoặc tường lửa cục bộ Windows Firewall nếu được cấu hình chặn cổng hoặc lọc gói tin sẽ khiến công cụ ghi nhận trạng thái </w:t>
-      </w:r>
-      <w:r>
-        <w:rPr>
-          <w:rFonts w:ascii="Times New Roman" w:hAnsi="Times New Roman"/>
-          <w:color w:val="000000"/>
-        </w:rPr>
-        <w:t>Filtered</w:t>
-      </w:r>
-      <w:r>
-        <w:rPr>
-          <w:rFonts w:ascii="Times New Roman" w:hAnsi="Times New Roman"/>
-          <w:color w:val="000000"/>
-        </w:rPr>
-        <w:t>. Trạng thái này chỉ phản ánh việc đường truyền bị chặn từ vị trí trạm kiểm thử, không phản ánh việc dịch vụ bên trong máy chủ có an toàn hay không.</w:t>
-      </w:r>
-    </w:p>
-    <w:p>
-      <w:pPr>
-        <w:spacing w:before="0" w:after="60"/>
-        <w:ind w:left="709" w:hanging="283"/>
-        <w:jc w:val="both"/>
-      </w:pPr>
-      <w:r>
-        <w:rPr>
-          <w:rFonts w:ascii="Times New Roman" w:hAnsi="Times New Roman"/>
-          <w:color w:val="000000"/>
-        </w:rPr>
-        <w:t xml:space="preserve">• </w:t>
-      </w:r>
-      <w:r>
-        <w:rPr>
-          <w:rFonts w:ascii="Times New Roman" w:hAnsi="Times New Roman"/>
-          <w:b/>
-          <w:color w:val="000000"/>
-        </w:rPr>
-        <w:t>Chính sách hạn chế kết nối nặc danh (Null Session):</w:t>
-      </w:r>
-      <w:r>
-        <w:rPr>
-          <w:rFonts w:ascii="Times New Roman" w:hAnsi="Times New Roman"/>
-          <w:color w:val="000000"/>
-        </w:rPr>
-        <w:t xml:space="preserve"> Nếu máy chủ Windows được cấu hình cấm hoàn toàn các kết nối nặc danh vào tài nguyên </w:t>
-      </w:r>
-      <w:r>
-        <w:rPr>
-          <w:rFonts w:ascii="Times New Roman" w:hAnsi="Times New Roman"/>
-          <w:color w:val="000000"/>
-        </w:rPr>
-        <w:t>IPC$</w:t>
-      </w:r>
-      <w:r>
-        <w:rPr>
-          <w:rFonts w:ascii="Times New Roman" w:hAnsi="Times New Roman"/>
-          <w:color w:val="000000"/>
-        </w:rPr>
-        <w:t>, các kịch bản thăm dò ở Mức 3 sẽ không thể hoàn tất bước thiết lập phiên và không nhận được mã phản hồi NT Status. Khi đó, công cụ có thể báo không phát hiện thấy lỗ hổng (âm tính giả) dù thực tế hệ thống vẫn chưa được vá bản cập nhật MS17-010.</w:t>
-      </w:r>
-    </w:p>
-    <w:p>
-      <w:pPr>
-        <w:spacing w:before="0" w:after="60"/>
-        <w:ind w:left="709" w:hanging="283"/>
-        <w:jc w:val="both"/>
-      </w:pPr>
-      <w:r>
-        <w:rPr>
-          <w:rFonts w:ascii="Times New Roman" w:hAnsi="Times New Roman"/>
-          <w:color w:val="000000"/>
-        </w:rPr>
-        <w:t xml:space="preserve">• </w:t>
-      </w:r>
-      <w:r>
-        <w:rPr>
-          <w:rFonts w:ascii="Times New Roman" w:hAnsi="Times New Roman"/>
-          <w:b/>
-          <w:color w:val="000000"/>
-        </w:rPr>
-        <w:t>Sự khác biệt giữa các phiên bản Windows:</w:t>
-      </w:r>
-      <w:r>
-        <w:rPr>
-          <w:rFonts w:ascii="Times New Roman" w:hAnsi="Times New Roman"/>
-          <w:color w:val="000000"/>
-        </w:rPr>
-        <w:t xml:space="preserve"> Cùng một lỗ hổng MS17-010 nhưng cấu trúc bộ nhớ nhân và cơ chế bảo vệ của Windows 7 SP1 x64, Windows Server 2008 R2 và Windows 10 có sự khác biệt rõ rệt. Một kỹ thuật khai thác thành công trên Windows 7 có thể gây lỗi BSOD ngay lập tức trên Windows 10 do các cơ chế bảo vệ phân bổ vùng nhớ được tăng cường.</w:t>
-      </w:r>
-    </w:p>
-    <w:p>
-      <w:pPr>
-        <w:spacing w:before="0" w:after="60"/>
-        <w:ind w:left="709" w:hanging="283"/>
-        <w:jc w:val="both"/>
-      </w:pPr>
-      <w:r>
-        <w:rPr>
-          <w:rFonts w:ascii="Times New Roman" w:hAnsi="Times New Roman"/>
-          <w:color w:val="000000"/>
-        </w:rPr>
-        <w:t xml:space="preserve">• </w:t>
-      </w:r>
-      <w:r>
-        <w:rPr>
-          <w:rFonts w:ascii="Times New Roman" w:hAnsi="Times New Roman"/>
-          <w:b/>
-          <w:color w:val="000000"/>
-        </w:rPr>
-        <w:t>Tính phi tuyệt đối của việc quan sát từ bên ngoài:</w:t>
-      </w:r>
-      <w:r>
-        <w:rPr>
-          <w:rFonts w:ascii="Times New Roman" w:hAnsi="Times New Roman"/>
-          <w:color w:val="000000"/>
-        </w:rPr>
-        <w:t xml:space="preserve"> Mọi công cụ quét mạng từ xa (Black-box) chỉ ghi nhận những phản hồi trên đường truyền, không thể thay thế cho việc kiểm tra cấu hình nội tại của hệ thống. Do đó, để đưa ra kết luận chuẩn xác, nhóm em luôn đối chiếu kết quả kiểm thử từ xa với việc kiểm tra trực tiếp danh mục bản vá KB (Hotfix) và trạng thái tính năng SMBv1 bằng lệnh quản trị trên máy chủ mục tiêu (kiểm tra White-box).</w:t>
-      </w:r>
-    </w:p>
-    <w:p>
-      <w:pPr/>
-      <w:r>
-        <w:rPr>
-          <w:rFonts w:ascii="Times New Roman" w:hAnsi="Times New Roman"/>
-          <w:color w:val="000000"/>
-        </w:rPr>
-        <w:t>Toàn bộ khung tiêu chí 4 mức và các giới hạn kỹ thuật này tạo thành nền tảng phương pháp luận xuyên suốt, làm cơ sở trực tiếp để nhóm em thiết kế mô hình mạng lab cô lập trong Chương 2 và triển khai thực nghiệm đối chứng trong Chương 3.</w:t>
+        <w:t>Khung tiêu chí bốn mức và các giới hạn kỹ thuật nêu trên là căn cứ phương pháp luận trực tiếp để đồ án xây dựng mô hình thử nghiệm trong Chương 2, đồng thời định hình các kịch bản đo đạc, kiểm chứng và phân tích kết quả đối chứng trong Chương 3.</w:t>
       </w:r>
     </w:p>
     <w:sectPr>

</xml_diff>

<commit_message>
docs(do-an): complete defense readiness revision for chapter 1 sections 1.2 to 1.4
</commit_message>
<xml_diff>
--- a/work/do-an/outputs/CHUONG_1_REVIEW.docx
+++ b/work/do-an/outputs/CHUONG_1_REVIEW.docx
@@ -3202,7 +3202,7 @@
           <w:rFonts w:ascii="Times New Roman" w:hAnsi="Times New Roman"/>
           <w:color w:val="000000"/>
         </w:rPr>
-        <w:t>Metasploit Framework được nhóm em sử dụng như một công cụ đối chiếu và xác minh sâu hơn trong phạm vi thực nghiệm:</w:t>
+        <w:t>Metasploit Framework được nhóm em sử dụng như một công cụ đối chiếu triển khai và xác minh sâu hơn trong phạm vi thực nghiệm:</w:t>
       </w:r>
     </w:p>
     <w:p>
@@ -3245,7 +3245,21 @@
           <w:rFonts w:ascii="Times New Roman" w:hAnsi="Times New Roman"/>
           <w:color w:val="000000"/>
         </w:rPr>
-        <w:t xml:space="preserve"> thực hiện quét độc lập, cung cấp dữ liệu đối chiếu chéo với kịch bản NSE nhằm tăng độ tin cậy của chỉ báo lỗ hổng.</w:t>
+        <w:t xml:space="preserve"> thực thi cùng phương pháp thăm dò logic như kịch bản NSE, qua đó giúp đối chiếu chéo khâu phân tích cú pháp và phản hồi giữa hai phần mềm kiểm thử khác nhau. Cần lưu ý rằng hai công cụ này cùng dựa trên một cơ chế tín hiệu mạng qua tài nguyên </w:t>
+      </w:r>
+      <w:r>
+        <w:rPr>
+          <w:rFonts w:ascii="Times New Roman" w:hAnsi="Times New Roman"/>
+          <w:color w:val="000000"/>
+        </w:rPr>
+        <w:t>IPC$</w:t>
+      </w:r>
+      <w:r>
+        <w:rPr>
+          <w:rFonts w:ascii="Times New Roman" w:hAnsi="Times New Roman"/>
+          <w:color w:val="000000"/>
+        </w:rPr>
+        <w:t xml:space="preserve"> nên không tạo thành hai nguồn bằng chứng độc lập về trạng thái của máy chủ.</w:t>
       </w:r>
     </w:p>
     <w:p>
@@ -3298,7 +3312,7 @@
           <w:rFonts w:ascii="Times New Roman" w:hAnsi="Times New Roman"/>
           <w:color w:val="000000"/>
         </w:rPr>
-        <w:t>Khác với các công cụ quét thụ động, mô-đun khai thác tác động trực tiếp vào luồng xử lý bộ nhớ của hệ thống. Kết quả thu được dù thành công, thất bại hay gây mất ổn định dịch vụ đều phải được diễn giải thận trọng cùng với phiên bản hệ điều hành, cấu hình dịch vụ và các điều kiện kỹ thuật đi kèm.</w:t>
+        <w:t>Khác với các công cụ thăm dò logic, mô-đun khai thác can thiệp trực tiếp vào việc sắp xếp vùng nhớ của hệ điều hành. Kết quả thu được dù thành công, thất bại hay gây mất ổn định dịch vụ đều phải được diễn giải thận trọng cùng với phiên bản hệ điều hành, cấu hình dịch vụ và các điều kiện kỹ thuật đi kèm.</w:t>
       </w:r>
     </w:p>
     <w:p>
@@ -3380,7 +3394,7 @@
           <w:rFonts w:ascii="Times New Roman" w:hAnsi="Times New Roman"/>
           <w:color w:val="000000"/>
         </w:rPr>
-        <w:t xml:space="preserve"> Xác định khả năng tiếp cận dịch vụ qua việc phát hiện các cổng mạng đang mở.</w:t>
+        <w:t xml:space="preserve"> Xác định khả năng tiếp cận dịch vụ qua việc phát hiện các cổng mạng đang mở ở tầng giao vận.</w:t>
       </w:r>
     </w:p>
     <w:p>
@@ -3409,7 +3423,7 @@
           <w:rFonts w:ascii="Times New Roman" w:hAnsi="Times New Roman"/>
           <w:color w:val="000000"/>
         </w:rPr>
-        <w:t xml:space="preserve"> Tương tác ở tầng ứng dụng để nhận diện việc hỗ trợ SMBv1 và thu thập dấu hiệu của MS17-010.</w:t>
+        <w:t xml:space="preserve"> Tương tác ở tầng ứng dụng để nhận diện việc hỗ trợ SMBv1 và thu thập dấu hiệu nghi ngờ về MS17-010.</w:t>
       </w:r>
     </w:p>
     <w:p>
@@ -3438,7 +3452,7 @@
           <w:rFonts w:ascii="Times New Roman" w:hAnsi="Times New Roman"/>
           <w:color w:val="000000"/>
         </w:rPr>
-        <w:t xml:space="preserve"> Đóng vai trò đối chiếu độc lập và thực hiện bước xác minh sâu hơn khi các dấu hiệu trước đó đã được xác lập.</w:t>
+        <w:t xml:space="preserve"> Đóng vai trò đối chiếu triển khai với kịch bản quét và thực hiện bước xác minh sâu hơn khi các dấu hiệu trước đó đã được xác lập.</w:t>
       </w:r>
     </w:p>
     <w:p>
@@ -3549,14 +3563,14 @@
           <w:b/>
           <w:color w:val="000000"/>
         </w:rPr>
-        <w:t>Ý nghĩa:</w:t>
-      </w:r>
-      <w:r>
-        <w:rPr>
-          <w:rFonts w:ascii="Times New Roman" w:hAnsi="Times New Roman"/>
-          <w:color w:val="000000"/>
-        </w:rPr>
-        <w:t xml:space="preserve"> Chứng minh máy chủ đang vận hành một dịch vụ mạng sẵn sàng tiếp nhận kết nối SMB từ bên ngoài.</w:t>
+        <w:t>Ý nghĩa kỹ thuật:</w:t>
+      </w:r>
+      <w:r>
+        <w:rPr>
+          <w:rFonts w:ascii="Times New Roman" w:hAnsi="Times New Roman"/>
+          <w:color w:val="000000"/>
+        </w:rPr>
+        <w:t xml:space="preserve"> Chứng minh cổng mạng của máy chủ đang có tiến trình lắng nghe và tiếp nhận kết nối ở tầng giao vận.</w:t>
       </w:r>
     </w:p>
     <w:p>
@@ -3585,7 +3599,7 @@
           <w:rFonts w:ascii="Times New Roman" w:hAnsi="Times New Roman"/>
           <w:color w:val="000000"/>
         </w:rPr>
-        <w:t xml:space="preserve"> Trạng thái mở cổng 445 hoặc 139 chỉ phản ánh khả năng kết nối ở tầng giao vận, hoàn toàn không đồng nghĩa với việc hệ thống có lỗ hổng. Mọi máy chủ Windows đang chia sẻ tệp tin hoặc máy in hợp lệ đều mở các cổng này.</w:t>
+        <w:t xml:space="preserve"> Trạng thái mở cổng 445 hoặc 139 chỉ phản ánh khả năng tiếp cận ở tầng giao vận, chưa chứng minh dịch vụ SMB ở tầng ứng dụng hoạt động bình thường và hoàn toàn không đồng nghĩa với việc hệ thống có lỗ hổng. Mọi máy chủ Windows đang chia sẻ tệp tin hoặc máy in hợp lệ đều mở các cổng này.</w:t>
       </w:r>
     </w:p>
     <w:p>
@@ -3688,28 +3702,14 @@
           <w:b/>
           <w:color w:val="000000"/>
         </w:rPr>
-        <w:t>Ý nghĩa:</w:t>
-      </w:r>
-      <w:r>
-        <w:rPr>
-          <w:rFonts w:ascii="Times New Roman" w:hAnsi="Times New Roman"/>
-          <w:color w:val="000000"/>
-        </w:rPr>
-        <w:t xml:space="preserve"> Khẳng định máy chủ duy trì giao thức legacy và nạp driver </w:t>
-      </w:r>
-      <w:r>
-        <w:rPr>
-          <w:rFonts w:ascii="Times New Roman" w:hAnsi="Times New Roman"/>
-          <w:color w:val="000000"/>
-        </w:rPr>
-        <w:t>srv.sys</w:t>
-      </w:r>
-      <w:r>
-        <w:rPr>
-          <w:rFonts w:ascii="Times New Roman" w:hAnsi="Times New Roman"/>
-          <w:color w:val="000000"/>
-        </w:rPr>
-        <w:t xml:space="preserve"> để xử lý các gói tin này.</w:t>
+        <w:t>Ý nghĩa kỹ thuật:</w:t>
+      </w:r>
+      <w:r>
+        <w:rPr>
+          <w:rFonts w:ascii="Times New Roman" w:hAnsi="Times New Roman"/>
+          <w:color w:val="000000"/>
+        </w:rPr>
+        <w:t xml:space="preserve"> Khẳng định máy chủ chấp thuận giao tiếp bằng giao thức cũ SMBv1 và sẵn sàng xử lý các gói tin này.</w:t>
       </w:r>
     </w:p>
     <w:p>
@@ -3738,7 +3738,7 @@
           <w:rFonts w:ascii="Times New Roman" w:hAnsi="Times New Roman"/>
           <w:color w:val="000000"/>
         </w:rPr>
-        <w:t xml:space="preserve"> Hỗ trợ SMBv1 là điều kiện cần về giao thức, nhưng chưa đủ cơ sở để khẳng định hệ thống tồn tại lỗ hổng MS17-010. Một máy chủ Windows đã cập nhật bản vá vẫn có thể bật SMBv1 để phục vụ tương thích nghiệp vụ mà vẫn an toàn trước lỗi xử lý bộ nhớ.</w:t>
+        <w:t xml:space="preserve"> Hỗ trợ SMBv1 là điều kiện cần về giao thức, nhưng không quan sát trực tiếp được trạng thái nội tại của driver nhân và chưa đủ cơ sở để khẳng định hệ thống tồn tại lỗ hổng MS17-010. Một máy chủ Windows đã cập nhật bản vá vẫn có thể bật SMBv1 để phục vụ tương thích nghiệp vụ mà vẫn an toàn trước lỗi xử lý bộ nhớ.</w:t>
       </w:r>
     </w:p>
     <w:p>
@@ -3805,7 +3805,21 @@
           <w:rFonts w:ascii="Times New Roman" w:hAnsi="Times New Roman"/>
           <w:color w:val="000000"/>
         </w:rPr>
-        <w:t xml:space="preserve"> Trạm kiểm thử gửi gói tin giao dịch thăm dò an toàn qua giao diện SMB:</w:t>
+        <w:t xml:space="preserve"> Trạm kiểm thử gửi gói tin giao dịch thăm dò an toàn qua giao diện SMB (</w:t>
+      </w:r>
+      <w:r>
+        <w:rPr>
+          <w:rFonts w:ascii="Times New Roman" w:hAnsi="Times New Roman"/>
+          <w:color w:val="000000"/>
+        </w:rPr>
+        <w:t>IPC$</w:t>
+      </w:r>
+      <w:r>
+        <w:rPr>
+          <w:rFonts w:ascii="Times New Roman" w:hAnsi="Times New Roman"/>
+          <w:color w:val="000000"/>
+        </w:rPr>
+        <w:t>):</w:t>
       </w:r>
     </w:p>
     <w:p>
@@ -3941,14 +3955,14 @@
           <w:b/>
           <w:color w:val="000000"/>
         </w:rPr>
-        <w:t>Ý nghĩa:</w:t>
-      </w:r>
-      <w:r>
-        <w:rPr>
-          <w:rFonts w:ascii="Times New Roman" w:hAnsi="Times New Roman"/>
-          <w:color w:val="000000"/>
-        </w:rPr>
-        <w:t xml:space="preserve"> Cung cấp chỉ báo kỹ thuật về khả năng hệ thống đang thiếu bản cập nhật an ninh tương ứng.</w:t>
+        <w:t>Ý nghĩa kỹ thuật:</w:t>
+      </w:r>
+      <w:r>
+        <w:rPr>
+          <w:rFonts w:ascii="Times New Roman" w:hAnsi="Times New Roman"/>
+          <w:color w:val="000000"/>
+        </w:rPr>
+        <w:t xml:space="preserve"> Cung cấp chỉ báo về sự sai lệch logic phản hồi của hệ thống trước một yêu cầu giao dịch bất thường.</w:t>
       </w:r>
     </w:p>
     <w:p>
@@ -3977,7 +3991,7 @@
           <w:rFonts w:ascii="Times New Roman" w:hAnsi="Times New Roman"/>
           <w:color w:val="000000"/>
         </w:rPr>
-        <w:t xml:space="preserve"> Dấu hiệu ở Mức 3 mới dừng ở mức suy đoán có căn cứ từ một yêu cầu thăm dò, không phải là bằng chứng khẳng định việc khai thác chắc chắn thành công. Kết quả này còn chịu ảnh hưởng bởi cấu hình kiểm soát truy cập của máy chủ.</w:t>
+        <w:t xml:space="preserve"> Dấu hiệu ở Mức 3 chỉ dừng lại ở chỉ báo logic từ một gói tin thăm dò, không phải bằng chứng khẳng định việc khai thác chắc chắn thành công. Phản hồi từ chối cũng không chứng minh hệ thống đã vá an toàn vì kết quả còn chịu ảnh hưởng của chính sách kiểm soát truy cập nặc danh.</w:t>
       </w:r>
     </w:p>
     <w:p>
@@ -4059,7 +4073,7 @@
           <w:rFonts w:ascii="Times New Roman" w:hAnsi="Times New Roman"/>
           <w:color w:val="000000"/>
         </w:rPr>
-        <w:t xml:space="preserve"> Thiết lập được quyền điều khiển tương tác trên máy chủ mục tiêu, chứng minh lỗ hổng có thể bị lợi dụng để thực thi mã từ xa.</w:t>
+        <w:t xml:space="preserve"> Thiết lập được quyền điều khiển tương tác trên máy chủ mục tiêu, chứng minh lỗ hổng có thể bị lợi dụng để thực thi mã từ xa với đặc quyền cao. Kết quả này ghi nhận quyền thực thi của phiên ở tầng hệ điều hành, không đồng nhất với việc quan sát trực tiếp bộ nhớ nhân từ xa.</w:t>
       </w:r>
     </w:p>
     <w:p>
@@ -4088,7 +4102,7 @@
           <w:rFonts w:ascii="Times New Roman" w:hAnsi="Times New Roman"/>
           <w:color w:val="000000"/>
         </w:rPr>
-        <w:t xml:space="preserve"> Quá trình can thiệp bị từ chối, kết nối bị đóng hoặc hệ thống không phản hồi, cho thấy điều kiện mục tiêu không phù hợp để thực hiện tác động.</w:t>
+        <w:t xml:space="preserve"> Quá trình can thiệp bị từ chối, kết nối bị đóng hoặc hệ thống không phản hồi. Hiện tượng này chỉ cho thấy kỹ thuật kiểm chứng hiện tại không phù hợp với mục tiêu, không tự động chứng minh máy chủ miễn nhiễm hoặc không có lỗ hổng.</w:t>
       </w:r>
     </w:p>
     <w:p>
@@ -4117,7 +4131,7 @@
           <w:rFonts w:ascii="Times New Roman" w:hAnsi="Times New Roman"/>
           <w:color w:val="000000"/>
         </w:rPr>
-        <w:t xml:space="preserve"> Máy chủ bị treo hoặc phát sinh lỗi màn hình xanh (BSOD). Hiện tượng này chứng minh hệ thống bị ảnh hưởng về tính sẵn sàng, nhưng không được coi là xác minh thực thi mã thành công.</w:t>
+        <w:t xml:space="preserve"> Máy chủ bị treo hoặc phát sinh lỗi màn hình xanh (BSOD). Hiện tượng này chứng minh lỗi quản lý bộ nhớ nhân đã bị kích hoạt làm ảnh hưởng đến tính sẵn sàng, nhưng không được coi là xác minh thực thi mã thành công.</w:t>
       </w:r>
     </w:p>
     <w:p>
@@ -4139,7 +4153,7 @@
           <w:b/>
           <w:color w:val="000000"/>
         </w:rPr>
-        <w:t>Ý nghĩa:</w:t>
+        <w:t>Ý nghĩa kỹ thuật:</w:t>
       </w:r>
       <w:r>
         <w:rPr>

</xml_diff>

<commit_message>
revision(chapter-1): final content revision for sections 1.2-1.4 and defense review synchronization
</commit_message>
<xml_diff>
--- a/work/do-an/outputs/CHUONG_1_REVIEW.docx
+++ b/work/do-an/outputs/CHUONG_1_REVIEW.docx
@@ -1821,7 +1821,7 @@
           <w:rFonts w:ascii="Times New Roman" w:hAnsi="Times New Roman"/>
           <w:color w:val="000000"/>
         </w:rPr>
-        <w:t>Vào tháng 03 năm 2017, Microsoft phát hành bản tin an ninh MS17-010 nhằm khắc phục sáu lỗ hổng bảo mật liên quan đến giao thức SMBv1 trong hệ điều hành Windows. Nhóm lỗ hổng này bao gồm năm lỗ hổng thực thi mã từ xa (Remote Code Execution - RCE) và một lỗ hổng tiết lộ thông tin (Information Disclosure). Đây là bản tin an ninh tổng hợp bao trùm nhiều vấn đề kỹ thuật khác nhau, không đại diện cho một lỗi đơn lẻ.</w:t>
+        <w:t>Vào tháng 03 năm 2017, Microsoft phát hành bản tin an ninh MS17-010 nhằm khắc phục một nhóm gồm sáu lỗ hổng bảo mật liên quan đến cách thức thành phần SMBv1 Server trên hệ điều hành Windows tiếp nhận và xử lý các yêu cầu được chế tạo đặc biệt. Nhóm lỗ hổng này bao gồm năm lỗ hổng thực thi mã từ xa (Remote Code Execution - RCE) và một lỗ hổng tiết lộ thông tin (Information Disclosure). Đây là bản tin an ninh tổng hợp bao trùm nhiều vấn đề kỹ thuật khác nhau, không phải là một lỗi đơn lẻ.</w:t>
       </w:r>
     </w:p>
     <w:p>
@@ -1831,7 +1831,7 @@
           <w:rFonts w:ascii="Times New Roman" w:hAnsi="Times New Roman"/>
           <w:color w:val="000000"/>
         </w:rPr>
-        <w:t xml:space="preserve">Nguyên nhân gốc rễ bắt nguồn từ việc giao thức SMBv1 được thiết kế từ giai đoạn sớm của mạng máy tính, khi các cơ chế kiểm soát biên dữ liệu chưa được hoàn thiện. Do trình điều khiển </w:t>
+        <w:t xml:space="preserve">Khi thành phần máy chủ xử lý dữ liệu mạng trong không gian nhân (Kernel Mode), các thiếu sót trong quản lý bộ nhớ tại trình điều khiển </w:t>
       </w:r>
       <w:r>
         <w:rPr>
@@ -1845,7 +1845,7 @@
           <w:rFonts w:ascii="Times New Roman" w:hAnsi="Times New Roman"/>
           <w:color w:val="000000"/>
         </w:rPr>
-        <w:t xml:space="preserve"> vận hành trực tiếp trong không gian nhân (Kernel Mode) nhằm tối ưu hiệu năng I/O, các thiếu sót trong quản lý bộ nhớ tại thành phần này có thể đe dọa trực tiếp đến tính ổn định và an toàn của hệ điều hành. Bản tin ảnh hưởng đến nhiều phiên bản Windows còn lưu hành tại thời điểm công bố.</w:t>
+        <w:t xml:space="preserve"> có thể ảnh hưởng trực tiếp đến tính ổn định hoặc sự an toàn của toàn bộ hệ điều hành. Bản tin an ninh này áp dụng cho nhiều phiên bản hệ điều hành Windows còn được hỗ trợ tại thời điểm công bố.</w:t>
       </w:r>
     </w:p>
     <w:p>
@@ -1855,7 +1855,7 @@
           <w:rFonts w:ascii="Times New Roman" w:hAnsi="Times New Roman"/>
           <w:color w:val="000000"/>
         </w:rPr>
-        <w:t>Trong phạm vi đồ án, nhóm em tập trung vào lỗ hổng thực thi mã từ xa không yêu cầu xác thực trong nhóm này để làm rõ rủi ro của dịch vụ SMBv1, đồng thời xây dựng quy trình kiểm thử và đối chứng phòng thủ có kiểm soát.</w:t>
+        <w:t>Trong phạm vi đề cương và mục tiêu nghiên cứu của đồ án, CVE-2017-0144 được lựa chọn làm đối tượng phân tích trọng tâm nhằm làm rõ cơ chế phát sinh lỗi trong dịch vụ SMBv1, đồng thời phục vụ việc xây dựng quy trình kiểm thử và đối chứng phòng thủ có kiểm soát.</w:t>
       </w:r>
     </w:p>
     <w:p>
@@ -1879,7 +1879,7 @@
           <w:rFonts w:ascii="Times New Roman" w:hAnsi="Times New Roman"/>
           <w:color w:val="000000"/>
         </w:rPr>
-        <w:t>Bản tin MS17-010 xử lý sáu mã lỗ hổng (Common Vulnerabilities and Exposures - CVE) với các đặc điểm kỹ thuật khác nhau:</w:t>
+        <w:t>Bản tin MS17-010 xử lý sáu mã lỗ hổng bảo mật (Common Vulnerabilities and Exposures - CVE) được phân định theo loại tác động kỹ thuật:</w:t>
       </w:r>
     </w:p>
     <w:p>
@@ -1901,14 +1901,14 @@
           <w:b/>
           <w:color w:val="000000"/>
         </w:rPr>
-        <w:t>CVE-2017-0143 (RCE):</w:t>
-      </w:r>
-      <w:r>
-        <w:rPr>
-          <w:rFonts w:ascii="Times New Roman" w:hAnsi="Times New Roman"/>
-          <w:color w:val="000000"/>
-        </w:rPr>
-        <w:t xml:space="preserve"> Lỗ hổng thực thi mã từ xa phát sinh từ cách xử lý các thông điệp giao dịch phụ (Transaction2) trong SMBv1 khi nhận chuỗi yêu cầu bất thường.</w:t>
+        <w:t>CVE-2017-0143:</w:t>
+      </w:r>
+      <w:r>
+        <w:rPr>
+          <w:rFonts w:ascii="Times New Roman" w:hAnsi="Times New Roman"/>
+          <w:color w:val="000000"/>
+        </w:rPr>
+        <w:t xml:space="preserve"> Lỗ hổng thực thi mã từ xa (Remote Code Execution - RCE) trong thành phần SMBv1 Server.</w:t>
       </w:r>
     </w:p>
     <w:p>
@@ -1930,14 +1930,14 @@
           <w:b/>
           <w:color w:val="000000"/>
         </w:rPr>
-        <w:t>CVE-2017-0144 (RCE):</w:t>
-      </w:r>
-      <w:r>
-        <w:rPr>
-          <w:rFonts w:ascii="Times New Roman" w:hAnsi="Times New Roman"/>
-          <w:color w:val="000000"/>
-        </w:rPr>
-        <w:t xml:space="preserve"> Lỗ hổng thực thi mã từ xa do lỗi kiểm soát kích thước khi xử lý cấu trúc thuộc tính tệp mở rộng (FEA) trong SMBv1, dẫn đến tràn bộ nhớ nhân.</w:t>
+        <w:t>CVE-2017-0144:</w:t>
+      </w:r>
+      <w:r>
+        <w:rPr>
+          <w:rFonts w:ascii="Times New Roman" w:hAnsi="Times New Roman"/>
+          <w:color w:val="000000"/>
+        </w:rPr>
+        <w:t xml:space="preserve"> Lỗ hổng thực thi mã từ xa (Remote Code Execution - RCE) liên quan đến việc xử lý dữ liệu thuộc tính tệp mở rộng (FEA) trong SMBv1.</w:t>
       </w:r>
     </w:p>
     <w:p>
@@ -1959,14 +1959,14 @@
           <w:b/>
           <w:color w:val="000000"/>
         </w:rPr>
-        <w:t>CVE-2017-0145 (RCE):</w:t>
-      </w:r>
-      <w:r>
-        <w:rPr>
-          <w:rFonts w:ascii="Times New Roman" w:hAnsi="Times New Roman"/>
-          <w:color w:val="000000"/>
-        </w:rPr>
-        <w:t xml:space="preserve"> Lỗ hổng thực thi mã từ xa liên quan đến việc xác thực tham số bộ đệm trong các yêu cầu giao dịch SMBv1.</w:t>
+        <w:t>CVE-2017-0145:</w:t>
+      </w:r>
+      <w:r>
+        <w:rPr>
+          <w:rFonts w:ascii="Times New Roman" w:hAnsi="Times New Roman"/>
+          <w:color w:val="000000"/>
+        </w:rPr>
+        <w:t xml:space="preserve"> Lỗ hổng thực thi mã từ xa (Remote Code Execution - RCE) trong thành phần SMBv1 Server.</w:t>
       </w:r>
     </w:p>
     <w:p>
@@ -1988,28 +1988,14 @@
           <w:b/>
           <w:color w:val="000000"/>
         </w:rPr>
-        <w:t>CVE-2017-0146 (RCE):</w:t>
-      </w:r>
-      <w:r>
-        <w:rPr>
-          <w:rFonts w:ascii="Times New Roman" w:hAnsi="Times New Roman"/>
-          <w:color w:val="000000"/>
-        </w:rPr>
-        <w:t xml:space="preserve"> Lỗ hổng thực thi mã từ xa do xử lý con trỏ và đối tượng bộ nhớ không an toàn trong driver </w:t>
-      </w:r>
-      <w:r>
-        <w:rPr>
-          <w:rFonts w:ascii="Times New Roman" w:hAnsi="Times New Roman"/>
-          <w:color w:val="000000"/>
-        </w:rPr>
-        <w:t>srv.sys</w:t>
-      </w:r>
-      <w:r>
-        <w:rPr>
-          <w:rFonts w:ascii="Times New Roman" w:hAnsi="Times New Roman"/>
-          <w:color w:val="000000"/>
-        </w:rPr>
-        <w:t>.</w:t>
+        <w:t>CVE-2017-0146:</w:t>
+      </w:r>
+      <w:r>
+        <w:rPr>
+          <w:rFonts w:ascii="Times New Roman" w:hAnsi="Times New Roman"/>
+          <w:color w:val="000000"/>
+        </w:rPr>
+        <w:t xml:space="preserve"> Lỗ hổng thực thi mã từ xa (Remote Code Execution - RCE) trong thành phần SMBv1 Server.</w:t>
       </w:r>
     </w:p>
     <w:p>
@@ -2031,14 +2017,14 @@
           <w:b/>
           <w:color w:val="000000"/>
         </w:rPr>
-        <w:t>CVE-2017-0147 (Information Disclosure):</w:t>
-      </w:r>
-      <w:r>
-        <w:rPr>
-          <w:rFonts w:ascii="Times New Roman" w:hAnsi="Times New Roman"/>
-          <w:color w:val="000000"/>
-        </w:rPr>
-        <w:t xml:space="preserve"> Lỗ hổng tiết lộ thông tin từ bộ nhớ nhân về phía client thông qua các gói tin phản hồi SMBv1 không được xóa trắng dữ liệu.</w:t>
+        <w:t>CVE-2017-0147:</w:t>
+      </w:r>
+      <w:r>
+        <w:rPr>
+          <w:rFonts w:ascii="Times New Roman" w:hAnsi="Times New Roman"/>
+          <w:color w:val="000000"/>
+        </w:rPr>
+        <w:t xml:space="preserve"> Lỗ hổng tiết lộ thông tin (Information Disclosure) cho phép rò rỉ dữ liệu từ bộ nhớ phía máy chủ.</w:t>
       </w:r>
     </w:p>
     <w:p>
@@ -2060,14 +2046,14 @@
           <w:b/>
           <w:color w:val="000000"/>
         </w:rPr>
-        <w:t>CVE-2017-0148 (RCE):</w:t>
-      </w:r>
-      <w:r>
-        <w:rPr>
-          <w:rFonts w:ascii="Times New Roman" w:hAnsi="Times New Roman"/>
-          <w:color w:val="000000"/>
-        </w:rPr>
-        <w:t xml:space="preserve"> Lỗ hổng thực thi mã từ xa do lỗi kiểm tra hợp lệ trong quá trình xử lý các gói tin giao dịch liên tiếp.</w:t>
+        <w:t>CVE-2017-0148:</w:t>
+      </w:r>
+      <w:r>
+        <w:rPr>
+          <w:rFonts w:ascii="Times New Roman" w:hAnsi="Times New Roman"/>
+          <w:color w:val="000000"/>
+        </w:rPr>
+        <w:t xml:space="preserve"> Lỗ hổng thực thi mã từ xa (Remote Code Execution - RCE) trong thành phần SMBv1 Server.</w:t>
       </w:r>
     </w:p>
     <w:p>
@@ -2077,7 +2063,7 @@
           <w:rFonts w:ascii="Times New Roman" w:hAnsi="Times New Roman"/>
           <w:color w:val="000000"/>
         </w:rPr>
-        <w:t>Việc phân định các mã CVE cho thấy MS17-010 là một tập hợp lỗi với cơ chế khác nhau. Trong số này, CVE-2017-0144 là đối tượng trung tâm được nhóm em phân tích và kiểm chứng trong đồ án do đặc tính không đòi hỏi xác thực tài khoản và mức độ tác động trực tiếp đến dịch vụ SMBv1.</w:t>
+        <w:t>Sự phân định này cho thấy bản tin MS17-010 bao gồm năm lỗ hổng thực thi mã từ xa và một lỗ hổng tiết lộ thông tin với các điều kiện kỹ thuật khác nhau, không phải là một lỗi đơn nhất. Trong danh mục trên, đồ án lựa chọn CVE-2017-0144 làm đối tượng phân tích trọng tâm để nghiên cứu sâu về cơ chế quản lý bộ nhớ và điều kiện tác động trong môi trường lab.</w:t>
       </w:r>
     </w:p>
     <w:p>
@@ -2099,7 +2085,7 @@
           <w:rFonts w:ascii="Times New Roman" w:hAnsi="Times New Roman"/>
           <w:color w:val="000000"/>
         </w:rPr>
-        <w:t xml:space="preserve">Lỗ hổng CVE-2017-0144 liên quan đến quá trình driver </w:t>
+        <w:t xml:space="preserve">Lỗ hổng CVE-2017-0144 phát sinh trong quá trình trình điều khiển </w:t>
       </w:r>
       <w:r>
         <w:rPr>
@@ -2113,10 +2099,52 @@
           <w:rFonts w:ascii="Times New Roman" w:hAnsi="Times New Roman"/>
           <w:color w:val="000000"/>
         </w:rPr>
-        <w:t xml:space="preserve"> xử lý các thuộc tính tệp mở rộng (Full Extended Attributes - FEA) được gửi qua các gói tin giao dịch của SMBv1. Cấu trúc FEA vốn được duy trì để bảo đảm khả năng tương thích ngược với hệ thống tệp cũ.</w:t>
+        <w:t xml:space="preserve"> của Windows tiếp nhận và xử lý cấu trúc danh sách thuộc tính tệp mở rộng (Full Extended Attributes - FEA) được gửi qua các gói tin giao dịch của SMBv1.</w:t>
       </w:r>
     </w:p>
     <w:p>
+      <w:pPr/>
+      <w:r>
+        <w:rPr>
+          <w:rFonts w:ascii="Times New Roman" w:hAnsi="Times New Roman"/>
+          <w:color w:val="000000"/>
+        </w:rPr>
+        <w:t>Về mặt nguyên lý, khi nhận yêu cầu chứa danh sách FEA từ trạm khách, trình điều khiển phía máy chủ phải thực hiện chuyển đổi định dạng dữ liệu sang cấu trúc bộ nhớ nội bộ của hệ điều hành. Quá trình này bao gồm khâu tính toán dung lượng bộ nhớ cần thiết, sau đó cấp phát vùng đệm trong bộ nhớ nhân (Kernel Pool) và sao chép các phần tử dữ liệu vào vùng đệm tương ứng.</w:t>
+      </w:r>
+    </w:p>
+    <w:p>
+      <w:pPr/>
+      <w:r>
+        <w:rPr>
+          <w:rFonts w:ascii="Times New Roman" w:hAnsi="Times New Roman"/>
+          <w:color w:val="000000"/>
+        </w:rPr>
+        <w:t>Lỗi an ninh xuất hiện từ sự sai lệch trong việc kiểm soát và chuyển đổi kích thước dữ liệu: dung lượng bộ nhớ được tính toán và cấp phát ban đầu nhỏ hơn lượng dữ liệu thực tế cần sao chép. Hậu quả là thao tác ghi dữ liệu vượt ra ngoài phạm vi ranh giới của vùng đệm đã cấp phát trong không gian nhân (Kernel Pool Overflow).</w:t>
+      </w:r>
+    </w:p>
+    <w:p>
+      <w:pPr/>
+      <w:r>
+        <w:rPr>
+          <w:rFonts w:ascii="Times New Roman" w:hAnsi="Times New Roman"/>
+          <w:color w:val="000000"/>
+        </w:rPr>
+        <w:t>Do sự cố xảy ra trực tiếp trong không gian nhân của hệ điều hành, việc ghi vượt biên bộ nhớ này có thể làm hư hại cấu trúc dữ liệu liền kề, dẫn đến tình trạng mất ổn định hoặc phát sinh lỗi dừng hệ thống. Trong điều kiện kiểm thử phù hợp, sự sai lệch bố cục bộ nhớ này có thể bị lợi dụng để tạo tiền đề cho việc thực thi mã lệnh từ xa.</w:t>
+      </w:r>
+    </w:p>
+    <w:p>
+      <w:pPr>
+        <w:pStyle w:val="Heading3"/>
+      </w:pPr>
+      <w:r>
+        <w:rPr>
+          <w:rFonts w:ascii="Times New Roman" w:hAnsi="Times New Roman"/>
+          <w:color w:val="000000"/>
+        </w:rPr>
+        <w:t>1.2.4. Điều kiện ảnh hưởng và điều kiện khai thác</w:t>
+      </w:r>
+    </w:p>
+    <w:p>
       <w:pPr>
         <w:keepNext/>
       </w:pPr>
@@ -2125,21 +2153,18 @@
           <w:rFonts w:ascii="Times New Roman" w:hAnsi="Times New Roman"/>
           <w:color w:val="000000"/>
         </w:rPr>
-        <w:t xml:space="preserve">Khi client gửi yêu cầu chứa danh sách các thuộc tính FEA, </w:t>
-      </w:r>
-      <w:r>
-        <w:rPr>
-          <w:rFonts w:ascii="Times New Roman" w:hAnsi="Times New Roman"/>
-          <w:color w:val="000000"/>
-        </w:rPr>
-        <w:t>srv.sys</w:t>
-      </w:r>
-      <w:r>
-        <w:rPr>
-          <w:rFonts w:ascii="Times New Roman" w:hAnsi="Times New Roman"/>
-          <w:color w:val="000000"/>
-        </w:rPr>
-        <w:t xml:space="preserve"> cần chuyển đổi danh sách này sang cấu trúc định dạng nội bộ của Windows NT. Quá trình xử lý bao gồm hai bước chính:</w:t>
+        <w:t>Trong đánh giá an ninh, cần phân định rõ giữa điều kiện để một hệ thống tồn tại lỗ hổng và điều kiện để tác động từ xa có thể xảy ra trên thực tế:</w:t>
+      </w:r>
+    </w:p>
+    <w:p>
+      <w:pPr/>
+      <w:r>
+        <w:rPr>
+          <w:rFonts w:ascii="Times New Roman" w:hAnsi="Times New Roman"/>
+          <w:b/>
+          <w:color w:val="000000"/>
+        </w:rPr>
+        <w:t>Điều kiện hệ thống có thể bị ảnh hưởng:</w:t>
       </w:r>
     </w:p>
     <w:p>
@@ -2160,21 +2185,7 @@
           <w:rFonts w:ascii="Times New Roman" w:hAnsi="Times New Roman"/>
           <w:color w:val="000000"/>
         </w:rPr>
-        <w:t xml:space="preserve">Đầu tiên, hàm </w:t>
-      </w:r>
-      <w:r>
-        <w:rPr>
-          <w:rFonts w:ascii="Times New Roman" w:hAnsi="Times New Roman"/>
-          <w:color w:val="000000"/>
-        </w:rPr>
-        <w:t>SrvOs2FeaListSizeToNt</w:t>
-      </w:r>
-      <w:r>
-        <w:rPr>
-          <w:rFonts w:ascii="Times New Roman" w:hAnsi="Times New Roman"/>
-          <w:color w:val="000000"/>
-        </w:rPr>
-        <w:t xml:space="preserve"> duyệt qua danh sách để tính toán tổng dung lượng bộ nhớ cần cấp phát trong bộ nhớ nhân (Kernel Pool).</w:t>
+        <w:t>Hệ điều hành thuộc danh mục các phiên bản Windows chịu tác động của bản tin MS17-010.</w:t>
       </w:r>
     </w:p>
     <w:p>
@@ -2195,21 +2206,42 @@
           <w:rFonts w:ascii="Times New Roman" w:hAnsi="Times New Roman"/>
           <w:color w:val="000000"/>
         </w:rPr>
-        <w:t xml:space="preserve">Sau đó, hệ thống cấp phát vùng đệm và hàm </w:t>
-      </w:r>
-      <w:r>
-        <w:rPr>
-          <w:rFonts w:ascii="Times New Roman" w:hAnsi="Times New Roman"/>
-          <w:color w:val="000000"/>
-        </w:rPr>
-        <w:t>SrvOs2FeaToNt</w:t>
-      </w:r>
-      <w:r>
-        <w:rPr>
-          <w:rFonts w:ascii="Times New Roman" w:hAnsi="Times New Roman"/>
-          <w:color w:val="000000"/>
-        </w:rPr>
-        <w:t xml:space="preserve"> tiến hành sao chép các phần tử dữ liệu vào vùng đệm đã tạo.</w:t>
+        <w:t xml:space="preserve">Dịch vụ SMBv1 đang được kích hoạt và driver </w:t>
+      </w:r>
+      <w:r>
+        <w:rPr>
+          <w:rFonts w:ascii="Times New Roman" w:hAnsi="Times New Roman"/>
+          <w:color w:val="000000"/>
+        </w:rPr>
+        <w:t>srv.sys</w:t>
+      </w:r>
+      <w:r>
+        <w:rPr>
+          <w:rFonts w:ascii="Times New Roman" w:hAnsi="Times New Roman"/>
+          <w:color w:val="000000"/>
+        </w:rPr>
+        <w:t xml:space="preserve"> đang hoạt động để tiếp nhận yêu cầu mạng.</w:t>
+      </w:r>
+    </w:p>
+    <w:p>
+      <w:pPr>
+        <w:spacing w:before="0" w:after="60"/>
+        <w:ind w:left="709" w:hanging="283"/>
+        <w:jc w:val="both"/>
+      </w:pPr>
+      <w:r>
+        <w:rPr>
+          <w:rFonts w:ascii="Times New Roman" w:hAnsi="Times New Roman"/>
+          <w:color w:val="000000"/>
+        </w:rPr>
+        <w:t xml:space="preserve">• </w:t>
+      </w:r>
+      <w:r>
+        <w:rPr>
+          <w:rFonts w:ascii="Times New Roman" w:hAnsi="Times New Roman"/>
+          <w:color w:val="000000"/>
+        </w:rPr>
+        <w:t>Bản cập nhật an ninh MS17-010 tương ứng chưa được cài đặt trên hệ thống.</w:t>
       </w:r>
     </w:p>
     <w:p>
@@ -2217,9 +2249,141 @@
       <w:r>
         <w:rPr>
           <w:rFonts w:ascii="Times New Roman" w:hAnsi="Times New Roman"/>
-          <w:color w:val="000000"/>
-        </w:rPr>
-        <w:t>Vấn đề phát sinh do sai lệch trong khâu kiểm soát và chuyển đổi kích thước dữ liệu: giá trị kích thước được tính toán ở bước đầu bị thiếu hụt so với lượng dữ liệu thực tế được ghi ở bước sau. Hậu quả là hệ điều hành chỉ chuẩn bị một vùng đệm nhỏ hơn nhu cầu, khiến quá trình sao chép ghi dữ liệu vượt ra ngoài phạm vi vùng nhớ dự kiến trong kernel pool (Kernel Pool Overflow).</w:t>
+          <w:b/>
+          <w:color w:val="000000"/>
+        </w:rPr>
+        <w:t>Điều kiện để tác động từ xa có thể xảy ra:</w:t>
+      </w:r>
+    </w:p>
+    <w:p>
+      <w:pPr>
+        <w:spacing w:before="0" w:after="60"/>
+        <w:ind w:left="709" w:hanging="283"/>
+        <w:jc w:val="both"/>
+      </w:pPr>
+      <w:r>
+        <w:rPr>
+          <w:rFonts w:ascii="Times New Roman" w:hAnsi="Times New Roman"/>
+          <w:color w:val="000000"/>
+        </w:rPr>
+        <w:t xml:space="preserve">• </w:t>
+      </w:r>
+      <w:r>
+        <w:rPr>
+          <w:rFonts w:ascii="Times New Roman" w:hAnsi="Times New Roman"/>
+          <w:color w:val="000000"/>
+        </w:rPr>
+        <w:t>Trạm kiểm thử có đường truyền mạng thông suốt đến cổng dịch vụ SMB (TCP 445 hoặc TCP 139) của máy chủ mục tiêu.</w:t>
+      </w:r>
+    </w:p>
+    <w:p>
+      <w:pPr>
+        <w:spacing w:before="0" w:after="60"/>
+        <w:ind w:left="709" w:hanging="283"/>
+        <w:jc w:val="both"/>
+      </w:pPr>
+      <w:r>
+        <w:rPr>
+          <w:rFonts w:ascii="Times New Roman" w:hAnsi="Times New Roman"/>
+          <w:color w:val="000000"/>
+        </w:rPr>
+        <w:t xml:space="preserve">• </w:t>
+      </w:r>
+      <w:r>
+        <w:rPr>
+          <w:rFonts w:ascii="Times New Roman" w:hAnsi="Times New Roman"/>
+          <w:color w:val="000000"/>
+        </w:rPr>
+        <w:t>Các luồng giao tiếp SMB cần thiết không bị tường lửa mạng hoặc tường lửa cục bộ ngăn chặn.</w:t>
+      </w:r>
+    </w:p>
+    <w:p>
+      <w:pPr>
+        <w:spacing w:before="0" w:after="60"/>
+        <w:ind w:left="709" w:hanging="283"/>
+        <w:jc w:val="both"/>
+      </w:pPr>
+      <w:r>
+        <w:rPr>
+          <w:rFonts w:ascii="Times New Roman" w:hAnsi="Times New Roman"/>
+          <w:color w:val="000000"/>
+        </w:rPr>
+        <w:t xml:space="preserve">• </w:t>
+      </w:r>
+      <w:r>
+        <w:rPr>
+          <w:rFonts w:ascii="Times New Roman" w:hAnsi="Times New Roman"/>
+          <w:color w:val="000000"/>
+        </w:rPr>
+        <w:t>Phiên bản hệ điều hành, cấu trúc dịch vụ và trạng thái bộ nhớ của mục tiêu tương thích với kỹ thuật can thiệp được sử dụng.</w:t>
+      </w:r>
+    </w:p>
+    <w:p>
+      <w:pPr>
+        <w:keepNext/>
+      </w:pPr>
+      <w:r>
+        <w:rPr>
+          <w:rFonts w:ascii="Times New Roman" w:hAnsi="Times New Roman"/>
+          <w:color w:val="000000"/>
+        </w:rPr>
+        <w:t>Sự phân định này chỉ ra rằng trạng thái mở cổng TCP 445 chỉ là điều kiện tiếp cận ban đầu ở tầng giao vận:</w:t>
+      </w:r>
+    </w:p>
+    <w:p>
+      <w:pPr>
+        <w:spacing w:before="0" w:after="60"/>
+        <w:ind w:left="709" w:hanging="283"/>
+        <w:jc w:val="both"/>
+      </w:pPr>
+      <w:r>
+        <w:rPr>
+          <w:rFonts w:ascii="Times New Roman" w:hAnsi="Times New Roman"/>
+          <w:color w:val="000000"/>
+        </w:rPr>
+        <w:t xml:space="preserve">• </w:t>
+      </w:r>
+      <w:r>
+        <w:rPr>
+          <w:rFonts w:ascii="Times New Roman" w:hAnsi="Times New Roman"/>
+          <w:color w:val="000000"/>
+        </w:rPr>
+        <w:t xml:space="preserve">Một máy chủ mở cổng 445 và hỗ trợ SMBv1 nhưng đã được cập nhật bản vá thì lỗi xử lý dữ liệu trong </w:t>
+      </w:r>
+      <w:r>
+        <w:rPr>
+          <w:rFonts w:ascii="Times New Roman" w:hAnsi="Times New Roman"/>
+          <w:color w:val="000000"/>
+        </w:rPr>
+        <w:t>srv.sys</w:t>
+      </w:r>
+      <w:r>
+        <w:rPr>
+          <w:rFonts w:ascii="Times New Roman" w:hAnsi="Times New Roman"/>
+          <w:color w:val="000000"/>
+        </w:rPr>
+        <w:t xml:space="preserve"> đã được khắc phục.</w:t>
+      </w:r>
+    </w:p>
+    <w:p>
+      <w:pPr>
+        <w:spacing w:before="0" w:after="60"/>
+        <w:ind w:left="709" w:hanging="283"/>
+        <w:jc w:val="both"/>
+      </w:pPr>
+      <w:r>
+        <w:rPr>
+          <w:rFonts w:ascii="Times New Roman" w:hAnsi="Times New Roman"/>
+          <w:color w:val="000000"/>
+        </w:rPr>
+        <w:t xml:space="preserve">• </w:t>
+      </w:r>
+      <w:r>
+        <w:rPr>
+          <w:rFonts w:ascii="Times New Roman" w:hAnsi="Times New Roman"/>
+          <w:color w:val="000000"/>
+        </w:rPr>
+        <w:t>Ngược lại, một máy chủ tồn tại lỗ hổng nhưng đặt sau tường lửa chặn truy cập SMB từ bên ngoài thì tác động từ xa không thể thực hiện được qua ranh giới mạng đó.</w:t>
       </w:r>
     </w:p>
     <w:p>
@@ -2229,7 +2393,7 @@
           <w:rFonts w:ascii="Times New Roman" w:hAnsi="Times New Roman"/>
           <w:color w:val="000000"/>
         </w:rPr>
-        <w:t>Lỗi xảy ra trực tiếp trong không gian nhân của hệ điều hành, khiến việc vùng nhớ bị ghi đè có thể dẫn đến tình trạng mất ổn định và phát sinh lỗi dừng (BSOD). Ngoài ra, các mã khai thác như EternalBlue có thể lợi dụng sự sai lệch bố cục bộ nhớ này để thực thi mã lệnh tùy ý với đặc quyền hệ thống cao nhất.</w:t>
+        <w:t>Như vậy, mở cổng mạng không đồng nghĩa với việc hỗ trợ SMBv1, hỗ trợ SMBv1 không đồng nghĩa với hệ thống chưa vá, và sự tồn tại của lỗ hổng cũng không bảo đảm việc can thiệp khai thác sẽ thành công.</w:t>
       </w:r>
     </w:p>
     <w:p>
@@ -2241,7 +2405,7 @@
           <w:rFonts w:ascii="Times New Roman" w:hAnsi="Times New Roman"/>
           <w:color w:val="000000"/>
         </w:rPr>
-        <w:t>1.2.4. Điều kiện ảnh hưởng và điều kiện khai thác</w:t>
+        <w:t>1.2.5. Tác động của lỗ hổng</w:t>
       </w:r>
     </w:p>
     <w:p>
@@ -2253,7 +2417,94 @@
           <w:rFonts w:ascii="Times New Roman" w:hAnsi="Times New Roman"/>
           <w:color w:val="000000"/>
         </w:rPr>
-        <w:t>Trong đánh giá an ninh, cần phân định rõ giữa điều kiện để một hệ thống tồn tại lỗ hổng và điều kiện để tác động từ xa có thể xảy ra trên thực tế:</w:t>
+        <w:t>Tác động của lỗ hổng CVE-2017-0144 thuộc nhóm MS17-010 được xem xét qua ba mục tiêu an toàn thông tin cơ bản:</w:t>
+      </w:r>
+    </w:p>
+    <w:p>
+      <w:pPr>
+        <w:spacing w:before="0" w:after="60"/>
+        <w:ind w:left="709" w:hanging="283"/>
+        <w:jc w:val="both"/>
+      </w:pPr>
+      <w:r>
+        <w:rPr>
+          <w:rFonts w:ascii="Times New Roman" w:hAnsi="Times New Roman"/>
+          <w:color w:val="000000"/>
+        </w:rPr>
+        <w:t xml:space="preserve">• </w:t>
+      </w:r>
+      <w:r>
+        <w:rPr>
+          <w:rFonts w:ascii="Times New Roman" w:hAnsi="Times New Roman"/>
+          <w:b/>
+          <w:color w:val="000000"/>
+        </w:rPr>
+        <w:t>Tính bảo mật (Confidentiality):</w:t>
+      </w:r>
+      <w:r>
+        <w:rPr>
+          <w:rFonts w:ascii="Times New Roman" w:hAnsi="Times New Roman"/>
+          <w:color w:val="000000"/>
+        </w:rPr>
+        <w:t xml:space="preserve"> Nếu kỹ thuật can thiệp đạt được quyền thực thi mã ở mức đặc quyền cao, dữ liệu lưu trữ trên máy chủ, thông tin cấu hình và các phiên giao tiếp đều đứng trước nguy cơ bị truy cập trái phép.</w:t>
+      </w:r>
+    </w:p>
+    <w:p>
+      <w:pPr>
+        <w:spacing w:before="0" w:after="60"/>
+        <w:ind w:left="709" w:hanging="283"/>
+        <w:jc w:val="both"/>
+      </w:pPr>
+      <w:r>
+        <w:rPr>
+          <w:rFonts w:ascii="Times New Roman" w:hAnsi="Times New Roman"/>
+          <w:color w:val="000000"/>
+        </w:rPr>
+        <w:t xml:space="preserve">• </w:t>
+      </w:r>
+      <w:r>
+        <w:rPr>
+          <w:rFonts w:ascii="Times New Roman" w:hAnsi="Times New Roman"/>
+          <w:b/>
+          <w:color w:val="000000"/>
+        </w:rPr>
+        <w:t>Tính toàn vẹn (Integrity):</w:t>
+      </w:r>
+      <w:r>
+        <w:rPr>
+          <w:rFonts w:ascii="Times New Roman" w:hAnsi="Times New Roman"/>
+          <w:color w:val="000000"/>
+        </w:rPr>
+        <w:t xml:space="preserve"> Trong phạm vi quyền hạn đạt được, dữ liệu hoặc cấu hình dịch vụ trên hệ thống có thể bị chỉnh sửa hoặc can thiệp trái phép.</w:t>
+      </w:r>
+    </w:p>
+    <w:p>
+      <w:pPr>
+        <w:spacing w:before="0" w:after="60"/>
+        <w:ind w:left="709" w:hanging="283"/>
+        <w:jc w:val="both"/>
+      </w:pPr>
+      <w:r>
+        <w:rPr>
+          <w:rFonts w:ascii="Times New Roman" w:hAnsi="Times New Roman"/>
+          <w:color w:val="000000"/>
+        </w:rPr>
+        <w:t xml:space="preserve">• </w:t>
+      </w:r>
+      <w:r>
+        <w:rPr>
+          <w:rFonts w:ascii="Times New Roman" w:hAnsi="Times New Roman"/>
+          <w:b/>
+          <w:color w:val="000000"/>
+        </w:rPr>
+        <w:t>Tính sẵn sàng (Availability):</w:t>
+      </w:r>
+      <w:r>
+        <w:rPr>
+          <w:rFonts w:ascii="Times New Roman" w:hAnsi="Times New Roman"/>
+          <w:color w:val="000000"/>
+        </w:rPr>
+        <w:t xml:space="preserve"> Do tác động vào không gian nhân, việc xử lý dữ liệu bất thường hoặc thao tác bộ nhớ không tương thích có thể gây mất ổn định hoặc lỗi dừng hệ thống. Ngoài ra, việc dịch vụ SMB ngừng phản hồi cũng làm gián đoạn khả năng chia sẻ tài nguyên mạng.</w:t>
       </w:r>
     </w:p>
     <w:p>
@@ -2261,10 +2512,33 @@
       <w:r>
         <w:rPr>
           <w:rFonts w:ascii="Times New Roman" w:hAnsi="Times New Roman"/>
-          <w:b/>
-          <w:color w:val="000000"/>
-        </w:rPr>
-        <w:t>Điều kiện hệ thống có thể bị ảnh hưởng:</w:t>
+          <w:color w:val="000000"/>
+        </w:rPr>
+        <w:t>Khác với các lỗi đòi hỏi sự tương tác của người dùng, yêu cầu khai thác lỗ hổng này có thể truyền tải trực tiếp qua gói tin mạng, khiến nguy cơ ảnh hưởng diện rộng trở nên rõ rệt nếu dịch vụ SMBv1 được mở ra môi trường không tin cậy.</w:t>
+      </w:r>
+    </w:p>
+    <w:p>
+      <w:pPr>
+        <w:pStyle w:val="Heading3"/>
+      </w:pPr>
+      <w:r>
+        <w:rPr>
+          <w:rFonts w:ascii="Times New Roman" w:hAnsi="Times New Roman"/>
+          <w:color w:val="000000"/>
+        </w:rPr>
+        <w:t>1.2.6. Mối liên hệ với các cuộc tấn công thực tế</w:t>
+      </w:r>
+    </w:p>
+    <w:p>
+      <w:pPr>
+        <w:keepNext/>
+      </w:pPr>
+      <w:r>
+        <w:rPr>
+          <w:rFonts w:ascii="Times New Roman" w:hAnsi="Times New Roman"/>
+          <w:color w:val="000000"/>
+        </w:rPr>
+        <w:t>Tác động thực tế của nhóm lỗ hổng MS17-010 đã được minh họa qua các sự cố an ninh mạng diện rộng trong năm 2017:</w:t>
       </w:r>
     </w:p>
     <w:p>
@@ -2283,9 +2557,17 @@
       <w:r>
         <w:rPr>
           <w:rFonts w:ascii="Times New Roman" w:hAnsi="Times New Roman"/>
-          <w:color w:val="000000"/>
-        </w:rPr>
-        <w:t>Hệ điều hành thuộc danh mục các phiên bản Windows chịu tác động của bản tin MS17-010.</w:t>
+          <w:b/>
+          <w:color w:val="000000"/>
+        </w:rPr>
+        <w:t>Chiến dịch mã độc WannaCry (Tháng 05/2017):</w:t>
+      </w:r>
+      <w:r>
+        <w:rPr>
+          <w:rFonts w:ascii="Times New Roman" w:hAnsi="Times New Roman"/>
+          <w:color w:val="000000"/>
+        </w:rPr>
+        <w:t xml:space="preserve"> Khai thác lỗ hổng SMBv1 chưa vá để tự động lây nhiễm qua cổng TCP 445 trong mạng nội bộ và trên Internet nhằm phát tán mã độc tống tiền.</w:t>
       </w:r>
     </w:p>
     <w:p>
@@ -2304,23 +2586,105 @@
       <w:r>
         <w:rPr>
           <w:rFonts w:ascii="Times New Roman" w:hAnsi="Times New Roman"/>
-          <w:color w:val="000000"/>
-        </w:rPr>
-        <w:t xml:space="preserve">Dịch vụ SMBv1 đang được kích hoạt và driver </w:t>
-      </w:r>
-      <w:r>
-        <w:rPr>
-          <w:rFonts w:ascii="Times New Roman" w:hAnsi="Times New Roman"/>
-          <w:color w:val="000000"/>
-        </w:rPr>
-        <w:t>srv.sys</w:t>
-      </w:r>
-      <w:r>
-        <w:rPr>
-          <w:rFonts w:ascii="Times New Roman" w:hAnsi="Times New Roman"/>
-          <w:color w:val="000000"/>
-        </w:rPr>
-        <w:t xml:space="preserve"> đang hoạt động để tiếp nhận yêu cầu mạng.</w:t>
+          <w:b/>
+          <w:color w:val="000000"/>
+        </w:rPr>
+        <w:t>Chiến dịch mã độc NotPetya (Tháng 06/2017):</w:t>
+      </w:r>
+      <w:r>
+        <w:rPr>
+          <w:rFonts w:ascii="Times New Roman" w:hAnsi="Times New Roman"/>
+          <w:color w:val="000000"/>
+        </w:rPr>
+        <w:t xml:space="preserve"> Tận dụng kỹ thuật can thiệp vào SMBv1 để lây lan nhanh chóng giữa các máy tính trong cùng hạ tầng mạng doanh nghiệp, gây gián đoạn nghiêm trọng hoạt động của nhiều tổ chức.</w:t>
+      </w:r>
+    </w:p>
+    <w:p>
+      <w:pPr/>
+      <w:r>
+        <w:rPr>
+          <w:rFonts w:ascii="Times New Roman" w:hAnsi="Times New Roman"/>
+          <w:color w:val="000000"/>
+        </w:rPr>
+        <w:t>Các sự cố này minh chứng rằng việc duy trì dịch vụ SMBv1 chưa được cập nhật bản vá an ninh có thể dẫn đến nguy cơ mất an toàn nghiêm trọng cho toàn bộ hệ thống mạng. Thực tế đó khẳng định tính cần thiết của việc xây dựng phương pháp kiểm thử, đo đạc và phân loại trạng thái an ninh của dịch vụ SMB một cách có kiểm soát.</w:t>
+      </w:r>
+    </w:p>
+    <w:p>
+      <w:pPr>
+        <w:pStyle w:val="Heading2"/>
+      </w:pPr>
+      <w:r>
+        <w:rPr>
+          <w:rFonts w:ascii="Times New Roman" w:hAnsi="Times New Roman"/>
+          <w:color w:val="000000"/>
+        </w:rPr>
+        <w:t>1.3. Công cụ phục vụ kiểm thử</w:t>
+      </w:r>
+    </w:p>
+    <w:p>
+      <w:pPr>
+        <w:pStyle w:val="Heading3"/>
+      </w:pPr>
+      <w:r>
+        <w:rPr>
+          <w:rFonts w:ascii="Times New Roman" w:hAnsi="Times New Roman"/>
+          <w:color w:val="000000"/>
+        </w:rPr>
+        <w:t>1.3.1. Kali Linux</w:t>
+      </w:r>
+    </w:p>
+    <w:p>
+      <w:pPr/>
+      <w:r>
+        <w:rPr>
+          <w:rFonts w:ascii="Times New Roman" w:hAnsi="Times New Roman"/>
+          <w:color w:val="000000"/>
+        </w:rPr>
+        <w:t>Trong đồ án này, Kali Linux được sử dụng làm trạm kiểm thử (Testing Workstation) chuyên dụng. Hệ điều hành cung cấp môi trường tập trung với các tiện ích mạng, thư viện và công cụ kiểm định an ninh để tương tác với máy chủ Windows mục tiêu.</w:t>
+      </w:r>
+    </w:p>
+    <w:p>
+      <w:pPr/>
+      <w:r>
+        <w:rPr>
+          <w:rFonts w:ascii="Times New Roman" w:hAnsi="Times New Roman"/>
+          <w:color w:val="000000"/>
+        </w:rPr>
+        <w:t>Vai trò của trạm kiểm thử là khởi tạo các yêu cầu thăm dò, quản lý cấu hình kết nối mạng và ghi nhận nhật ký của quá trình đánh giá. Bản thân Kali Linux chỉ đóng vai trò nền tảng điều khiển; sự hiện diện của trạm kiểm thử không phải là bằng chứng về trạng thái an ninh hay lỗ hổng của máy chủ mục tiêu.</w:t>
+      </w:r>
+    </w:p>
+    <w:p>
+      <w:pPr>
+        <w:pStyle w:val="Heading3"/>
+      </w:pPr>
+      <w:r>
+        <w:rPr>
+          <w:rFonts w:ascii="Times New Roman" w:hAnsi="Times New Roman"/>
+          <w:color w:val="000000"/>
+        </w:rPr>
+        <w:t>1.3.2. Nmap</w:t>
+      </w:r>
+    </w:p>
+    <w:p>
+      <w:pPr/>
+      <w:r>
+        <w:rPr>
+          <w:rFonts w:ascii="Times New Roman" w:hAnsi="Times New Roman"/>
+          <w:color w:val="000000"/>
+        </w:rPr>
+        <w:t>Nmap (Network Mapper) được sử dụng ở bước sàng lọc ban đầu nhằm kiểm tra khả năng tiếp cận dịch vụ qua hai cổng mạng TCP 139 và TCP 445.</w:t>
+      </w:r>
+    </w:p>
+    <w:p>
+      <w:pPr>
+        <w:keepNext/>
+      </w:pPr>
+      <w:r>
+        <w:rPr>
+          <w:rFonts w:ascii="Times New Roman" w:hAnsi="Times New Roman"/>
+          <w:color w:val="000000"/>
+        </w:rPr>
+        <w:t>Dữ liệu do Nmap cung cấp phản ánh trạng thái cổng ở tầng giao vận:</w:t>
       </w:r>
     </w:p>
     <w:p>
@@ -2341,7 +2705,70 @@
           <w:rFonts w:ascii="Times New Roman" w:hAnsi="Times New Roman"/>
           <w:color w:val="000000"/>
         </w:rPr>
-        <w:t>Bản cập nhật an ninh MS17-010 tương ứng chưa được cài đặt trên hệ thống.</w:t>
+        <w:t>Open</w:t>
+      </w:r>
+      <w:r>
+        <w:rPr>
+          <w:rFonts w:ascii="Times New Roman" w:hAnsi="Times New Roman"/>
+          <w:color w:val="000000"/>
+        </w:rPr>
+        <w:t>: Cổng mạng có tiến trình lắng nghe và tiếp nhận kết nối TCP (phản hồi gói tin TCP SYN-ACK trước yêu cầu SYN từ trạm kiểm thử).</w:t>
+      </w:r>
+    </w:p>
+    <w:p>
+      <w:pPr>
+        <w:spacing w:before="0" w:after="60"/>
+        <w:ind w:left="709" w:hanging="283"/>
+        <w:jc w:val="both"/>
+      </w:pPr>
+      <w:r>
+        <w:rPr>
+          <w:rFonts w:ascii="Times New Roman" w:hAnsi="Times New Roman"/>
+          <w:color w:val="000000"/>
+        </w:rPr>
+        <w:t xml:space="preserve">• </w:t>
+      </w:r>
+      <w:r>
+        <w:rPr>
+          <w:rFonts w:ascii="Times New Roman" w:hAnsi="Times New Roman"/>
+          <w:color w:val="000000"/>
+        </w:rPr>
+        <w:t>Closed</w:t>
+      </w:r>
+      <w:r>
+        <w:rPr>
+          <w:rFonts w:ascii="Times New Roman" w:hAnsi="Times New Roman"/>
+          <w:color w:val="000000"/>
+        </w:rPr>
+        <w:t>: Cổng mạng phản hồi gói tin RST, cho thấy không có dịch vụ lắng nghe tiếp nhận kết nối.</w:t>
+      </w:r>
+    </w:p>
+    <w:p>
+      <w:pPr>
+        <w:spacing w:before="0" w:after="60"/>
+        <w:ind w:left="709" w:hanging="283"/>
+        <w:jc w:val="both"/>
+      </w:pPr>
+      <w:r>
+        <w:rPr>
+          <w:rFonts w:ascii="Times New Roman" w:hAnsi="Times New Roman"/>
+          <w:color w:val="000000"/>
+        </w:rPr>
+        <w:t xml:space="preserve">• </w:t>
+      </w:r>
+      <w:r>
+        <w:rPr>
+          <w:rFonts w:ascii="Times New Roman" w:hAnsi="Times New Roman"/>
+          <w:color w:val="000000"/>
+        </w:rPr>
+        <w:t>Filtered</w:t>
+      </w:r>
+      <w:r>
+        <w:rPr>
+          <w:rFonts w:ascii="Times New Roman" w:hAnsi="Times New Roman"/>
+          <w:color w:val="000000"/>
+        </w:rPr>
+        <w:t>: Gói tin thăm dò không nhận được phản hồi hoặc bị lọc bởi chính sách mạng/tường lửa.</w:t>
       </w:r>
     </w:p>
     <w:p>
@@ -2349,10 +2776,89 @@
       <w:r>
         <w:rPr>
           <w:rFonts w:ascii="Times New Roman" w:hAnsi="Times New Roman"/>
-          <w:b/>
-          <w:color w:val="000000"/>
-        </w:rPr>
-        <w:t>Điều kiện để tác động từ xa có thể xảy ra:</w:t>
+          <w:color w:val="000000"/>
+        </w:rPr>
+        <w:t>Tùy chọn nhận diện dịch vụ (</w:t>
+      </w:r>
+      <w:r>
+        <w:rPr>
+          <w:rFonts w:ascii="Times New Roman" w:hAnsi="Times New Roman"/>
+          <w:color w:val="000000"/>
+        </w:rPr>
+        <w:t>-sV</w:t>
+      </w:r>
+      <w:r>
+        <w:rPr>
+          <w:rFonts w:ascii="Times New Roman" w:hAnsi="Times New Roman"/>
+          <w:color w:val="000000"/>
+        </w:rPr>
+        <w:t xml:space="preserve">) của Nmap hỗ trợ ghi nhận tên ứng dụng sơ bộ như </w:t>
+      </w:r>
+      <w:r>
+        <w:rPr>
+          <w:rFonts w:ascii="Times New Roman" w:hAnsi="Times New Roman"/>
+          <w:color w:val="000000"/>
+        </w:rPr>
+        <w:t>microsoft-ds</w:t>
+      </w:r>
+      <w:r>
+        <w:rPr>
+          <w:rFonts w:ascii="Times New Roman" w:hAnsi="Times New Roman"/>
+          <w:color w:val="000000"/>
+        </w:rPr>
+        <w:t xml:space="preserve"> hoặc </w:t>
+      </w:r>
+      <w:r>
+        <w:rPr>
+          <w:rFonts w:ascii="Times New Roman" w:hAnsi="Times New Roman"/>
+          <w:color w:val="000000"/>
+        </w:rPr>
+        <w:t>netbios-ssn</w:t>
+      </w:r>
+      <w:r>
+        <w:rPr>
+          <w:rFonts w:ascii="Times New Roman" w:hAnsi="Times New Roman"/>
+          <w:color w:val="000000"/>
+        </w:rPr>
+        <w:t xml:space="preserve">. Tuy nhiên, kết quả từ Nmap chỉ xác nhận điểm lắng nghe TCP có thể tiếp cận được từ trạm kiểm thử. Trạng thái cổng 445 </w:t>
+      </w:r>
+      <w:r>
+        <w:rPr>
+          <w:rFonts w:ascii="Times New Roman" w:hAnsi="Times New Roman"/>
+          <w:color w:val="000000"/>
+        </w:rPr>
+        <w:t>Open</w:t>
+      </w:r>
+      <w:r>
+        <w:rPr>
+          <w:rFonts w:ascii="Times New Roman" w:hAnsi="Times New Roman"/>
+          <w:color w:val="000000"/>
+        </w:rPr>
+        <w:t xml:space="preserve"> không chứng minh máy chủ hỗ trợ SMBv1, không chứng minh sự tồn tại của lỗ hổng MS17-010 và không đồng nghĩa với việc có thể khai thác được.</w:t>
+      </w:r>
+    </w:p>
+    <w:p>
+      <w:pPr>
+        <w:pStyle w:val="Heading3"/>
+      </w:pPr>
+      <w:r>
+        <w:rPr>
+          <w:rFonts w:ascii="Times New Roman" w:hAnsi="Times New Roman"/>
+          <w:color w:val="000000"/>
+        </w:rPr>
+        <w:t>1.3.3. Nmap Scripting Engine</w:t>
+      </w:r>
+    </w:p>
+    <w:p>
+      <w:pPr>
+        <w:keepNext/>
+      </w:pPr>
+      <w:r>
+        <w:rPr>
+          <w:rFonts w:ascii="Times New Roman" w:hAnsi="Times New Roman"/>
+          <w:color w:val="000000"/>
+        </w:rPr>
+        <w:t>Nmap Scripting Engine (NSE) mở rộng khả năng kiểm tra lên tầng ứng dụng thông qua các kịch bản viết bằng ngôn ngữ Lua. Hai kịch bản chuyên biệt được sử dụng gồm:</w:t>
       </w:r>
     </w:p>
     <w:p>
@@ -2371,9 +2877,45 @@
       <w:r>
         <w:rPr>
           <w:rFonts w:ascii="Times New Roman" w:hAnsi="Times New Roman"/>
-          <w:color w:val="000000"/>
-        </w:rPr>
-        <w:t>Trạm kiểm thử có đường truyền mạng thông suốt đến cổng dịch vụ SMB (TCP 445 hoặc TCP 139) của máy chủ mục tiêu.</w:t>
+          <w:b/>
+          <w:color w:val="000000"/>
+        </w:rPr>
+        <w:t>Kịch bản `smb-protocols.nse`:</w:t>
+      </w:r>
+      <w:r>
+        <w:rPr>
+          <w:rFonts w:ascii="Times New Roman" w:hAnsi="Times New Roman"/>
+          <w:color w:val="000000"/>
+        </w:rPr>
+        <w:t xml:space="preserve"> Gửi yêu cầu thương lượng (</w:t>
+      </w:r>
+      <w:r>
+        <w:rPr>
+          <w:rFonts w:ascii="Times New Roman" w:hAnsi="Times New Roman"/>
+          <w:color w:val="000000"/>
+        </w:rPr>
+        <w:t>Negotiate Protocol Request</w:t>
+      </w:r>
+      <w:r>
+        <w:rPr>
+          <w:rFonts w:ascii="Times New Roman" w:hAnsi="Times New Roman"/>
+          <w:color w:val="000000"/>
+        </w:rPr>
+        <w:t>) chứa danh sách dialect để ghi nhận phản hồi từ máy chủ, cung cấp bằng chứng về việc hệ thống có chấp thuận giao thức SMBv1 (</w:t>
+      </w:r>
+      <w:r>
+        <w:rPr>
+          <w:rFonts w:ascii="Times New Roman" w:hAnsi="Times New Roman"/>
+          <w:color w:val="000000"/>
+        </w:rPr>
+        <w:t>NT LM 0.12</w:t>
+      </w:r>
+      <w:r>
+        <w:rPr>
+          <w:rFonts w:ascii="Times New Roman" w:hAnsi="Times New Roman"/>
+          <w:color w:val="000000"/>
+        </w:rPr>
+        <w:t>) hay không.</w:t>
       </w:r>
     </w:p>
     <w:p>
@@ -2392,9 +2934,29 @@
       <w:r>
         <w:rPr>
           <w:rFonts w:ascii="Times New Roman" w:hAnsi="Times New Roman"/>
-          <w:color w:val="000000"/>
-        </w:rPr>
-        <w:t>Các luồng giao tiếp SMB cần thiết không bị tường lửa mạng hoặc tường lửa cục bộ ngăn chặn.</w:t>
+          <w:b/>
+          <w:color w:val="000000"/>
+        </w:rPr>
+        <w:t>Kịch bản `smb-vuln-ms17-010.nse`:</w:t>
+      </w:r>
+      <w:r>
+        <w:rPr>
+          <w:rFonts w:ascii="Times New Roman" w:hAnsi="Times New Roman"/>
+          <w:color w:val="000000"/>
+        </w:rPr>
+        <w:t xml:space="preserve"> Thăm dò chỉ báo kỹ thuật liên quan đến trạng thái MS17-010 bằng cách gửi gói tin giao dịch kiểm tra logic qua giao diện SMB.</w:t>
+      </w:r>
+    </w:p>
+    <w:p>
+      <w:pPr>
+        <w:keepNext/>
+      </w:pPr>
+      <w:r>
+        <w:rPr>
+          <w:rFonts w:ascii="Times New Roman" w:hAnsi="Times New Roman"/>
+          <w:color w:val="000000"/>
+        </w:rPr>
+        <w:t>Kịch bản đánh giá dựa trên mã trạng thái phản hồi từ máy chủ:</w:t>
       </w:r>
     </w:p>
     <w:p>
@@ -2415,19 +2977,35 @@
           <w:rFonts w:ascii="Times New Roman" w:hAnsi="Times New Roman"/>
           <w:color w:val="000000"/>
         </w:rPr>
-        <w:t>Phiên bản hệ điều hành, cấu trúc dịch vụ và trạng thái bộ nhớ của mục tiêu tương thích với kỹ thuật can thiệp được sử dụng.</w:t>
-      </w:r>
-    </w:p>
-    <w:p>
-      <w:pPr>
-        <w:keepNext/>
-      </w:pPr>
-      <w:r>
-        <w:rPr>
-          <w:rFonts w:ascii="Times New Roman" w:hAnsi="Times New Roman"/>
-          <w:color w:val="000000"/>
-        </w:rPr>
-        <w:t>Sự phân định này chỉ ra rằng trạng thái mở cổng TCP 445 chỉ là điều kiện tiếp cận ban đầu ở tầng giao vận:</w:t>
+        <w:t xml:space="preserve">Khi nhận mã lỗi </w:t>
+      </w:r>
+      <w:r>
+        <w:rPr>
+          <w:rFonts w:ascii="Times New Roman" w:hAnsi="Times New Roman"/>
+          <w:color w:val="000000"/>
+        </w:rPr>
+        <w:t>STATUS_INSUFF_SERVER_RESOURCES</w:t>
+      </w:r>
+      <w:r>
+        <w:rPr>
+          <w:rFonts w:ascii="Times New Roman" w:hAnsi="Times New Roman"/>
+          <w:color w:val="000000"/>
+        </w:rPr>
+        <w:t xml:space="preserve"> (</w:t>
+      </w:r>
+      <w:r>
+        <w:rPr>
+          <w:rFonts w:ascii="Times New Roman" w:hAnsi="Times New Roman"/>
+          <w:color w:val="000000"/>
+        </w:rPr>
+        <w:t>0xC0000205</w:t>
+      </w:r>
+      <w:r>
+        <w:rPr>
+          <w:rFonts w:ascii="Times New Roman" w:hAnsi="Times New Roman"/>
+          <w:color w:val="000000"/>
+        </w:rPr>
+        <w:t>), kịch bản sử dụng mã phản hồi này làm dấu hiệu cho thấy mục tiêu có khả năng chưa được cập nhật bản vá và đưa ra thông báo cảnh báo. Mã phản hồi này không được coi là bằng chứng quan sát trực tiếp đường thực thi bên trong nhân hệ điều hành.</w:t>
       </w:r>
     </w:p>
     <w:p>
@@ -2448,21 +3026,69 @@
           <w:rFonts w:ascii="Times New Roman" w:hAnsi="Times New Roman"/>
           <w:color w:val="000000"/>
         </w:rPr>
-        <w:t xml:space="preserve">Một máy chủ mở cổng 445 và hỗ trợ SMBv1 nhưng đã được cập nhật bản vá thì lỗi xử lý dữ liệu trong </w:t>
-      </w:r>
-      <w:r>
-        <w:rPr>
-          <w:rFonts w:ascii="Times New Roman" w:hAnsi="Times New Roman"/>
-          <w:color w:val="000000"/>
-        </w:rPr>
-        <w:t>srv.sys</w:t>
-      </w:r>
-      <w:r>
-        <w:rPr>
-          <w:rFonts w:ascii="Times New Roman" w:hAnsi="Times New Roman"/>
-          <w:color w:val="000000"/>
-        </w:rPr>
-        <w:t xml:space="preserve"> đã được khắc phục.</w:t>
+        <w:t xml:space="preserve">Khi nhận mã lỗi </w:t>
+      </w:r>
+      <w:r>
+        <w:rPr>
+          <w:rFonts w:ascii="Times New Roman" w:hAnsi="Times New Roman"/>
+          <w:color w:val="000000"/>
+        </w:rPr>
+        <w:t>STATUS_ACCESS_DENIED</w:t>
+      </w:r>
+      <w:r>
+        <w:rPr>
+          <w:rFonts w:ascii="Times New Roman" w:hAnsi="Times New Roman"/>
+          <w:color w:val="000000"/>
+        </w:rPr>
+        <w:t xml:space="preserve"> (</w:t>
+      </w:r>
+      <w:r>
+        <w:rPr>
+          <w:rFonts w:ascii="Times New Roman" w:hAnsi="Times New Roman"/>
+          <w:color w:val="000000"/>
+        </w:rPr>
+        <w:t>0xC0000022</w:t>
+      </w:r>
+      <w:r>
+        <w:rPr>
+          <w:rFonts w:ascii="Times New Roman" w:hAnsi="Times New Roman"/>
+          <w:color w:val="000000"/>
+        </w:rPr>
+        <w:t>) hoặc yêu cầu bị từ chối, kết quả cho thấy mục tiêu không bộc lộ chỉ báo nghi ngờ theo logic kiểm tra của kịch bản. Tuy nhiên, phản hồi từ chối này không đủ cơ sở để kết luận hệ thống đã được vá an toàn, do việc xử lý gói tin còn phụ thuộc vào chính sách phân quyền và cấu hình phiên kết nối.</w:t>
+      </w:r>
+    </w:p>
+    <w:p>
+      <w:pPr/>
+      <w:r>
+        <w:rPr>
+          <w:rFonts w:ascii="Times New Roman" w:hAnsi="Times New Roman"/>
+          <w:color w:val="000000"/>
+        </w:rPr>
+        <w:t>NSE thực hiện phép thăm dò logic mà không kích hoạt chuỗi khai thác hoàn chỉnh. Do đó, kết quả từ NSE có giá trị như một chỉ báo kỹ thuật ở tầng ứng dụng, không phải bằng chứng khẳng định việc can thiệp sâu sẽ thành công trên thực tế.</w:t>
+      </w:r>
+    </w:p>
+    <w:p>
+      <w:pPr>
+        <w:pStyle w:val="Heading3"/>
+      </w:pPr>
+      <w:r>
+        <w:rPr>
+          <w:rFonts w:ascii="Times New Roman" w:hAnsi="Times New Roman"/>
+          <w:color w:val="000000"/>
+        </w:rPr>
+        <w:t>1.3.4. Metasploit Framework</w:t>
+      </w:r>
+    </w:p>
+    <w:p>
+      <w:pPr>
+        <w:keepNext/>
+      </w:pPr>
+      <w:r>
+        <w:rPr>
+          <w:rFonts w:ascii="Times New Roman" w:hAnsi="Times New Roman"/>
+          <w:color w:val="000000"/>
+        </w:rPr>
+        <w:t>Metasploit Framework được sử dụng nhằm mục đích đối chiếu triển khai kiểm thử và thực hiện bước xác minh sâu hơn khi điều kiện thử nghiệm cho phép:</w:t>
       </w:r>
     </w:p>
     <w:p>
@@ -2481,9 +3107,88 @@
       <w:r>
         <w:rPr>
           <w:rFonts w:ascii="Times New Roman" w:hAnsi="Times New Roman"/>
-          <w:color w:val="000000"/>
-        </w:rPr>
-        <w:t>Ngược lại, một máy chủ tồn tại lỗ hổng nhưng đặt sau tường lửa chặn truy cập SMB từ bên ngoài thì tác động từ xa không thể thực hiện được qua ranh giới mạng đó.</w:t>
+          <w:b/>
+          <w:color w:val="000000"/>
+        </w:rPr>
+        <w:t>Mô-đun phụ trợ (Auxiliary Module):</w:t>
+      </w:r>
+      <w:r>
+        <w:rPr>
+          <w:rFonts w:ascii="Times New Roman" w:hAnsi="Times New Roman"/>
+          <w:color w:val="000000"/>
+        </w:rPr>
+        <w:t xml:space="preserve"> Mô-đun </w:t>
+      </w:r>
+      <w:r>
+        <w:rPr>
+          <w:rFonts w:ascii="Times New Roman" w:hAnsi="Times New Roman"/>
+          <w:color w:val="000000"/>
+        </w:rPr>
+        <w:t>auxiliary/scanner/smb/smb_ms17_010</w:t>
+      </w:r>
+      <w:r>
+        <w:rPr>
+          <w:rFonts w:ascii="Times New Roman" w:hAnsi="Times New Roman"/>
+          <w:color w:val="000000"/>
+        </w:rPr>
+        <w:t xml:space="preserve"> thực thi cùng phương pháp thăm dò logic như kịch bản NSE (dựa trên tương tác qua tài nguyên </w:t>
+      </w:r>
+      <w:r>
+        <w:rPr>
+          <w:rFonts w:ascii="Times New Roman" w:hAnsi="Times New Roman"/>
+          <w:color w:val="000000"/>
+        </w:rPr>
+        <w:t>IPC$</w:t>
+      </w:r>
+      <w:r>
+        <w:rPr>
+          <w:rFonts w:ascii="Times New Roman" w:hAnsi="Times New Roman"/>
+          <w:color w:val="000000"/>
+        </w:rPr>
+        <w:t xml:space="preserve"> và mã lỗi phản hồi). Mô-đun này hỗ trợ đối chiếu khâu phân tích cú pháp giữa hai bộ công cụ, nhưng không tạo thành hai nguồn tín hiệu độc lập về trạng thái an ninh của máy chủ.</w:t>
+      </w:r>
+    </w:p>
+    <w:p>
+      <w:pPr>
+        <w:spacing w:before="0" w:after="60"/>
+        <w:ind w:left="709" w:hanging="283"/>
+        <w:jc w:val="both"/>
+      </w:pPr>
+      <w:r>
+        <w:rPr>
+          <w:rFonts w:ascii="Times New Roman" w:hAnsi="Times New Roman"/>
+          <w:color w:val="000000"/>
+        </w:rPr>
+        <w:t xml:space="preserve">• </w:t>
+      </w:r>
+      <w:r>
+        <w:rPr>
+          <w:rFonts w:ascii="Times New Roman" w:hAnsi="Times New Roman"/>
+          <w:b/>
+          <w:color w:val="000000"/>
+        </w:rPr>
+        <w:t>Mô-đun kiểm chứng tác động (Exploit Module):</w:t>
+      </w:r>
+      <w:r>
+        <w:rPr>
+          <w:rFonts w:ascii="Times New Roman" w:hAnsi="Times New Roman"/>
+          <w:color w:val="000000"/>
+        </w:rPr>
+        <w:t xml:space="preserve"> Mô-đun </w:t>
+      </w:r>
+      <w:r>
+        <w:rPr>
+          <w:rFonts w:ascii="Times New Roman" w:hAnsi="Times New Roman"/>
+          <w:color w:val="000000"/>
+        </w:rPr>
+        <w:t>exploit/windows/smb/ms17_010_eternalblue</w:t>
+      </w:r>
+      <w:r>
+        <w:rPr>
+          <w:rFonts w:ascii="Times New Roman" w:hAnsi="Times New Roman"/>
+          <w:color w:val="000000"/>
+        </w:rPr>
+        <w:t xml:space="preserve"> được sử dụng trong môi trường lab có kiểm soát để xác minh khả năng thực thi mã từ xa khi các chỉ báo nghi ngờ đã được ghi nhận.</w:t>
       </w:r>
     </w:p>
     <w:p>
@@ -2493,7 +3198,7 @@
           <w:rFonts w:ascii="Times New Roman" w:hAnsi="Times New Roman"/>
           <w:color w:val="000000"/>
         </w:rPr>
-        <w:t>Như vậy, mở cổng mạng không đồng nghĩa với việc hỗ trợ SMBv1, hỗ trợ SMBv1 không đồng nghĩa với hệ thống chưa vá, và sự tồn tại của lỗ hổng cũng không đồng nghĩa với việc khai thác chắc chắn thành công.</w:t>
+        <w:t>Khác với các phép thăm dò logic, mô-đun can thiệp sâu tác động trực tiếp vào vùng nhớ của hệ điều hành. Kết quả quan sát (thiết lập phiên tương tác, can thiệp bị từ chối hoặc máy chủ phát sinh lỗi dừng) cần được đối chiếu thận trọng với phiên bản hệ điều hành và cấu hình dịch vụ mục tiêu.</w:t>
       </w:r>
     </w:p>
     <w:p>
@@ -2505,7 +3210,7 @@
           <w:rFonts w:ascii="Times New Roman" w:hAnsi="Times New Roman"/>
           <w:color w:val="000000"/>
         </w:rPr>
-        <w:t>1.2.5. Tác động của lỗ hổng</w:t>
+        <w:t>1.3.5. Vai trò của các công cụ trong quy trình kiểm thử</w:t>
       </w:r>
     </w:p>
     <w:p>
@@ -2517,7 +3222,7 @@
           <w:rFonts w:ascii="Times New Roman" w:hAnsi="Times New Roman"/>
           <w:color w:val="000000"/>
         </w:rPr>
-        <w:t>Tác động của lỗ hổng CVE-2017-0144 thuộc nhóm MS17-010 được xem xét qua ba khía cạnh an toàn thông tin:</w:t>
+        <w:t>Các công cụ được bố trí theo tiến trình kiểm thử tuần tự nhằm tổ chức bằng chứng theo từng mức độ quan sát:</w:t>
       </w:r>
     </w:p>
     <w:p>
@@ -2539,14 +3244,14 @@
           <w:b/>
           <w:color w:val="000000"/>
         </w:rPr>
-        <w:t>Tính bảo mật (Confidentiality):</w:t>
-      </w:r>
-      <w:r>
-        <w:rPr>
-          <w:rFonts w:ascii="Times New Roman" w:hAnsi="Times New Roman"/>
-          <w:color w:val="000000"/>
-        </w:rPr>
-        <w:t xml:space="preserve"> Nếu mã can thiệp thực thi thành công với đặc quyền cao trong nhân hệ điều hành, các dữ liệu lưu trữ trên máy chủ, thông tin xác thực tài khoản và cấu hình hệ thống đều có nguy cơ bị truy cập trái phép.</w:t>
+        <w:t>Trạm kiểm thử Kali Linux:</w:t>
+      </w:r>
+      <w:r>
+        <w:rPr>
+          <w:rFonts w:ascii="Times New Roman" w:hAnsi="Times New Roman"/>
+          <w:color w:val="000000"/>
+        </w:rPr>
+        <w:t xml:space="preserve"> Cung cấp môi trường điều hành để thực thi công cụ và lưu trữ nhật ký đo đạc.</w:t>
       </w:r>
     </w:p>
     <w:p>
@@ -2568,14 +3273,14 @@
           <w:b/>
           <w:color w:val="000000"/>
         </w:rPr>
-        <w:t>Tính toàn vẹn (Integrity):</w:t>
-      </w:r>
-      <w:r>
-        <w:rPr>
-          <w:rFonts w:ascii="Times New Roman" w:hAnsi="Times New Roman"/>
-          <w:color w:val="000000"/>
-        </w:rPr>
-        <w:t xml:space="preserve"> Kẻ tấn công có thể thay đổi dữ liệu, chỉnh sửa tệp tin hệ thống hoặc can thiệp vào các chính sách bảo mật trong phạm vi quyền hạn đạt được.</w:t>
+        <w:t>Nmap:</w:t>
+      </w:r>
+      <w:r>
+        <w:rPr>
+          <w:rFonts w:ascii="Times New Roman" w:hAnsi="Times New Roman"/>
+          <w:color w:val="000000"/>
+        </w:rPr>
+        <w:t xml:space="preserve"> Xác định khả năng tiếp cận dịch vụ qua trạng thái mở cổng ở tầng giao vận.</w:t>
       </w:r>
     </w:p>
     <w:p>
@@ -2597,14 +3302,43 @@
           <w:b/>
           <w:color w:val="000000"/>
         </w:rPr>
-        <w:t>Tính sẵn sàng (Availability):</w:t>
-      </w:r>
-      <w:r>
-        <w:rPr>
-          <w:rFonts w:ascii="Times New Roman" w:hAnsi="Times New Roman"/>
-          <w:color w:val="000000"/>
-        </w:rPr>
-        <w:t xml:space="preserve"> Do can thiệp trực tiếp vào bộ nhớ cấp nhân, các thao tác xử lý không tương thích rất dễ dẫn đến lỗi dừng hệ thống (BSOD). Bên cạnh đó, kẻ tấn công có thể chủ động làm gián đoạn dịch vụ hoặc khóa tài nguyên.</w:t>
+        <w:t>Nmap Scripting Engine:</w:t>
+      </w:r>
+      <w:r>
+        <w:rPr>
+          <w:rFonts w:ascii="Times New Roman" w:hAnsi="Times New Roman"/>
+          <w:color w:val="000000"/>
+        </w:rPr>
+        <w:t xml:space="preserve"> Xác định việc chấp thuận dialect SMBv1 và thu thập chỉ báo kỹ thuật nghi ngờ ở tầng ứng dụng.</w:t>
+      </w:r>
+    </w:p>
+    <w:p>
+      <w:pPr>
+        <w:spacing w:before="0" w:after="60"/>
+        <w:ind w:left="709" w:hanging="283"/>
+        <w:jc w:val="both"/>
+      </w:pPr>
+      <w:r>
+        <w:rPr>
+          <w:rFonts w:ascii="Times New Roman" w:hAnsi="Times New Roman"/>
+          <w:color w:val="000000"/>
+        </w:rPr>
+        <w:t xml:space="preserve">• </w:t>
+      </w:r>
+      <w:r>
+        <w:rPr>
+          <w:rFonts w:ascii="Times New Roman" w:hAnsi="Times New Roman"/>
+          <w:b/>
+          <w:color w:val="000000"/>
+        </w:rPr>
+        <w:t>Metasploit Framework:</w:t>
+      </w:r>
+      <w:r>
+        <w:rPr>
+          <w:rFonts w:ascii="Times New Roman" w:hAnsi="Times New Roman"/>
+          <w:color w:val="000000"/>
+        </w:rPr>
+        <w:t xml:space="preserve"> Đối chiếu kết quả thăm dò cú pháp và thực hiện bước xác minh tác động chuyên sâu trong điều kiện thử nghiệm được kiểm soát.</w:t>
       </w:r>
     </w:p>
     <w:p>
@@ -2614,23 +3348,35 @@
           <w:rFonts w:ascii="Times New Roman" w:hAnsi="Times New Roman"/>
           <w:color w:val="000000"/>
         </w:rPr>
-        <w:t>Điểm đáng lưu ý là lỗ hổng này có thể kích hoạt từ xa qua gói tin mạng mà không bắt buộc phải có sự tương tác của người dùng hay tài khoản đăng nhập trước đó, khiến rủi ro lây lan tự động trở nên đặc biệt nghiêm trọng.</w:t>
+        <w:t>Tiến trình tuần tự này giúp liên kết dữ liệu thu thập từ diện rộng đến chuyên sâu, phân định rõ ràng giữa việc cổng mạng có thể tiếp cận, giao thức được hỗ trợ, dấu hiệu nghi ngờ và tác động thực tế trên hệ thống.</w:t>
       </w:r>
     </w:p>
     <w:p>
       <w:pPr>
-        <w:pStyle w:val="Heading3"/>
-      </w:pPr>
-      <w:r>
-        <w:rPr>
-          <w:rFonts w:ascii="Times New Roman" w:hAnsi="Times New Roman"/>
-          <w:color w:val="000000"/>
-        </w:rPr>
-        <w:t>1.2.6. Mối liên hệ với các cuộc tấn công thực tế</w:t>
+        <w:pStyle w:val="Heading2"/>
+      </w:pPr>
+      <w:r>
+        <w:rPr>
+          <w:rFonts w:ascii="Times New Roman" w:hAnsi="Times New Roman"/>
+          <w:color w:val="000000"/>
+        </w:rPr>
+        <w:t>1.4. Tiêu chí xác minh trạng thái SMB và MS17-010</w:t>
       </w:r>
     </w:p>
     <w:p>
       <w:pPr>
+        <w:pStyle w:val="Heading3"/>
+      </w:pPr>
+      <w:r>
+        <w:rPr>
+          <w:rFonts w:ascii="Times New Roman" w:hAnsi="Times New Roman"/>
+          <w:color w:val="000000"/>
+        </w:rPr>
+        <w:t>1.4.1. Phát hiện dịch vụ SMB</w:t>
+      </w:r>
+    </w:p>
+    <w:p>
+      <w:pPr>
         <w:keepNext/>
       </w:pPr>
       <w:r>
@@ -2638,7 +3384,7 @@
           <w:rFonts w:ascii="Times New Roman" w:hAnsi="Times New Roman"/>
           <w:color w:val="000000"/>
         </w:rPr>
-        <w:t>Tác động thực tế của nhóm lỗ hổng MS17-010 đã được minh chứng qua các sự cố an ninh mạng diện rộng trong năm 2017:</w:t>
+        <w:t>Mức 1 xác định khả năng tiếp cận cổng thường dùng cho dịch vụ SMB trên đường truyền mạng giữa trạm kiểm thử và máy chủ mục tiêu:</w:t>
       </w:r>
     </w:p>
     <w:p>
@@ -2660,14 +3406,28 @@
           <w:b/>
           <w:color w:val="000000"/>
         </w:rPr>
-        <w:t>Chiến dịch mã độc WannaCry (Tháng 05/2017):</w:t>
-      </w:r>
-      <w:r>
-        <w:rPr>
-          <w:rFonts w:ascii="Times New Roman" w:hAnsi="Times New Roman"/>
-          <w:color w:val="000000"/>
-        </w:rPr>
-        <w:t xml:space="preserve"> Mã khai thác EternalBlue bị rò rỉ đã được tích hợp vào cơ chế sâu mạng tự động. WannaCry quét cổng TCP 445 trên Internet và mạng nội bộ, tự động lây nhiễm vào các máy Windows chưa vá để mã hóa dữ liệu đòi tiền chuộc, gây ảnh hưởng đến hàng trăm nghìn hệ thống tại nhiều quốc gia.</w:t>
+        <w:t>Dấu hiệu quan sát:</w:t>
+      </w:r>
+      <w:r>
+        <w:rPr>
+          <w:rFonts w:ascii="Times New Roman" w:hAnsi="Times New Roman"/>
+          <w:color w:val="000000"/>
+        </w:rPr>
+        <w:t xml:space="preserve"> Trạm kiểm thử gửi gói tin TCP SYN tới cổng TCP 445 hoặc TCP 139. Trạng thái cổng được ghi nhận là </w:t>
+      </w:r>
+      <w:r>
+        <w:rPr>
+          <w:rFonts w:ascii="Times New Roman" w:hAnsi="Times New Roman"/>
+          <w:color w:val="000000"/>
+        </w:rPr>
+        <w:t>Open</w:t>
+      </w:r>
+      <w:r>
+        <w:rPr>
+          <w:rFonts w:ascii="Times New Roman" w:hAnsi="Times New Roman"/>
+          <w:color w:val="000000"/>
+        </w:rPr>
+        <w:t xml:space="preserve"> khi máy chủ phản hồi gói tin TCP SYN-ACK.</w:t>
       </w:r>
     </w:p>
     <w:p>
@@ -2689,102 +3449,14 @@
           <w:b/>
           <w:color w:val="000000"/>
         </w:rPr>
-        <w:t>Chiến dịch mã độc NotPetya (Tháng 06/2017):</w:t>
-      </w:r>
-      <w:r>
-        <w:rPr>
-          <w:rFonts w:ascii="Times New Roman" w:hAnsi="Times New Roman"/>
-          <w:color w:val="000000"/>
-        </w:rPr>
-        <w:t xml:space="preserve"> NotPetya tiếp tục sử dụng các kỹ thuật khai thác trong nhóm MS17-010 để phát tán nhanh chóng trong mạng nội bộ. Mã độc nhắm vào việc phá hoại cấu trúc bản ghi khởi động (MBR) của ổ đĩa, khiến hệ thống không thể khởi động lại và gây gián đoạn hoạt động của nhiều tổ chức.</w:t>
-      </w:r>
-    </w:p>
-    <w:p>
-      <w:pPr/>
-      <w:r>
-        <w:rPr>
-          <w:rFonts w:ascii="Times New Roman" w:hAnsi="Times New Roman"/>
-          <w:color w:val="000000"/>
-        </w:rPr>
-        <w:t>Các sự cố này cho thấy việc duy trì giao thức cũ SMBv1 kết hợp với sự chậm trễ trong cập nhật bản vá có thể tạo ra rủi ro an ninh nghiêm trọng cho toàn bộ hệ thống mạng. Thực tế đó dẫn đến nhu cầu cần có phương pháp kiểm tra, phân loại trạng thái dịch vụ SMB một cách an toàn và có kiểm soát.</w:t>
-      </w:r>
-    </w:p>
-    <w:p>
-      <w:pPr>
-        <w:pStyle w:val="Heading2"/>
-      </w:pPr>
-      <w:r>
-        <w:rPr>
-          <w:rFonts w:ascii="Times New Roman" w:hAnsi="Times New Roman"/>
-          <w:color w:val="000000"/>
-        </w:rPr>
-        <w:t>1.3. Công cụ phục vụ kiểm thử</w:t>
-      </w:r>
-    </w:p>
-    <w:p>
-      <w:pPr>
-        <w:pStyle w:val="Heading3"/>
-      </w:pPr>
-      <w:r>
-        <w:rPr>
-          <w:rFonts w:ascii="Times New Roman" w:hAnsi="Times New Roman"/>
-          <w:color w:val="000000"/>
-        </w:rPr>
-        <w:t>1.3.1. Kali Linux</w:t>
-      </w:r>
-    </w:p>
-    <w:p>
-      <w:pPr/>
-      <w:r>
-        <w:rPr>
-          <w:rFonts w:ascii="Times New Roman" w:hAnsi="Times New Roman"/>
-          <w:color w:val="000000"/>
-        </w:rPr>
-        <w:t>Trong đồ án này, Kali Linux được nhóm em sử dụng làm trạm kiểm thử (Testing Workstation) chuyên dụng. Hệ điều hành cung cấp môi trường dòng lệnh tập trung, tích hợp sẵn các tiện ích mạng, thư viện và công cụ kiểm định bảo mật cần thiết để tương tác với máy chủ Windows mục tiêu.</w:t>
-      </w:r>
-    </w:p>
-    <w:p>
-      <w:pPr/>
-      <w:r>
-        <w:rPr>
-          <w:rFonts w:ascii="Times New Roman" w:hAnsi="Times New Roman"/>
-          <w:color w:val="000000"/>
-        </w:rPr>
-        <w:t>Vai trò chính của trạm kiểm thử là khởi tạo các yêu cầu thăm dò, quản lý cấu hình kết nối mạng và ghi nhận nhật ký (log) của quá trình đánh giá. Bản thân Kali Linux chỉ đóng vai trò nền tảng điều khiển; việc đánh giá an ninh phụ thuộc vào phương pháp và kịch bản thực thi của từng công cụ cụ thể được triển khai bên trong.</w:t>
-      </w:r>
-    </w:p>
-    <w:p>
-      <w:pPr>
-        <w:pStyle w:val="Heading3"/>
-      </w:pPr>
-      <w:r>
-        <w:rPr>
-          <w:rFonts w:ascii="Times New Roman" w:hAnsi="Times New Roman"/>
-          <w:color w:val="000000"/>
-        </w:rPr>
-        <w:t>1.3.2. Nmap</w:t>
-      </w:r>
-    </w:p>
-    <w:p>
-      <w:pPr/>
-      <w:r>
-        <w:rPr>
-          <w:rFonts w:ascii="Times New Roman" w:hAnsi="Times New Roman"/>
-          <w:color w:val="000000"/>
-        </w:rPr>
-        <w:t>Nmap (Network Mapper) được nhóm em sử dụng cho bước trinh sát ban đầu nhằm xác định các máy chủ đang hoạt động và kiểm tra khả năng tiếp cận dịch vụ qua hai cổng mạng TCP 139 và TCP 445.</w:t>
-      </w:r>
-    </w:p>
-    <w:p>
-      <w:pPr>
-        <w:keepNext/>
-      </w:pPr>
-      <w:r>
-        <w:rPr>
-          <w:rFonts w:ascii="Times New Roman" w:hAnsi="Times New Roman"/>
-          <w:color w:val="000000"/>
-        </w:rPr>
-        <w:t>Dữ liệu do Nmap cung cấp phản ánh trạng thái cổng ở tầng giao vận:</w:t>
+        <w:t>Ý nghĩa kỹ thuật:</w:t>
+      </w:r>
+      <w:r>
+        <w:rPr>
+          <w:rFonts w:ascii="Times New Roman" w:hAnsi="Times New Roman"/>
+          <w:color w:val="000000"/>
+        </w:rPr>
+        <w:t xml:space="preserve"> Chứng minh có điểm kết nối TCP đang lắng nghe trên cổng thường dùng cho SMB và trạm kiểm thử có thể tiếp cận được cổng này qua hạ tầng mạng.</w:t>
       </w:r>
     </w:p>
     <w:p>
@@ -2803,16 +3475,41 @@
       <w:r>
         <w:rPr>
           <w:rFonts w:ascii="Times New Roman" w:hAnsi="Times New Roman"/>
-          <w:color w:val="000000"/>
-        </w:rPr>
-        <w:t>Open</w:t>
-      </w:r>
-      <w:r>
-        <w:rPr>
-          <w:rFonts w:ascii="Times New Roman" w:hAnsi="Times New Roman"/>
-          <w:color w:val="000000"/>
-        </w:rPr>
-        <w:t>: Cổng mạng có tiến trình lắng nghe và tiếp nhận kết nối TCP (phản hồi gói tin TCP SYN-ACK trước yêu cầu SYN từ trạm kiểm thử).</w:t>
+          <w:b/>
+          <w:color w:val="000000"/>
+        </w:rPr>
+        <w:t>Ranh giới kết luận:</w:t>
+      </w:r>
+      <w:r>
+        <w:rPr>
+          <w:rFonts w:ascii="Times New Roman" w:hAnsi="Times New Roman"/>
+          <w:color w:val="000000"/>
+        </w:rPr>
+        <w:t xml:space="preserve"> Trạng thái mở cổng 445 hoặc 139 chỉ phản ánh khả năng tiếp cận ở tầng giao vận, chưa chứng minh dịch vụ SMB ở tầng ứng dụng đang hoạt động bình thường và hoàn toàn không đồng nghĩa với việc hệ thống tồn tại lỗ hổng bảo mật.</w:t>
+      </w:r>
+    </w:p>
+    <w:p>
+      <w:pPr>
+        <w:pStyle w:val="Heading3"/>
+      </w:pPr>
+      <w:r>
+        <w:rPr>
+          <w:rFonts w:ascii="Times New Roman" w:hAnsi="Times New Roman"/>
+          <w:color w:val="000000"/>
+        </w:rPr>
+        <w:t>1.4.2. Nhận diện SMBv1</w:t>
+      </w:r>
+    </w:p>
+    <w:p>
+      <w:pPr>
+        <w:keepNext/>
+      </w:pPr>
+      <w:r>
+        <w:rPr>
+          <w:rFonts w:ascii="Times New Roman" w:hAnsi="Times New Roman"/>
+          <w:color w:val="000000"/>
+        </w:rPr>
+        <w:t>Mức 2 kiểm tra xem dịch vụ SMB của máy chủ có chấp thuận giao tiếp bằng phiên bản cũ SMBv1 hay không:</w:t>
       </w:r>
     </w:p>
     <w:p>
@@ -2831,16 +3528,45 @@
       <w:r>
         <w:rPr>
           <w:rFonts w:ascii="Times New Roman" w:hAnsi="Times New Roman"/>
-          <w:color w:val="000000"/>
-        </w:rPr>
-        <w:t>Closed</w:t>
-      </w:r>
-      <w:r>
-        <w:rPr>
-          <w:rFonts w:ascii="Times New Roman" w:hAnsi="Times New Roman"/>
-          <w:color w:val="000000"/>
-        </w:rPr>
-        <w:t>: Cổng mạng không có dịch vụ nào tiếp nhận (phản hồi gói tin RST).</w:t>
+          <w:b/>
+          <w:color w:val="000000"/>
+        </w:rPr>
+        <w:t>Tiêu chí giao thức:</w:t>
+      </w:r>
+      <w:r>
+        <w:rPr>
+          <w:rFonts w:ascii="Times New Roman" w:hAnsi="Times New Roman"/>
+          <w:color w:val="000000"/>
+        </w:rPr>
+        <w:t xml:space="preserve"> Trạm kiểm thử gửi gói tin </w:t>
+      </w:r>
+      <w:r>
+        <w:rPr>
+          <w:rFonts w:ascii="Times New Roman" w:hAnsi="Times New Roman"/>
+          <w:color w:val="000000"/>
+        </w:rPr>
+        <w:t>Negotiate Protocol Request</w:t>
+      </w:r>
+      <w:r>
+        <w:rPr>
+          <w:rFonts w:ascii="Times New Roman" w:hAnsi="Times New Roman"/>
+          <w:color w:val="000000"/>
+        </w:rPr>
+        <w:t xml:space="preserve"> chứa danh sách các dialect. Hệ thống được xác nhận có hỗ trợ SMBv1 khi phản hồi bằng gói tin lựa chọn dialect </w:t>
+      </w:r>
+      <w:r>
+        <w:rPr>
+          <w:rFonts w:ascii="Times New Roman" w:hAnsi="Times New Roman"/>
+          <w:color w:val="000000"/>
+        </w:rPr>
+        <w:t>NT LM 0.12</w:t>
+      </w:r>
+      <w:r>
+        <w:rPr>
+          <w:rFonts w:ascii="Times New Roman" w:hAnsi="Times New Roman"/>
+          <w:color w:val="000000"/>
+        </w:rPr>
+        <w:t>.</w:t>
       </w:r>
     </w:p>
     <w:p>
@@ -2859,106 +3585,17 @@
       <w:r>
         <w:rPr>
           <w:rFonts w:ascii="Times New Roman" w:hAnsi="Times New Roman"/>
-          <w:color w:val="000000"/>
-        </w:rPr>
-        <w:t>Filtered</w:t>
-      </w:r>
-      <w:r>
-        <w:rPr>
-          <w:rFonts w:ascii="Times New Roman" w:hAnsi="Times New Roman"/>
-          <w:color w:val="000000"/>
-        </w:rPr>
-        <w:t>: Gói tin thăm dò không nhận được phản hồi hoặc bị chặn bởi chính sách tường lửa.</w:t>
-      </w:r>
-    </w:p>
-    <w:p>
-      <w:pPr/>
-      <w:r>
-        <w:rPr>
-          <w:rFonts w:ascii="Times New Roman" w:hAnsi="Times New Roman"/>
-          <w:color w:val="000000"/>
-        </w:rPr>
-        <w:t xml:space="preserve">Tùy chọn </w:t>
-      </w:r>
-      <w:r>
-        <w:rPr>
-          <w:rFonts w:ascii="Times New Roman" w:hAnsi="Times New Roman"/>
-          <w:color w:val="000000"/>
-        </w:rPr>
-        <w:t>-sV</w:t>
-      </w:r>
-      <w:r>
-        <w:rPr>
-          <w:rFonts w:ascii="Times New Roman" w:hAnsi="Times New Roman"/>
-          <w:color w:val="000000"/>
-        </w:rPr>
-        <w:t xml:space="preserve"> của Nmap hỗ trợ nhận diện sơ bộ tên dịch vụ ứng dụng như </w:t>
-      </w:r>
-      <w:r>
-        <w:rPr>
-          <w:rFonts w:ascii="Times New Roman" w:hAnsi="Times New Roman"/>
-          <w:color w:val="000000"/>
-        </w:rPr>
-        <w:t>microsoft-ds</w:t>
-      </w:r>
-      <w:r>
-        <w:rPr>
-          <w:rFonts w:ascii="Times New Roman" w:hAnsi="Times New Roman"/>
-          <w:color w:val="000000"/>
-        </w:rPr>
-        <w:t xml:space="preserve"> hoặc </w:t>
-      </w:r>
-      <w:r>
-        <w:rPr>
-          <w:rFonts w:ascii="Times New Roman" w:hAnsi="Times New Roman"/>
-          <w:color w:val="000000"/>
-        </w:rPr>
-        <w:t>netbios-ssn</w:t>
-      </w:r>
-      <w:r>
-        <w:rPr>
-          <w:rFonts w:ascii="Times New Roman" w:hAnsi="Times New Roman"/>
-          <w:color w:val="000000"/>
-        </w:rPr>
-        <w:t xml:space="preserve">. Tuy nhiên, kết quả từ Nmap chỉ xác nhận cổng dịch vụ có mở từ góc nhìn mạng hay không. Trạng thái cổng 445 </w:t>
-      </w:r>
-      <w:r>
-        <w:rPr>
-          <w:rFonts w:ascii="Times New Roman" w:hAnsi="Times New Roman"/>
-          <w:color w:val="000000"/>
-        </w:rPr>
-        <w:t>Open</w:t>
-      </w:r>
-      <w:r>
-        <w:rPr>
-          <w:rFonts w:ascii="Times New Roman" w:hAnsi="Times New Roman"/>
-          <w:color w:val="000000"/>
-        </w:rPr>
-        <w:t xml:space="preserve"> không đồng nghĩa với việc máy chủ hỗ trợ SMBv1, cũng không chứng minh hệ thống tồn tại lỗ hổng MS17-010 hay có thể bị khai thác. Nmap đóng vai trò sàng lọc ở bước đầu tiên để định vị mục tiêu.</w:t>
-      </w:r>
-    </w:p>
-    <w:p>
-      <w:pPr>
-        <w:pStyle w:val="Heading3"/>
-      </w:pPr>
-      <w:r>
-        <w:rPr>
-          <w:rFonts w:ascii="Times New Roman" w:hAnsi="Times New Roman"/>
-          <w:color w:val="000000"/>
-        </w:rPr>
-        <w:t>1.3.3. Nmap Scripting Engine</w:t>
-      </w:r>
-    </w:p>
-    <w:p>
-      <w:pPr>
-        <w:keepNext/>
-      </w:pPr>
-      <w:r>
-        <w:rPr>
-          <w:rFonts w:ascii="Times New Roman" w:hAnsi="Times New Roman"/>
-          <w:color w:val="000000"/>
-        </w:rPr>
-        <w:t>Nmap Scripting Engine (NSE) mở rộng khả năng kiểm tra của Nmap lên tầng ứng dụng thông qua các kịch bản viết bằng ngôn ngữ Lua. Trong đồ án, hai kịch bản chuyên biệt được nhóm em sử dụng gồm:</w:t>
+          <w:b/>
+          <w:color w:val="000000"/>
+        </w:rPr>
+        <w:t>Ý nghĩa kỹ thuật:</w:t>
+      </w:r>
+      <w:r>
+        <w:rPr>
+          <w:rFonts w:ascii="Times New Roman" w:hAnsi="Times New Roman"/>
+          <w:color w:val="000000"/>
+        </w:rPr>
+        <w:t xml:space="preserve"> Khẳng định máy chủ chấp thuận giao tiếp bằng giao thức cũ SMBv1 và sẵn sàng tiếp nhận các yêu cầu thuộc phiên bản này.</w:t>
       </w:r>
     </w:p>
     <w:p>
@@ -2980,42 +3617,38 @@
           <w:b/>
           <w:color w:val="000000"/>
         </w:rPr>
-        <w:t>Kịch bản `smb-protocols.nse`:</w:t>
-      </w:r>
-      <w:r>
-        <w:rPr>
-          <w:rFonts w:ascii="Times New Roman" w:hAnsi="Times New Roman"/>
-          <w:color w:val="000000"/>
-        </w:rPr>
-        <w:t xml:space="preserve"> Gửi yêu cầu thương lượng (</w:t>
-      </w:r>
-      <w:r>
-        <w:rPr>
-          <w:rFonts w:ascii="Times New Roman" w:hAnsi="Times New Roman"/>
-          <w:color w:val="000000"/>
-        </w:rPr>
-        <w:t>Negotiate Protocol Request</w:t>
-      </w:r>
-      <w:r>
-        <w:rPr>
-          <w:rFonts w:ascii="Times New Roman" w:hAnsi="Times New Roman"/>
-          <w:color w:val="000000"/>
-        </w:rPr>
-        <w:t>) chứa danh sách dialect để phân tích phản hồi từ máy chủ, qua đó nhận diện hệ thống có chấp thuận giao thức SMBv1 (</w:t>
-      </w:r>
-      <w:r>
-        <w:rPr>
-          <w:rFonts w:ascii="Times New Roman" w:hAnsi="Times New Roman"/>
-          <w:color w:val="000000"/>
-        </w:rPr>
-        <w:t>NT LM 0.12</w:t>
-      </w:r>
-      <w:r>
-        <w:rPr>
-          <w:rFonts w:ascii="Times New Roman" w:hAnsi="Times New Roman"/>
-          <w:color w:val="000000"/>
-        </w:rPr>
-        <w:t>) hay không.</w:t>
+        <w:t>Ranh giới kết luận:</w:t>
+      </w:r>
+      <w:r>
+        <w:rPr>
+          <w:rFonts w:ascii="Times New Roman" w:hAnsi="Times New Roman"/>
+          <w:color w:val="000000"/>
+        </w:rPr>
+        <w:t xml:space="preserve"> Việc chấp thuận SMBv1 là điều kiện cần về mặt giao thức, nhưng không quan sát trực tiếp được trạng thái cập nhật bản vá nội tại của trình điều khiển nhân và chưa đủ cơ sở để khẳng định hệ thống có lỗ hổng MS17-010. Một máy chủ Windows đã cập nhật bản vá an ninh đầy đủ vẫn có thể kích hoạt SMBv1 để duy trì tính tương thích với các ứng dụng cũ.</w:t>
+      </w:r>
+    </w:p>
+    <w:p>
+      <w:pPr>
+        <w:pStyle w:val="Heading3"/>
+      </w:pPr>
+      <w:r>
+        <w:rPr>
+          <w:rFonts w:ascii="Times New Roman" w:hAnsi="Times New Roman"/>
+          <w:color w:val="000000"/>
+        </w:rPr>
+        <w:t>1.4.3. Xác định dấu hiệu lỗ hổng</w:t>
+      </w:r>
+    </w:p>
+    <w:p>
+      <w:pPr>
+        <w:keepNext/>
+      </w:pPr>
+      <w:r>
+        <w:rPr>
+          <w:rFonts w:ascii="Times New Roman" w:hAnsi="Times New Roman"/>
+          <w:color w:val="000000"/>
+        </w:rPr>
+        <w:t>Mức 3 thu thập chỉ báo kỹ thuật liên quan đến trạng thái MS17-010 thông qua phản hồi của dịch vụ SMB:</w:t>
       </w:r>
     </w:p>
     <w:p>
@@ -3037,26 +3670,142 @@
           <w:b/>
           <w:color w:val="000000"/>
         </w:rPr>
-        <w:t>Kịch bản `smb-vuln-ms17-010.nse`:</w:t>
-      </w:r>
-      <w:r>
-        <w:rPr>
-          <w:rFonts w:ascii="Times New Roman" w:hAnsi="Times New Roman"/>
-          <w:color w:val="000000"/>
-        </w:rPr>
-        <w:t xml:space="preserve"> Thăm dò dấu hiệu của MS17-010 bằng cách gửi gói tin giao dịch kiểm tra logic qua giao diện SMB.</w:t>
+        <w:t>Phản hồi dịch vụ:</w:t>
+      </w:r>
+      <w:r>
+        <w:rPr>
+          <w:rFonts w:ascii="Times New Roman" w:hAnsi="Times New Roman"/>
+          <w:color w:val="000000"/>
+        </w:rPr>
+        <w:t xml:space="preserve"> Trạm kiểm thử gửi gói tin giao dịch thăm dò không thực hiện chuỗi khai thác hoàn chỉnh qua giao diện SMB (</w:t>
+      </w:r>
+      <w:r>
+        <w:rPr>
+          <w:rFonts w:ascii="Times New Roman" w:hAnsi="Times New Roman"/>
+          <w:color w:val="000000"/>
+        </w:rPr>
+        <w:t>IPC$</w:t>
+      </w:r>
+      <w:r>
+        <w:rPr>
+          <w:rFonts w:ascii="Times New Roman" w:hAnsi="Times New Roman"/>
+          <w:color w:val="000000"/>
+        </w:rPr>
+        <w:t>):</w:t>
       </w:r>
     </w:p>
     <w:p>
       <w:pPr>
-        <w:keepNext/>
-      </w:pPr>
-      <w:r>
-        <w:rPr>
-          <w:rFonts w:ascii="Times New Roman" w:hAnsi="Times New Roman"/>
-          <w:color w:val="000000"/>
-        </w:rPr>
-        <w:t>Kịch bản đánh giá dựa trên mã trạng thái NT Status trả về từ hệ điều hành máy chủ:</w:t>
+        <w:spacing w:before="0" w:after="60"/>
+        <w:ind w:left="992" w:hanging="283"/>
+        <w:jc w:val="both"/>
+      </w:pPr>
+      <w:r>
+        <w:rPr>
+          <w:rFonts w:ascii="Times New Roman" w:hAnsi="Times New Roman"/>
+          <w:color w:val="000000"/>
+        </w:rPr>
+        <w:t xml:space="preserve">– </w:t>
+      </w:r>
+      <w:r>
+        <w:rPr>
+          <w:rFonts w:ascii="Times New Roman" w:hAnsi="Times New Roman"/>
+          <w:i/>
+          <w:color w:val="000000"/>
+        </w:rPr>
+        <w:t>Chỉ báo nghi ngờ:</w:t>
+      </w:r>
+      <w:r>
+        <w:rPr>
+          <w:rFonts w:ascii="Times New Roman" w:hAnsi="Times New Roman"/>
+          <w:color w:val="000000"/>
+        </w:rPr>
+        <w:t xml:space="preserve"> Máy chủ phản hồi mã trạng thái </w:t>
+      </w:r>
+      <w:r>
+        <w:rPr>
+          <w:rFonts w:ascii="Times New Roman" w:hAnsi="Times New Roman"/>
+          <w:color w:val="000000"/>
+        </w:rPr>
+        <w:t>STATUS_INSUFF_SERVER_RESOURCES</w:t>
+      </w:r>
+      <w:r>
+        <w:rPr>
+          <w:rFonts w:ascii="Times New Roman" w:hAnsi="Times New Roman"/>
+          <w:color w:val="000000"/>
+        </w:rPr>
+        <w:t xml:space="preserve"> (</w:t>
+      </w:r>
+      <w:r>
+        <w:rPr>
+          <w:rFonts w:ascii="Times New Roman" w:hAnsi="Times New Roman"/>
+          <w:color w:val="000000"/>
+        </w:rPr>
+        <w:t>0xC0000205</w:t>
+      </w:r>
+      <w:r>
+        <w:rPr>
+          <w:rFonts w:ascii="Times New Roman" w:hAnsi="Times New Roman"/>
+          <w:color w:val="000000"/>
+        </w:rPr>
+        <w:t>). Mã phản hồi này được kịch bản sử dụng làm dấu hiệu cho thấy hệ thống có khả năng chưa được cập nhật bản vá MS17-010.</w:t>
+      </w:r>
+    </w:p>
+    <w:p>
+      <w:pPr>
+        <w:spacing w:before="0" w:after="60"/>
+        <w:ind w:left="992" w:hanging="283"/>
+        <w:jc w:val="both"/>
+      </w:pPr>
+      <w:r>
+        <w:rPr>
+          <w:rFonts w:ascii="Times New Roman" w:hAnsi="Times New Roman"/>
+          <w:color w:val="000000"/>
+        </w:rPr>
+        <w:t xml:space="preserve">– </w:t>
+      </w:r>
+      <w:r>
+        <w:rPr>
+          <w:rFonts w:ascii="Times New Roman" w:hAnsi="Times New Roman"/>
+          <w:i/>
+          <w:color w:val="000000"/>
+        </w:rPr>
+        <w:t>Chỉ báo không bộc lộ lỗ hổng:</w:t>
+      </w:r>
+      <w:r>
+        <w:rPr>
+          <w:rFonts w:ascii="Times New Roman" w:hAnsi="Times New Roman"/>
+          <w:color w:val="000000"/>
+        </w:rPr>
+        <w:t xml:space="preserve"> Máy chủ phản hồi mã lỗi </w:t>
+      </w:r>
+      <w:r>
+        <w:rPr>
+          <w:rFonts w:ascii="Times New Roman" w:hAnsi="Times New Roman"/>
+          <w:color w:val="000000"/>
+        </w:rPr>
+        <w:t>STATUS_ACCESS_DENIED</w:t>
+      </w:r>
+      <w:r>
+        <w:rPr>
+          <w:rFonts w:ascii="Times New Roman" w:hAnsi="Times New Roman"/>
+          <w:color w:val="000000"/>
+        </w:rPr>
+        <w:t xml:space="preserve"> (</w:t>
+      </w:r>
+      <w:r>
+        <w:rPr>
+          <w:rFonts w:ascii="Times New Roman" w:hAnsi="Times New Roman"/>
+          <w:color w:val="000000"/>
+        </w:rPr>
+        <w:t>0xC0000022</w:t>
+      </w:r>
+      <w:r>
+        <w:rPr>
+          <w:rFonts w:ascii="Times New Roman" w:hAnsi="Times New Roman"/>
+          <w:color w:val="000000"/>
+        </w:rPr>
+        <w:t>) hoặc từ chối xử lý yêu cầu thăm dò.</w:t>
       </w:r>
     </w:p>
     <w:p>
@@ -3075,51 +3824,17 @@
       <w:r>
         <w:rPr>
           <w:rFonts w:ascii="Times New Roman" w:hAnsi="Times New Roman"/>
-          <w:color w:val="000000"/>
-        </w:rPr>
-        <w:t xml:space="preserve">Nếu nhận mã lỗi bộ nhớ </w:t>
-      </w:r>
-      <w:r>
-        <w:rPr>
-          <w:rFonts w:ascii="Times New Roman" w:hAnsi="Times New Roman"/>
-          <w:color w:val="000000"/>
-        </w:rPr>
-        <w:t>STATUS_INSUFF_SERVER_RESOURCES</w:t>
-      </w:r>
-      <w:r>
-        <w:rPr>
-          <w:rFonts w:ascii="Times New Roman" w:hAnsi="Times New Roman"/>
-          <w:color w:val="000000"/>
-        </w:rPr>
-        <w:t xml:space="preserve"> (</w:t>
-      </w:r>
-      <w:r>
-        <w:rPr>
-          <w:rFonts w:ascii="Times New Roman" w:hAnsi="Times New Roman"/>
-          <w:color w:val="000000"/>
-        </w:rPr>
-        <w:t>0xC0000205</w:t>
-      </w:r>
-      <w:r>
-        <w:rPr>
-          <w:rFonts w:ascii="Times New Roman" w:hAnsi="Times New Roman"/>
-          <w:color w:val="000000"/>
-        </w:rPr>
-        <w:t xml:space="preserve">), hệ thống bộc lộ dấu hiệu chưa được vá theo logic kiểm tra và kịch bản đưa ra cảnh báo </w:t>
-      </w:r>
-      <w:r>
-        <w:rPr>
-          <w:rFonts w:ascii="Times New Roman" w:hAnsi="Times New Roman"/>
-          <w:color w:val="000000"/>
-        </w:rPr>
-        <w:t>State: VULNERABLE</w:t>
-      </w:r>
-      <w:r>
-        <w:rPr>
-          <w:rFonts w:ascii="Times New Roman" w:hAnsi="Times New Roman"/>
-          <w:color w:val="000000"/>
-        </w:rPr>
-        <w:t>.</w:t>
+          <w:b/>
+          <w:color w:val="000000"/>
+        </w:rPr>
+        <w:t>Ý nghĩa kỹ thuật:</w:t>
+      </w:r>
+      <w:r>
+        <w:rPr>
+          <w:rFonts w:ascii="Times New Roman" w:hAnsi="Times New Roman"/>
+          <w:color w:val="000000"/>
+        </w:rPr>
+        <w:t xml:space="preserve"> Cung cấp chỉ báo về sự sai lệch logic phản hồi của hệ thống trước một yêu cầu giao dịch bất thường.</w:t>
       </w:r>
     </w:p>
     <w:p>
@@ -3138,63 +3853,33 @@
       <w:r>
         <w:rPr>
           <w:rFonts w:ascii="Times New Roman" w:hAnsi="Times New Roman"/>
-          <w:color w:val="000000"/>
-        </w:rPr>
-        <w:t xml:space="preserve">Nếu nhận mã lỗi </w:t>
-      </w:r>
-      <w:r>
-        <w:rPr>
-          <w:rFonts w:ascii="Times New Roman" w:hAnsi="Times New Roman"/>
-          <w:color w:val="000000"/>
-        </w:rPr>
-        <w:t>STATUS_ACCESS_DENIED</w:t>
-      </w:r>
-      <w:r>
-        <w:rPr>
-          <w:rFonts w:ascii="Times New Roman" w:hAnsi="Times New Roman"/>
-          <w:color w:val="000000"/>
-        </w:rPr>
-        <w:t xml:space="preserve"> (</w:t>
-      </w:r>
-      <w:r>
-        <w:rPr>
-          <w:rFonts w:ascii="Times New Roman" w:hAnsi="Times New Roman"/>
-          <w:color w:val="000000"/>
-        </w:rPr>
-        <w:t>0xC0000022</w:t>
-      </w:r>
-      <w:r>
-        <w:rPr>
-          <w:rFonts w:ascii="Times New Roman" w:hAnsi="Times New Roman"/>
-          <w:color w:val="000000"/>
-        </w:rPr>
-        <w:t>) hoặc yêu cầu bị từ chối, phản hồi này phù hợp với trạng thái không bộc lộ dấu hiệu vulnerable theo logic của script. Dù vậy, kết quả này chưa đủ để kết luận độc lập rằng hệ thống đã được vá, vì phản hồi còn chịu ảnh hưởng của chính sách truy cập và cấu hình dịch vụ.</w:t>
+          <w:b/>
+          <w:color w:val="000000"/>
+        </w:rPr>
+        <w:t>Ranh giới kết luận:</w:t>
+      </w:r>
+      <w:r>
+        <w:rPr>
+          <w:rFonts w:ascii="Times New Roman" w:hAnsi="Times New Roman"/>
+          <w:color w:val="000000"/>
+        </w:rPr>
+        <w:t xml:space="preserve"> Dấu hiệu ở Mức 3 dừng lại ở mức chỉ báo kỹ thuật từ một gói tin thăm dò, không phải bằng chứng bảo đảm việc can thiệp khai thác sẽ thành công. Mặt khác, phản hồi từ chối hoặc không bộc lộ chỉ báo nghi ngờ cũng không chứng minh hệ thống đã an toàn hoặc đã cài bản vá, do kết quả này còn chịu tác động từ chính sách hạn chế kết nối nặc danh hoặc cấu hình dịch vụ.</w:t>
       </w:r>
     </w:p>
     <w:p>
-      <w:pPr/>
-      <w:r>
-        <w:rPr>
-          <w:rFonts w:ascii="Times New Roman" w:hAnsi="Times New Roman"/>
-          <w:color w:val="000000"/>
-        </w:rPr>
-        <w:t>Cần nhấn mạnh rằng NSE chỉ phân tích mã lỗi logic từ một gói tin thăm dò chứ không thực hiện chuỗi khai thác thực tế. Vì vậy, kết quả từ NSE có giá trị như một chỉ báo kỹ thuật, không phải bằng chứng khẳng định việc khai thác chắc chắn thành công.</w:t>
+      <w:pPr>
+        <w:pStyle w:val="Heading3"/>
+      </w:pPr>
+      <w:r>
+        <w:rPr>
+          <w:rFonts w:ascii="Times New Roman" w:hAnsi="Times New Roman"/>
+          <w:color w:val="000000"/>
+        </w:rPr>
+        <w:t>1.4.4. Xác minh lỗ hổng</w:t>
       </w:r>
     </w:p>
     <w:p>
       <w:pPr>
-        <w:pStyle w:val="Heading3"/>
-      </w:pPr>
-      <w:r>
-        <w:rPr>
-          <w:rFonts w:ascii="Times New Roman" w:hAnsi="Times New Roman"/>
-          <w:color w:val="000000"/>
-        </w:rPr>
-        <w:t>1.3.4. Metasploit Framework</w:t>
-      </w:r>
-    </w:p>
-    <w:p>
-      <w:pPr>
         <w:keepNext/>
       </w:pPr>
       <w:r>
@@ -3202,7 +3887,7 @@
           <w:rFonts w:ascii="Times New Roman" w:hAnsi="Times New Roman"/>
           <w:color w:val="000000"/>
         </w:rPr>
-        <w:t>Metasploit Framework được nhóm em sử dụng như một công cụ đối chiếu triển khai và xác minh sâu hơn trong phạm vi thực nghiệm:</w:t>
+        <w:t>Mức 4 đại diện cho bước kiểm chứng sâu hơn về khả năng tác động thực tế trong phạm vi môi trường thử nghiệm có kiểm soát:</w:t>
       </w:r>
     </w:p>
     <w:p>
@@ -3224,42 +3909,101 @@
           <w:b/>
           <w:color w:val="000000"/>
         </w:rPr>
-        <w:t>Mô-đun phụ trợ (Auxiliary Module):</w:t>
-      </w:r>
-      <w:r>
-        <w:rPr>
-          <w:rFonts w:ascii="Times New Roman" w:hAnsi="Times New Roman"/>
-          <w:color w:val="000000"/>
-        </w:rPr>
-        <w:t xml:space="preserve"> Mô-đun </w:t>
-      </w:r>
-      <w:r>
-        <w:rPr>
-          <w:rFonts w:ascii="Times New Roman" w:hAnsi="Times New Roman"/>
-          <w:color w:val="000000"/>
-        </w:rPr>
-        <w:t>auxiliary/scanner/smb/smb_ms17_010</w:t>
-      </w:r>
-      <w:r>
-        <w:rPr>
-          <w:rFonts w:ascii="Times New Roman" w:hAnsi="Times New Roman"/>
-          <w:color w:val="000000"/>
-        </w:rPr>
-        <w:t xml:space="preserve"> thực thi cùng phương pháp thăm dò logic như kịch bản NSE, qua đó giúp đối chiếu chéo khâu phân tích cú pháp và phản hồi giữa hai phần mềm kiểm thử khác nhau. Cần lưu ý rằng hai công cụ này cùng dựa trên một cơ chế tín hiệu mạng qua tài nguyên </w:t>
-      </w:r>
-      <w:r>
-        <w:rPr>
-          <w:rFonts w:ascii="Times New Roman" w:hAnsi="Times New Roman"/>
-          <w:color w:val="000000"/>
-        </w:rPr>
-        <w:t>IPC$</w:t>
-      </w:r>
-      <w:r>
-        <w:rPr>
-          <w:rFonts w:ascii="Times New Roman" w:hAnsi="Times New Roman"/>
-          <w:color w:val="000000"/>
-        </w:rPr>
-        <w:t xml:space="preserve"> nên không tạo thành hai nguồn bằng chứng độc lập về trạng thái của máy chủ.</w:t>
+        <w:t>Phương pháp kiểm chứng:</w:t>
+      </w:r>
+      <w:r>
+        <w:rPr>
+          <w:rFonts w:ascii="Times New Roman" w:hAnsi="Times New Roman"/>
+          <w:color w:val="000000"/>
+        </w:rPr>
+        <w:t xml:space="preserve"> Thực thi kỹ thuật can thiệp để đánh giá phản ứng thực tế của máy chủ mục tiêu. Kết quả được phân định theo ba trạng thái:</w:t>
+      </w:r>
+    </w:p>
+    <w:p>
+      <w:pPr>
+        <w:spacing w:before="0" w:after="60"/>
+        <w:ind w:left="992" w:hanging="283"/>
+        <w:jc w:val="both"/>
+      </w:pPr>
+      <w:r>
+        <w:rPr>
+          <w:rFonts w:ascii="Times New Roman" w:hAnsi="Times New Roman"/>
+          <w:color w:val="000000"/>
+        </w:rPr>
+        <w:t xml:space="preserve">– </w:t>
+      </w:r>
+      <w:r>
+        <w:rPr>
+          <w:rFonts w:ascii="Times New Roman" w:hAnsi="Times New Roman"/>
+          <w:i/>
+          <w:color w:val="000000"/>
+        </w:rPr>
+        <w:t>Xác minh đạt quyền tương tác:</w:t>
+      </w:r>
+      <w:r>
+        <w:rPr>
+          <w:rFonts w:ascii="Times New Roman" w:hAnsi="Times New Roman"/>
+          <w:color w:val="000000"/>
+        </w:rPr>
+        <w:t xml:space="preserve"> Kỹ thuật kiểm chứng đạt được quyền thực thi mã hoặc thiết lập phiên điều khiển tương tác trên máy chủ mục tiêu trong điều kiện thử nghiệm. Kết quả này ghi nhận quyền hạn của phiên ở tầng hệ điều hành, không đồng nhất với việc quan sát trực tiếp diễn biến bên trong bộ nhớ nhân từ xa.</w:t>
+      </w:r>
+    </w:p>
+    <w:p>
+      <w:pPr>
+        <w:spacing w:before="0" w:after="60"/>
+        <w:ind w:left="992" w:hanging="283"/>
+        <w:jc w:val="both"/>
+      </w:pPr>
+      <w:r>
+        <w:rPr>
+          <w:rFonts w:ascii="Times New Roman" w:hAnsi="Times New Roman"/>
+          <w:color w:val="000000"/>
+        </w:rPr>
+        <w:t xml:space="preserve">– </w:t>
+      </w:r>
+      <w:r>
+        <w:rPr>
+          <w:rFonts w:ascii="Times New Roman" w:hAnsi="Times New Roman"/>
+          <w:i/>
+          <w:color w:val="000000"/>
+        </w:rPr>
+        <w:t>Không xác minh được:</w:t>
+      </w:r>
+      <w:r>
+        <w:rPr>
+          <w:rFonts w:ascii="Times New Roman" w:hAnsi="Times New Roman"/>
+          <w:color w:val="000000"/>
+        </w:rPr>
+        <w:t xml:space="preserve"> Quá trình can thiệp bị từ chối, kết nối bị đóng hoặc hệ thống không phản hồi. Hiện tượng này chỉ phản ánh kỹ thuật kiểm chứng hiện tại chưa phù hợp với mục tiêu, không tự động chứng minh máy chủ đã an toàn hoặc miễn nhiễm với lỗ hổng.</w:t>
+      </w:r>
+    </w:p>
+    <w:p>
+      <w:pPr>
+        <w:spacing w:before="0" w:after="60"/>
+        <w:ind w:left="992" w:hanging="283"/>
+        <w:jc w:val="both"/>
+      </w:pPr>
+      <w:r>
+        <w:rPr>
+          <w:rFonts w:ascii="Times New Roman" w:hAnsi="Times New Roman"/>
+          <w:color w:val="000000"/>
+        </w:rPr>
+        <w:t xml:space="preserve">– </w:t>
+      </w:r>
+      <w:r>
+        <w:rPr>
+          <w:rFonts w:ascii="Times New Roman" w:hAnsi="Times New Roman"/>
+          <w:i/>
+          <w:color w:val="000000"/>
+        </w:rPr>
+        <w:t>Hệ thống mất ổn định:</w:t>
+      </w:r>
+      <w:r>
+        <w:rPr>
+          <w:rFonts w:ascii="Times New Roman" w:hAnsi="Times New Roman"/>
+          <w:color w:val="000000"/>
+        </w:rPr>
+        <w:t xml:space="preserve"> Máy chủ bị treo hoặc phát sinh lỗi dừng hệ thống (BSOD). Hiện tượng này phản ánh sự mất ổn định của hệ điều hành trong quá trình kiểm chứng và là bằng chứng tác động đến tính sẵn sàng của mục tiêu trong lượt thử; hiện tượng này không tự xác định nguyên nhân gốc rễ cụ thể và không được coi là xác minh thực thi mã thành công.</w:t>
       </w:r>
     </w:p>
     <w:p>
@@ -3281,62 +4025,14 @@
           <w:b/>
           <w:color w:val="000000"/>
         </w:rPr>
-        <w:t>Mô-đun khai thác có kiểm soát (Exploit Module):</w:t>
-      </w:r>
-      <w:r>
-        <w:rPr>
-          <w:rFonts w:ascii="Times New Roman" w:hAnsi="Times New Roman"/>
-          <w:color w:val="000000"/>
-        </w:rPr>
-        <w:t xml:space="preserve"> Mô-đun </w:t>
-      </w:r>
-      <w:r>
-        <w:rPr>
-          <w:rFonts w:ascii="Times New Roman" w:hAnsi="Times New Roman"/>
-          <w:color w:val="000000"/>
-        </w:rPr>
-        <w:t>exploit/windows/smb/ms17_010_eternalblue</w:t>
-      </w:r>
-      <w:r>
-        <w:rPr>
-          <w:rFonts w:ascii="Times New Roman" w:hAnsi="Times New Roman"/>
-          <w:color w:val="000000"/>
-        </w:rPr>
-        <w:t xml:space="preserve"> thuộc bước xác minh tác động ở mức sâu hơn, phục vụ việc đánh giá khả năng thực thi mã trên máy chủ mục tiêu.</w:t>
-      </w:r>
-    </w:p>
-    <w:p>
-      <w:pPr/>
-      <w:r>
-        <w:rPr>
-          <w:rFonts w:ascii="Times New Roman" w:hAnsi="Times New Roman"/>
-          <w:color w:val="000000"/>
-        </w:rPr>
-        <w:t>Khác với các công cụ thăm dò logic, mô-đun khai thác can thiệp trực tiếp vào việc sắp xếp vùng nhớ của hệ điều hành. Kết quả thu được dù thành công, thất bại hay gây mất ổn định dịch vụ đều phải được diễn giải thận trọng cùng với phiên bản hệ điều hành, cấu hình dịch vụ và các điều kiện kỹ thuật đi kèm.</w:t>
-      </w:r>
-    </w:p>
-    <w:p>
-      <w:pPr>
-        <w:pStyle w:val="Heading3"/>
-      </w:pPr>
-      <w:r>
-        <w:rPr>
-          <w:rFonts w:ascii="Times New Roman" w:hAnsi="Times New Roman"/>
-          <w:color w:val="000000"/>
-        </w:rPr>
-        <w:t>1.3.5. Vai trò của các công cụ trong quy trình kiểm thử</w:t>
-      </w:r>
-    </w:p>
-    <w:p>
-      <w:pPr>
-        <w:keepNext/>
-      </w:pPr>
-      <w:r>
-        <w:rPr>
-          <w:rFonts w:ascii="Times New Roman" w:hAnsi="Times New Roman"/>
-          <w:color w:val="000000"/>
-        </w:rPr>
-        <w:t>Các công cụ được nhóm em phối hợp theo một chuỗi quy trình có thứ tự logic:</w:t>
+        <w:t>Ý nghĩa kỹ thuật:</w:t>
+      </w:r>
+      <w:r>
+        <w:rPr>
+          <w:rFonts w:ascii="Times New Roman" w:hAnsi="Times New Roman"/>
+          <w:color w:val="000000"/>
+        </w:rPr>
+        <w:t xml:space="preserve"> Cung cấp cơ sở thực nghiệm để phân biệt giữa việc chỉ xuất hiện chỉ báo nghi ngờ và khả năng phát sinh tác động thực tế trên hệ thống.</w:t>
       </w:r>
     </w:p>
     <w:p>
@@ -3358,14 +4054,38 @@
           <w:b/>
           <w:color w:val="000000"/>
         </w:rPr>
-        <w:t>Trạm kiểm thử Kali Linux:</w:t>
-      </w:r>
-      <w:r>
-        <w:rPr>
-          <w:rFonts w:ascii="Times New Roman" w:hAnsi="Times New Roman"/>
-          <w:color w:val="000000"/>
-        </w:rPr>
-        <w:t xml:space="preserve"> Cung cấp môi trường điều hành để thực thi đồng bộ các công cụ và ghi nhận dữ liệu.</w:t>
+        <w:t>Ranh giới kết luận:</w:t>
+      </w:r>
+      <w:r>
+        <w:rPr>
+          <w:rFonts w:ascii="Times New Roman" w:hAnsi="Times New Roman"/>
+          <w:color w:val="000000"/>
+        </w:rPr>
+        <w:t xml:space="preserve"> Thao tác ở Mức 4 có tính can thiệp cao, chỉ được triển khai trong phạm vi môi trường lab thử nghiệm được kiểm soát chặt chẽ nhằm tránh rủi ro ngoài ý muốn.</w:t>
+      </w:r>
+    </w:p>
+    <w:p>
+      <w:pPr>
+        <w:pStyle w:val="Heading3"/>
+      </w:pPr>
+      <w:r>
+        <w:rPr>
+          <w:rFonts w:ascii="Times New Roman" w:hAnsi="Times New Roman"/>
+          <w:color w:val="000000"/>
+        </w:rPr>
+        <w:t>1.4.5. Giới hạn của phương pháp xác minh</w:t>
+      </w:r>
+    </w:p>
+    <w:p>
+      <w:pPr>
+        <w:keepNext/>
+      </w:pPr>
+      <w:r>
+        <w:rPr>
+          <w:rFonts w:ascii="Times New Roman" w:hAnsi="Times New Roman"/>
+          <w:color w:val="000000"/>
+        </w:rPr>
+        <w:t>Khi đánh giá kết quả, cần phân định các giới hạn kỹ thuật giữa quan sát mạng từ xa và trạng thái nội tại của hệ thống:</w:t>
       </w:r>
     </w:p>
     <w:p>
@@ -3387,14 +4107,28 @@
           <w:b/>
           <w:color w:val="000000"/>
         </w:rPr>
-        <w:t>Nmap:</w:t>
-      </w:r>
-      <w:r>
-        <w:rPr>
-          <w:rFonts w:ascii="Times New Roman" w:hAnsi="Times New Roman"/>
-          <w:color w:val="000000"/>
-        </w:rPr>
-        <w:t xml:space="preserve"> Xác định khả năng tiếp cận dịch vụ qua việc phát hiện các cổng mạng đang mở ở tầng giao vận.</w:t>
+        <w:t>Ảnh hưởng của tường lửa và chính sách mạng:</w:t>
+      </w:r>
+      <w:r>
+        <w:rPr>
+          <w:rFonts w:ascii="Times New Roman" w:hAnsi="Times New Roman"/>
+          <w:color w:val="000000"/>
+        </w:rPr>
+        <w:t xml:space="preserve"> Tường lửa mạng hoặc tường lửa cục bộ nếu chặn cổng hoặc lọc gói tin sẽ làm xuất hiện trạng thái </w:t>
+      </w:r>
+      <w:r>
+        <w:rPr>
+          <w:rFonts w:ascii="Times New Roman" w:hAnsi="Times New Roman"/>
+          <w:color w:val="000000"/>
+        </w:rPr>
+        <w:t>Filtered</w:t>
+      </w:r>
+      <w:r>
+        <w:rPr>
+          <w:rFonts w:ascii="Times New Roman" w:hAnsi="Times New Roman"/>
+          <w:color w:val="000000"/>
+        </w:rPr>
+        <w:t>. Trạng thái này chỉ phản ánh đường truyền bị chặn từ góc nhìn của trạm kiểm thử, không phản ánh cấu hình hay mức độ an toàn nội tại của máy chủ.</w:t>
       </w:r>
     </w:p>
     <w:p>
@@ -3416,14 +4150,28 @@
           <w:b/>
           <w:color w:val="000000"/>
         </w:rPr>
-        <w:t>Nmap Scripting Engine:</w:t>
-      </w:r>
-      <w:r>
-        <w:rPr>
-          <w:rFonts w:ascii="Times New Roman" w:hAnsi="Times New Roman"/>
-          <w:color w:val="000000"/>
-        </w:rPr>
-        <w:t xml:space="preserve"> Tương tác ở tầng ứng dụng để nhận diện việc hỗ trợ SMBv1 và thu thập dấu hiệu nghi ngờ về MS17-010.</w:t>
+        <w:t>Chính sách kiểm soát truy cập:</w:t>
+      </w:r>
+      <w:r>
+        <w:rPr>
+          <w:rFonts w:ascii="Times New Roman" w:hAnsi="Times New Roman"/>
+          <w:color w:val="000000"/>
+        </w:rPr>
+        <w:t xml:space="preserve"> Khi máy chủ áp dụng chính sách hạn chế kết nối nặc danh (Null Session) vào tài nguyên </w:t>
+      </w:r>
+      <w:r>
+        <w:rPr>
+          <w:rFonts w:ascii="Times New Roman" w:hAnsi="Times New Roman"/>
+          <w:color w:val="000000"/>
+        </w:rPr>
+        <w:t>IPC$</w:t>
+      </w:r>
+      <w:r>
+        <w:rPr>
+          <w:rFonts w:ascii="Times New Roman" w:hAnsi="Times New Roman"/>
+          <w:color w:val="000000"/>
+        </w:rPr>
+        <w:t>, các kịch bản thăm dò ở Mức 3 có thể không nhận được mã phản hồi mong muốn. Tình huống này có thể dẫn đến nhận định âm tính giả dù hệ điều hành mục tiêu chưa được cập nhật bản vá.</w:t>
       </w:r>
     </w:p>
     <w:p>
@@ -3445,60 +4193,14 @@
           <w:b/>
           <w:color w:val="000000"/>
         </w:rPr>
-        <w:t>Metasploit Framework:</w:t>
-      </w:r>
-      <w:r>
-        <w:rPr>
-          <w:rFonts w:ascii="Times New Roman" w:hAnsi="Times New Roman"/>
-          <w:color w:val="000000"/>
-        </w:rPr>
-        <w:t xml:space="preserve"> Đóng vai trò đối chiếu triển khai với kịch bản quét và thực hiện bước xác minh sâu hơn khi các dấu hiệu trước đó đã được xác lập.</w:t>
-      </w:r>
-    </w:p>
-    <w:p>
-      <w:pPr/>
-      <w:r>
-        <w:rPr>
-          <w:rFonts w:ascii="Times New Roman" w:hAnsi="Times New Roman"/>
-          <w:color w:val="000000"/>
-        </w:rPr>
-        <w:t>Sự liên kết này bảo đảm quá trình kiểm tra diễn ra từ diện rộng đến chuyên sâu, giúp người kiểm thử hiểu rõ bản chất từng lớp thông tin trước khi đưa ra nhận định về an ninh của hệ thống. Đây là cơ sở trực tiếp để xây dựng khung tiêu chí phân loại trạng thái trong mục tiếp theo.</w:t>
-      </w:r>
-    </w:p>
-    <w:p>
-      <w:pPr>
-        <w:pStyle w:val="Heading2"/>
-      </w:pPr>
-      <w:r>
-        <w:rPr>
-          <w:rFonts w:ascii="Times New Roman" w:hAnsi="Times New Roman"/>
-          <w:color w:val="000000"/>
-        </w:rPr>
-        <w:t>1.4. Tiêu chí xác minh trạng thái SMB và MS17-010</w:t>
-      </w:r>
-    </w:p>
-    <w:p>
-      <w:pPr>
-        <w:pStyle w:val="Heading3"/>
-      </w:pPr>
-      <w:r>
-        <w:rPr>
-          <w:rFonts w:ascii="Times New Roman" w:hAnsi="Times New Roman"/>
-          <w:color w:val="000000"/>
-        </w:rPr>
-        <w:t>1.4.1. Phát hiện dịch vụ SMB</w:t>
-      </w:r>
-    </w:p>
-    <w:p>
-      <w:pPr>
-        <w:keepNext/>
-      </w:pPr>
-      <w:r>
-        <w:rPr>
-          <w:rFonts w:ascii="Times New Roman" w:hAnsi="Times New Roman"/>
-          <w:color w:val="000000"/>
-        </w:rPr>
-        <w:t>Mức 1 xác định sự hiện diện của dịch vụ SMB trên đường truyền mạng giữa trạm kiểm thử và máy chủ mục tiêu:</w:t>
+        <w:t>Khác biệt giữa các phiên bản hệ điều hành:</w:t>
+      </w:r>
+      <w:r>
+        <w:rPr>
+          <w:rFonts w:ascii="Times New Roman" w:hAnsi="Times New Roman"/>
+          <w:color w:val="000000"/>
+        </w:rPr>
+        <w:t xml:space="preserve"> Cơ chế quản lý bộ nhớ nhân giữa các thế hệ Windows có sự khác biệt. Một kỹ thuật can thiệp có tác động trên phiên bản này có thể chỉ gây lỗi dừng hoặc không hoạt động trên phiên bản khác.</w:t>
       </w:r>
     </w:p>
     <w:p>
@@ -3520,836 +4222,6 @@
           <w:b/>
           <w:color w:val="000000"/>
         </w:rPr>
-        <w:t>Dấu hiệu quan sát:</w:t>
-      </w:r>
-      <w:r>
-        <w:rPr>
-          <w:rFonts w:ascii="Times New Roman" w:hAnsi="Times New Roman"/>
-          <w:color w:val="000000"/>
-        </w:rPr>
-        <w:t xml:space="preserve"> Trạm kiểm thử gửi gói tin TCP SYN tới cổng TCP 445 hoặc TCP 139. Trạng thái cổng được ghi nhận là </w:t>
-      </w:r>
-      <w:r>
-        <w:rPr>
-          <w:rFonts w:ascii="Times New Roman" w:hAnsi="Times New Roman"/>
-          <w:color w:val="000000"/>
-        </w:rPr>
-        <w:t>Open</w:t>
-      </w:r>
-      <w:r>
-        <w:rPr>
-          <w:rFonts w:ascii="Times New Roman" w:hAnsi="Times New Roman"/>
-          <w:color w:val="000000"/>
-        </w:rPr>
-        <w:t xml:space="preserve"> khi máy chủ phản hồi gói tin TCP SYN-ACK.</w:t>
-      </w:r>
-    </w:p>
-    <w:p>
-      <w:pPr>
-        <w:spacing w:before="0" w:after="60"/>
-        <w:ind w:left="709" w:hanging="283"/>
-        <w:jc w:val="both"/>
-      </w:pPr>
-      <w:r>
-        <w:rPr>
-          <w:rFonts w:ascii="Times New Roman" w:hAnsi="Times New Roman"/>
-          <w:color w:val="000000"/>
-        </w:rPr>
-        <w:t xml:space="preserve">• </w:t>
-      </w:r>
-      <w:r>
-        <w:rPr>
-          <w:rFonts w:ascii="Times New Roman" w:hAnsi="Times New Roman"/>
-          <w:b/>
-          <w:color w:val="000000"/>
-        </w:rPr>
-        <w:t>Ý nghĩa kỹ thuật:</w:t>
-      </w:r>
-      <w:r>
-        <w:rPr>
-          <w:rFonts w:ascii="Times New Roman" w:hAnsi="Times New Roman"/>
-          <w:color w:val="000000"/>
-        </w:rPr>
-        <w:t xml:space="preserve"> Chứng minh cổng mạng của máy chủ đang có tiến trình lắng nghe và tiếp nhận kết nối ở tầng giao vận.</w:t>
-      </w:r>
-    </w:p>
-    <w:p>
-      <w:pPr>
-        <w:spacing w:before="0" w:after="60"/>
-        <w:ind w:left="709" w:hanging="283"/>
-        <w:jc w:val="both"/>
-      </w:pPr>
-      <w:r>
-        <w:rPr>
-          <w:rFonts w:ascii="Times New Roman" w:hAnsi="Times New Roman"/>
-          <w:color w:val="000000"/>
-        </w:rPr>
-        <w:t xml:space="preserve">• </w:t>
-      </w:r>
-      <w:r>
-        <w:rPr>
-          <w:rFonts w:ascii="Times New Roman" w:hAnsi="Times New Roman"/>
-          <w:b/>
-          <w:color w:val="000000"/>
-        </w:rPr>
-        <w:t>Ranh giới kết luận:</w:t>
-      </w:r>
-      <w:r>
-        <w:rPr>
-          <w:rFonts w:ascii="Times New Roman" w:hAnsi="Times New Roman"/>
-          <w:color w:val="000000"/>
-        </w:rPr>
-        <w:t xml:space="preserve"> Trạng thái mở cổng 445 hoặc 139 chỉ phản ánh khả năng tiếp cận ở tầng giao vận, chưa chứng minh dịch vụ SMB ở tầng ứng dụng hoạt động bình thường và hoàn toàn không đồng nghĩa với việc hệ thống có lỗ hổng. Mọi máy chủ Windows đang chia sẻ tệp tin hoặc máy in hợp lệ đều mở các cổng này.</w:t>
-      </w:r>
-    </w:p>
-    <w:p>
-      <w:pPr>
-        <w:pStyle w:val="Heading3"/>
-      </w:pPr>
-      <w:r>
-        <w:rPr>
-          <w:rFonts w:ascii="Times New Roman" w:hAnsi="Times New Roman"/>
-          <w:color w:val="000000"/>
-        </w:rPr>
-        <w:t>1.4.2. Nhận diện SMBv1</w:t>
-      </w:r>
-    </w:p>
-    <w:p>
-      <w:pPr>
-        <w:keepNext/>
-      </w:pPr>
-      <w:r>
-        <w:rPr>
-          <w:rFonts w:ascii="Times New Roman" w:hAnsi="Times New Roman"/>
-          <w:color w:val="000000"/>
-        </w:rPr>
-        <w:t>Mức 2 kiểm tra xem dịch vụ SMB của máy chủ có chấp thuận giao tiếp bằng phiên bản cũ SMBv1 hay không:</w:t>
-      </w:r>
-    </w:p>
-    <w:p>
-      <w:pPr>
-        <w:spacing w:before="0" w:after="60"/>
-        <w:ind w:left="709" w:hanging="283"/>
-        <w:jc w:val="both"/>
-      </w:pPr>
-      <w:r>
-        <w:rPr>
-          <w:rFonts w:ascii="Times New Roman" w:hAnsi="Times New Roman"/>
-          <w:color w:val="000000"/>
-        </w:rPr>
-        <w:t xml:space="preserve">• </w:t>
-      </w:r>
-      <w:r>
-        <w:rPr>
-          <w:rFonts w:ascii="Times New Roman" w:hAnsi="Times New Roman"/>
-          <w:b/>
-          <w:color w:val="000000"/>
-        </w:rPr>
-        <w:t>Tiêu chí giao thức:</w:t>
-      </w:r>
-      <w:r>
-        <w:rPr>
-          <w:rFonts w:ascii="Times New Roman" w:hAnsi="Times New Roman"/>
-          <w:color w:val="000000"/>
-        </w:rPr>
-        <w:t xml:space="preserve"> Trạm kiểm thử gửi gói tin </w:t>
-      </w:r>
-      <w:r>
-        <w:rPr>
-          <w:rFonts w:ascii="Times New Roman" w:hAnsi="Times New Roman"/>
-          <w:color w:val="000000"/>
-        </w:rPr>
-        <w:t>Negotiate Protocol Request</w:t>
-      </w:r>
-      <w:r>
-        <w:rPr>
-          <w:rFonts w:ascii="Times New Roman" w:hAnsi="Times New Roman"/>
-          <w:color w:val="000000"/>
-        </w:rPr>
-        <w:t xml:space="preserve"> chứa danh sách các dialect. Hệ thống được xác nhận có hỗ trợ SMBv1 khi phản hồi bằng gói tin lựa chọn dialect </w:t>
-      </w:r>
-      <w:r>
-        <w:rPr>
-          <w:rFonts w:ascii="Times New Roman" w:hAnsi="Times New Roman"/>
-          <w:color w:val="000000"/>
-        </w:rPr>
-        <w:t>NT LM 0.12</w:t>
-      </w:r>
-      <w:r>
-        <w:rPr>
-          <w:rFonts w:ascii="Times New Roman" w:hAnsi="Times New Roman"/>
-          <w:color w:val="000000"/>
-        </w:rPr>
-        <w:t>.</w:t>
-      </w:r>
-    </w:p>
-    <w:p>
-      <w:pPr>
-        <w:spacing w:before="0" w:after="60"/>
-        <w:ind w:left="709" w:hanging="283"/>
-        <w:jc w:val="both"/>
-      </w:pPr>
-      <w:r>
-        <w:rPr>
-          <w:rFonts w:ascii="Times New Roman" w:hAnsi="Times New Roman"/>
-          <w:color w:val="000000"/>
-        </w:rPr>
-        <w:t xml:space="preserve">• </w:t>
-      </w:r>
-      <w:r>
-        <w:rPr>
-          <w:rFonts w:ascii="Times New Roman" w:hAnsi="Times New Roman"/>
-          <w:b/>
-          <w:color w:val="000000"/>
-        </w:rPr>
-        <w:t>Ý nghĩa kỹ thuật:</w:t>
-      </w:r>
-      <w:r>
-        <w:rPr>
-          <w:rFonts w:ascii="Times New Roman" w:hAnsi="Times New Roman"/>
-          <w:color w:val="000000"/>
-        </w:rPr>
-        <w:t xml:space="preserve"> Khẳng định máy chủ chấp thuận giao tiếp bằng giao thức cũ SMBv1 và sẵn sàng xử lý các gói tin này.</w:t>
-      </w:r>
-    </w:p>
-    <w:p>
-      <w:pPr>
-        <w:spacing w:before="0" w:after="60"/>
-        <w:ind w:left="709" w:hanging="283"/>
-        <w:jc w:val="both"/>
-      </w:pPr>
-      <w:r>
-        <w:rPr>
-          <w:rFonts w:ascii="Times New Roman" w:hAnsi="Times New Roman"/>
-          <w:color w:val="000000"/>
-        </w:rPr>
-        <w:t xml:space="preserve">• </w:t>
-      </w:r>
-      <w:r>
-        <w:rPr>
-          <w:rFonts w:ascii="Times New Roman" w:hAnsi="Times New Roman"/>
-          <w:b/>
-          <w:color w:val="000000"/>
-        </w:rPr>
-        <w:t>Ranh giới kết luận:</w:t>
-      </w:r>
-      <w:r>
-        <w:rPr>
-          <w:rFonts w:ascii="Times New Roman" w:hAnsi="Times New Roman"/>
-          <w:color w:val="000000"/>
-        </w:rPr>
-        <w:t xml:space="preserve"> Hỗ trợ SMBv1 là điều kiện cần về giao thức, nhưng không quan sát trực tiếp được trạng thái nội tại của driver nhân và chưa đủ cơ sở để khẳng định hệ thống tồn tại lỗ hổng MS17-010. Một máy chủ Windows đã cập nhật bản vá vẫn có thể bật SMBv1 để phục vụ tương thích nghiệp vụ mà vẫn an toàn trước lỗi xử lý bộ nhớ.</w:t>
-      </w:r>
-    </w:p>
-    <w:p>
-      <w:pPr>
-        <w:pStyle w:val="Heading3"/>
-      </w:pPr>
-      <w:r>
-        <w:rPr>
-          <w:rFonts w:ascii="Times New Roman" w:hAnsi="Times New Roman"/>
-          <w:color w:val="000000"/>
-        </w:rPr>
-        <w:t>1.4.3. Xác định dấu hiệu lỗ hổng</w:t>
-      </w:r>
-    </w:p>
-    <w:p>
-      <w:pPr>
-        <w:keepNext/>
-      </w:pPr>
-      <w:r>
-        <w:rPr>
-          <w:rFonts w:ascii="Times New Roman" w:hAnsi="Times New Roman"/>
-          <w:color w:val="000000"/>
-        </w:rPr>
-        <w:t xml:space="preserve">Mức 3 thu thập các phản hồi kỹ thuật để nhận diện dấu hiệu driver </w:t>
-      </w:r>
-      <w:r>
-        <w:rPr>
-          <w:rFonts w:ascii="Times New Roman" w:hAnsi="Times New Roman"/>
-          <w:color w:val="000000"/>
-        </w:rPr>
-        <w:t>srv.sys</w:t>
-      </w:r>
-      <w:r>
-        <w:rPr>
-          <w:rFonts w:ascii="Times New Roman" w:hAnsi="Times New Roman"/>
-          <w:color w:val="000000"/>
-        </w:rPr>
-        <w:t xml:space="preserve"> chưa được cập nhật bản vá an ninh:</w:t>
-      </w:r>
-    </w:p>
-    <w:p>
-      <w:pPr>
-        <w:spacing w:before="0" w:after="60"/>
-        <w:ind w:left="709" w:hanging="283"/>
-        <w:jc w:val="both"/>
-      </w:pPr>
-      <w:r>
-        <w:rPr>
-          <w:rFonts w:ascii="Times New Roman" w:hAnsi="Times New Roman"/>
-          <w:color w:val="000000"/>
-        </w:rPr>
-        <w:t xml:space="preserve">• </w:t>
-      </w:r>
-      <w:r>
-        <w:rPr>
-          <w:rFonts w:ascii="Times New Roman" w:hAnsi="Times New Roman"/>
-          <w:b/>
-          <w:color w:val="000000"/>
-        </w:rPr>
-        <w:t>Phản hồi dịch vụ:</w:t>
-      </w:r>
-      <w:r>
-        <w:rPr>
-          <w:rFonts w:ascii="Times New Roman" w:hAnsi="Times New Roman"/>
-          <w:color w:val="000000"/>
-        </w:rPr>
-        <w:t xml:space="preserve"> Trạm kiểm thử gửi gói tin giao dịch thăm dò an toàn qua giao diện SMB (</w:t>
-      </w:r>
-      <w:r>
-        <w:rPr>
-          <w:rFonts w:ascii="Times New Roman" w:hAnsi="Times New Roman"/>
-          <w:color w:val="000000"/>
-        </w:rPr>
-        <w:t>IPC$</w:t>
-      </w:r>
-      <w:r>
-        <w:rPr>
-          <w:rFonts w:ascii="Times New Roman" w:hAnsi="Times New Roman"/>
-          <w:color w:val="000000"/>
-        </w:rPr>
-        <w:t>):</w:t>
-      </w:r>
-    </w:p>
-    <w:p>
-      <w:pPr>
-        <w:spacing w:before="0" w:after="60"/>
-        <w:ind w:left="992" w:hanging="283"/>
-        <w:jc w:val="both"/>
-      </w:pPr>
-      <w:r>
-        <w:rPr>
-          <w:rFonts w:ascii="Times New Roman" w:hAnsi="Times New Roman"/>
-          <w:color w:val="000000"/>
-        </w:rPr>
-        <w:t xml:space="preserve">– </w:t>
-      </w:r>
-      <w:r>
-        <w:rPr>
-          <w:rFonts w:ascii="Times New Roman" w:hAnsi="Times New Roman"/>
-          <w:i/>
-          <w:color w:val="000000"/>
-        </w:rPr>
-        <w:t>Dấu hiệu chưa vá:</w:t>
-      </w:r>
-      <w:r>
-        <w:rPr>
-          <w:rFonts w:ascii="Times New Roman" w:hAnsi="Times New Roman"/>
-          <w:color w:val="000000"/>
-        </w:rPr>
-        <w:t xml:space="preserve"> Máy chủ phản hồi mã trạng thái </w:t>
-      </w:r>
-      <w:r>
-        <w:rPr>
-          <w:rFonts w:ascii="Times New Roman" w:hAnsi="Times New Roman"/>
-          <w:color w:val="000000"/>
-        </w:rPr>
-        <w:t>STATUS_INSUFF_SERVER_RESOURCES</w:t>
-      </w:r>
-      <w:r>
-        <w:rPr>
-          <w:rFonts w:ascii="Times New Roman" w:hAnsi="Times New Roman"/>
-          <w:color w:val="000000"/>
-        </w:rPr>
-        <w:t xml:space="preserve"> (</w:t>
-      </w:r>
-      <w:r>
-        <w:rPr>
-          <w:rFonts w:ascii="Times New Roman" w:hAnsi="Times New Roman"/>
-          <w:color w:val="000000"/>
-        </w:rPr>
-        <w:t>0xC0000205</w:t>
-      </w:r>
-      <w:r>
-        <w:rPr>
-          <w:rFonts w:ascii="Times New Roman" w:hAnsi="Times New Roman"/>
-          <w:color w:val="000000"/>
-        </w:rPr>
-        <w:t>), phản ánh việc nhánh mã xử lý cũ đang vận hành.</w:t>
-      </w:r>
-    </w:p>
-    <w:p>
-      <w:pPr>
-        <w:spacing w:before="0" w:after="60"/>
-        <w:ind w:left="992" w:hanging="283"/>
-        <w:jc w:val="both"/>
-      </w:pPr>
-      <w:r>
-        <w:rPr>
-          <w:rFonts w:ascii="Times New Roman" w:hAnsi="Times New Roman"/>
-          <w:color w:val="000000"/>
-        </w:rPr>
-        <w:t xml:space="preserve">– </w:t>
-      </w:r>
-      <w:r>
-        <w:rPr>
-          <w:rFonts w:ascii="Times New Roman" w:hAnsi="Times New Roman"/>
-          <w:i/>
-          <w:color w:val="000000"/>
-        </w:rPr>
-        <w:t>Dấu hiệu không bộc lộ lỗ hổng:</w:t>
-      </w:r>
-      <w:r>
-        <w:rPr>
-          <w:rFonts w:ascii="Times New Roman" w:hAnsi="Times New Roman"/>
-          <w:color w:val="000000"/>
-        </w:rPr>
-        <w:t xml:space="preserve"> Máy chủ phản hồi mã lỗi </w:t>
-      </w:r>
-      <w:r>
-        <w:rPr>
-          <w:rFonts w:ascii="Times New Roman" w:hAnsi="Times New Roman"/>
-          <w:color w:val="000000"/>
-        </w:rPr>
-        <w:t>STATUS_ACCESS_DENIED</w:t>
-      </w:r>
-      <w:r>
-        <w:rPr>
-          <w:rFonts w:ascii="Times New Roman" w:hAnsi="Times New Roman"/>
-          <w:color w:val="000000"/>
-        </w:rPr>
-        <w:t xml:space="preserve"> (</w:t>
-      </w:r>
-      <w:r>
-        <w:rPr>
-          <w:rFonts w:ascii="Times New Roman" w:hAnsi="Times New Roman"/>
-          <w:color w:val="000000"/>
-        </w:rPr>
-        <w:t>0xC0000022</w:t>
-      </w:r>
-      <w:r>
-        <w:rPr>
-          <w:rFonts w:ascii="Times New Roman" w:hAnsi="Times New Roman"/>
-          <w:color w:val="000000"/>
-        </w:rPr>
-        <w:t>) hoặc từ chối xử lý yêu cầu thăm dò.</w:t>
-      </w:r>
-    </w:p>
-    <w:p>
-      <w:pPr>
-        <w:spacing w:before="0" w:after="60"/>
-        <w:ind w:left="709" w:hanging="283"/>
-        <w:jc w:val="both"/>
-      </w:pPr>
-      <w:r>
-        <w:rPr>
-          <w:rFonts w:ascii="Times New Roman" w:hAnsi="Times New Roman"/>
-          <w:color w:val="000000"/>
-        </w:rPr>
-        <w:t xml:space="preserve">• </w:t>
-      </w:r>
-      <w:r>
-        <w:rPr>
-          <w:rFonts w:ascii="Times New Roman" w:hAnsi="Times New Roman"/>
-          <w:b/>
-          <w:color w:val="000000"/>
-        </w:rPr>
-        <w:t>Ý nghĩa kỹ thuật:</w:t>
-      </w:r>
-      <w:r>
-        <w:rPr>
-          <w:rFonts w:ascii="Times New Roman" w:hAnsi="Times New Roman"/>
-          <w:color w:val="000000"/>
-        </w:rPr>
-        <w:t xml:space="preserve"> Cung cấp chỉ báo về sự sai lệch logic phản hồi của hệ thống trước một yêu cầu giao dịch bất thường.</w:t>
-      </w:r>
-    </w:p>
-    <w:p>
-      <w:pPr>
-        <w:spacing w:before="0" w:after="60"/>
-        <w:ind w:left="709" w:hanging="283"/>
-        <w:jc w:val="both"/>
-      </w:pPr>
-      <w:r>
-        <w:rPr>
-          <w:rFonts w:ascii="Times New Roman" w:hAnsi="Times New Roman"/>
-          <w:color w:val="000000"/>
-        </w:rPr>
-        <w:t xml:space="preserve">• </w:t>
-      </w:r>
-      <w:r>
-        <w:rPr>
-          <w:rFonts w:ascii="Times New Roman" w:hAnsi="Times New Roman"/>
-          <w:b/>
-          <w:color w:val="000000"/>
-        </w:rPr>
-        <w:t>Ranh giới kết luận:</w:t>
-      </w:r>
-      <w:r>
-        <w:rPr>
-          <w:rFonts w:ascii="Times New Roman" w:hAnsi="Times New Roman"/>
-          <w:color w:val="000000"/>
-        </w:rPr>
-        <w:t xml:space="preserve"> Dấu hiệu ở Mức 3 chỉ dừng lại ở chỉ báo logic từ một gói tin thăm dò, không phải bằng chứng khẳng định việc khai thác chắc chắn thành công. Phản hồi từ chối cũng không chứng minh hệ thống đã vá an toàn vì kết quả còn chịu ảnh hưởng của chính sách kiểm soát truy cập nặc danh.</w:t>
-      </w:r>
-    </w:p>
-    <w:p>
-      <w:pPr>
-        <w:pStyle w:val="Heading3"/>
-      </w:pPr>
-      <w:r>
-        <w:rPr>
-          <w:rFonts w:ascii="Times New Roman" w:hAnsi="Times New Roman"/>
-          <w:color w:val="000000"/>
-        </w:rPr>
-        <w:t>1.4.4. Xác minh lỗ hổng</w:t>
-      </w:r>
-    </w:p>
-    <w:p>
-      <w:pPr>
-        <w:keepNext/>
-      </w:pPr>
-      <w:r>
-        <w:rPr>
-          <w:rFonts w:ascii="Times New Roman" w:hAnsi="Times New Roman"/>
-          <w:color w:val="000000"/>
-        </w:rPr>
-        <w:t>Mức 4 đại diện cho bước kiểm chứng sâu hơn về khả năng tác động thực tế của lỗ hổng trong phạm vi thử nghiệm được kiểm soát:</w:t>
-      </w:r>
-    </w:p>
-    <w:p>
-      <w:pPr>
-        <w:spacing w:before="0" w:after="60"/>
-        <w:ind w:left="709" w:hanging="283"/>
-        <w:jc w:val="both"/>
-      </w:pPr>
-      <w:r>
-        <w:rPr>
-          <w:rFonts w:ascii="Times New Roman" w:hAnsi="Times New Roman"/>
-          <w:color w:val="000000"/>
-        </w:rPr>
-        <w:t xml:space="preserve">• </w:t>
-      </w:r>
-      <w:r>
-        <w:rPr>
-          <w:rFonts w:ascii="Times New Roman" w:hAnsi="Times New Roman"/>
-          <w:b/>
-          <w:color w:val="000000"/>
-        </w:rPr>
-        <w:t>Phương pháp kiểm chứng:</w:t>
-      </w:r>
-      <w:r>
-        <w:rPr>
-          <w:rFonts w:ascii="Times New Roman" w:hAnsi="Times New Roman"/>
-          <w:color w:val="000000"/>
-        </w:rPr>
-        <w:t xml:space="preserve"> Kích hoạt mô-đun kiểm chứng để đánh giá phản ứng thực tế của máy chủ mục tiêu trước yêu cầu can thiệp. Kết quả được phân định theo ba trạng thái:</w:t>
-      </w:r>
-    </w:p>
-    <w:p>
-      <w:pPr>
-        <w:spacing w:before="0" w:after="60"/>
-        <w:ind w:left="992" w:hanging="283"/>
-        <w:jc w:val="both"/>
-      </w:pPr>
-      <w:r>
-        <w:rPr>
-          <w:rFonts w:ascii="Times New Roman" w:hAnsi="Times New Roman"/>
-          <w:color w:val="000000"/>
-        </w:rPr>
-        <w:t xml:space="preserve">– </w:t>
-      </w:r>
-      <w:r>
-        <w:rPr>
-          <w:rFonts w:ascii="Times New Roman" w:hAnsi="Times New Roman"/>
-          <w:i/>
-          <w:color w:val="000000"/>
-        </w:rPr>
-        <w:t>Xác minh thành công:</w:t>
-      </w:r>
-      <w:r>
-        <w:rPr>
-          <w:rFonts w:ascii="Times New Roman" w:hAnsi="Times New Roman"/>
-          <w:color w:val="000000"/>
-        </w:rPr>
-        <w:t xml:space="preserve"> Thiết lập được quyền điều khiển tương tác trên máy chủ mục tiêu, chứng minh lỗ hổng có thể bị lợi dụng để thực thi mã từ xa với đặc quyền cao. Kết quả này ghi nhận quyền thực thi của phiên ở tầng hệ điều hành, không đồng nhất với việc quan sát trực tiếp bộ nhớ nhân từ xa.</w:t>
-      </w:r>
-    </w:p>
-    <w:p>
-      <w:pPr>
-        <w:spacing w:before="0" w:after="60"/>
-        <w:ind w:left="992" w:hanging="283"/>
-        <w:jc w:val="both"/>
-      </w:pPr>
-      <w:r>
-        <w:rPr>
-          <w:rFonts w:ascii="Times New Roman" w:hAnsi="Times New Roman"/>
-          <w:color w:val="000000"/>
-        </w:rPr>
-        <w:t xml:space="preserve">– </w:t>
-      </w:r>
-      <w:r>
-        <w:rPr>
-          <w:rFonts w:ascii="Times New Roman" w:hAnsi="Times New Roman"/>
-          <w:i/>
-          <w:color w:val="000000"/>
-        </w:rPr>
-        <w:t>Không xác minh được:</w:t>
-      </w:r>
-      <w:r>
-        <w:rPr>
-          <w:rFonts w:ascii="Times New Roman" w:hAnsi="Times New Roman"/>
-          <w:color w:val="000000"/>
-        </w:rPr>
-        <w:t xml:space="preserve"> Quá trình can thiệp bị từ chối, kết nối bị đóng hoặc hệ thống không phản hồi. Hiện tượng này chỉ cho thấy kỹ thuật kiểm chứng hiện tại không phù hợp với mục tiêu, không tự động chứng minh máy chủ miễn nhiễm hoặc không có lỗ hổng.</w:t>
-      </w:r>
-    </w:p>
-    <w:p>
-      <w:pPr>
-        <w:spacing w:before="0" w:after="60"/>
-        <w:ind w:left="992" w:hanging="283"/>
-        <w:jc w:val="both"/>
-      </w:pPr>
-      <w:r>
-        <w:rPr>
-          <w:rFonts w:ascii="Times New Roman" w:hAnsi="Times New Roman"/>
-          <w:color w:val="000000"/>
-        </w:rPr>
-        <w:t xml:space="preserve">– </w:t>
-      </w:r>
-      <w:r>
-        <w:rPr>
-          <w:rFonts w:ascii="Times New Roman" w:hAnsi="Times New Roman"/>
-          <w:i/>
-          <w:color w:val="000000"/>
-        </w:rPr>
-        <w:t>Hệ thống mất ổn định:</w:t>
-      </w:r>
-      <w:r>
-        <w:rPr>
-          <w:rFonts w:ascii="Times New Roman" w:hAnsi="Times New Roman"/>
-          <w:color w:val="000000"/>
-        </w:rPr>
-        <w:t xml:space="preserve"> Máy chủ bị treo hoặc phát sinh lỗi màn hình xanh (BSOD). Hiện tượng này chứng minh lỗi quản lý bộ nhớ nhân đã bị kích hoạt làm ảnh hưởng đến tính sẵn sàng, nhưng không được coi là xác minh thực thi mã thành công.</w:t>
-      </w:r>
-    </w:p>
-    <w:p>
-      <w:pPr>
-        <w:spacing w:before="0" w:after="60"/>
-        <w:ind w:left="709" w:hanging="283"/>
-        <w:jc w:val="both"/>
-      </w:pPr>
-      <w:r>
-        <w:rPr>
-          <w:rFonts w:ascii="Times New Roman" w:hAnsi="Times New Roman"/>
-          <w:color w:val="000000"/>
-        </w:rPr>
-        <w:t xml:space="preserve">• </w:t>
-      </w:r>
-      <w:r>
-        <w:rPr>
-          <w:rFonts w:ascii="Times New Roman" w:hAnsi="Times New Roman"/>
-          <w:b/>
-          <w:color w:val="000000"/>
-        </w:rPr>
-        <w:t>Ý nghĩa kỹ thuật:</w:t>
-      </w:r>
-      <w:r>
-        <w:rPr>
-          <w:rFonts w:ascii="Times New Roman" w:hAnsi="Times New Roman"/>
-          <w:color w:val="000000"/>
-        </w:rPr>
-        <w:t xml:space="preserve"> Cung cấp cơ sở thực nghiệm rõ ràng nhất để phân biệt giữa việc chỉ tồn tại dấu hiệu và khả năng tác động thực tế.</w:t>
-      </w:r>
-    </w:p>
-    <w:p>
-      <w:pPr>
-        <w:spacing w:before="0" w:after="60"/>
-        <w:ind w:left="709" w:hanging="283"/>
-        <w:jc w:val="both"/>
-      </w:pPr>
-      <w:r>
-        <w:rPr>
-          <w:rFonts w:ascii="Times New Roman" w:hAnsi="Times New Roman"/>
-          <w:color w:val="000000"/>
-        </w:rPr>
-        <w:t xml:space="preserve">• </w:t>
-      </w:r>
-      <w:r>
-        <w:rPr>
-          <w:rFonts w:ascii="Times New Roman" w:hAnsi="Times New Roman"/>
-          <w:b/>
-          <w:color w:val="000000"/>
-        </w:rPr>
-        <w:t>Ranh giới kết luận:</w:t>
-      </w:r>
-      <w:r>
-        <w:rPr>
-          <w:rFonts w:ascii="Times New Roman" w:hAnsi="Times New Roman"/>
-          <w:color w:val="000000"/>
-        </w:rPr>
-        <w:t xml:space="preserve"> Thao tác ở Mức 4 có tính xâm nhập cao, chỉ được triển khai trong phạm vi môi trường thử nghiệm có kiểm soát chặt chẽ.</w:t>
-      </w:r>
-    </w:p>
-    <w:p>
-      <w:pPr>
-        <w:pStyle w:val="Heading3"/>
-      </w:pPr>
-      <w:r>
-        <w:rPr>
-          <w:rFonts w:ascii="Times New Roman" w:hAnsi="Times New Roman"/>
-          <w:color w:val="000000"/>
-        </w:rPr>
-        <w:t>1.4.5. Giới hạn của phương pháp xác minh</w:t>
-      </w:r>
-    </w:p>
-    <w:p>
-      <w:pPr>
-        <w:keepNext/>
-      </w:pPr>
-      <w:r>
-        <w:rPr>
-          <w:rFonts w:ascii="Times New Roman" w:hAnsi="Times New Roman"/>
-          <w:color w:val="000000"/>
-        </w:rPr>
-        <w:t>Khi đánh giá kết quả, cần lưu ý một số giới hạn kỹ thuật sau:</w:t>
-      </w:r>
-    </w:p>
-    <w:p>
-      <w:pPr>
-        <w:spacing w:before="0" w:after="60"/>
-        <w:ind w:left="709" w:hanging="283"/>
-        <w:jc w:val="both"/>
-      </w:pPr>
-      <w:r>
-        <w:rPr>
-          <w:rFonts w:ascii="Times New Roman" w:hAnsi="Times New Roman"/>
-          <w:color w:val="000000"/>
-        </w:rPr>
-        <w:t xml:space="preserve">• </w:t>
-      </w:r>
-      <w:r>
-        <w:rPr>
-          <w:rFonts w:ascii="Times New Roman" w:hAnsi="Times New Roman"/>
-          <w:b/>
-          <w:color w:val="000000"/>
-        </w:rPr>
-        <w:t>Ảnh hưởng của tường lửa:</w:t>
-      </w:r>
-      <w:r>
-        <w:rPr>
-          <w:rFonts w:ascii="Times New Roman" w:hAnsi="Times New Roman"/>
-          <w:color w:val="000000"/>
-        </w:rPr>
-        <w:t xml:space="preserve"> Tường lửa mạng hoặc tường lửa cục bộ nếu chặn cổng hoặc lọc gói tin sẽ làm xuất hiện trạng thái </w:t>
-      </w:r>
-      <w:r>
-        <w:rPr>
-          <w:rFonts w:ascii="Times New Roman" w:hAnsi="Times New Roman"/>
-          <w:color w:val="000000"/>
-        </w:rPr>
-        <w:t>Filtered</w:t>
-      </w:r>
-      <w:r>
-        <w:rPr>
-          <w:rFonts w:ascii="Times New Roman" w:hAnsi="Times New Roman"/>
-          <w:color w:val="000000"/>
-        </w:rPr>
-        <w:t>. Trạng thái này chỉ phản ánh đường truyền bị chặn từ góc nhìn của trạm kiểm thử, không phản ánh cấu hình an ninh nội tại của máy chủ.</w:t>
-      </w:r>
-    </w:p>
-    <w:p>
-      <w:pPr>
-        <w:spacing w:before="0" w:after="60"/>
-        <w:ind w:left="709" w:hanging="283"/>
-        <w:jc w:val="both"/>
-      </w:pPr>
-      <w:r>
-        <w:rPr>
-          <w:rFonts w:ascii="Times New Roman" w:hAnsi="Times New Roman"/>
-          <w:color w:val="000000"/>
-        </w:rPr>
-        <w:t xml:space="preserve">• </w:t>
-      </w:r>
-      <w:r>
-        <w:rPr>
-          <w:rFonts w:ascii="Times New Roman" w:hAnsi="Times New Roman"/>
-          <w:b/>
-          <w:color w:val="000000"/>
-        </w:rPr>
-        <w:t>Chính sách kiểm soát truy cập:</w:t>
-      </w:r>
-      <w:r>
-        <w:rPr>
-          <w:rFonts w:ascii="Times New Roman" w:hAnsi="Times New Roman"/>
-          <w:color w:val="000000"/>
-        </w:rPr>
-        <w:t xml:space="preserve"> Khi máy chủ áp dụng chính sách hạn chế kết nối nặc danh (Null Session) vào tài nguyên </w:t>
-      </w:r>
-      <w:r>
-        <w:rPr>
-          <w:rFonts w:ascii="Times New Roman" w:hAnsi="Times New Roman"/>
-          <w:color w:val="000000"/>
-        </w:rPr>
-        <w:t>IPC$</w:t>
-      </w:r>
-      <w:r>
-        <w:rPr>
-          <w:rFonts w:ascii="Times New Roman" w:hAnsi="Times New Roman"/>
-          <w:color w:val="000000"/>
-        </w:rPr>
-        <w:t>, các kịch bản thăm dò ở Mức 3 có thể không nhận được mã phản hồi mong muốn. Tình huống này dễ dẫn đến nguy cơ âm tính giả dù hệ điều hành mục tiêu chưa được cập nhật bản vá.</w:t>
-      </w:r>
-    </w:p>
-    <w:p>
-      <w:pPr>
-        <w:spacing w:before="0" w:after="60"/>
-        <w:ind w:left="709" w:hanging="283"/>
-        <w:jc w:val="both"/>
-      </w:pPr>
-      <w:r>
-        <w:rPr>
-          <w:rFonts w:ascii="Times New Roman" w:hAnsi="Times New Roman"/>
-          <w:color w:val="000000"/>
-        </w:rPr>
-        <w:t xml:space="preserve">• </w:t>
-      </w:r>
-      <w:r>
-        <w:rPr>
-          <w:rFonts w:ascii="Times New Roman" w:hAnsi="Times New Roman"/>
-          <w:b/>
-          <w:color w:val="000000"/>
-        </w:rPr>
-        <w:t>Khác biệt giữa các phiên bản hệ điều hành:</w:t>
-      </w:r>
-      <w:r>
-        <w:rPr>
-          <w:rFonts w:ascii="Times New Roman" w:hAnsi="Times New Roman"/>
-          <w:color w:val="000000"/>
-        </w:rPr>
-        <w:t xml:space="preserve"> Cơ chế quản lý bộ nhớ nhân giữa các thế hệ Windows có sự khác biệt rõ rệt. Một kỹ thuật kiểm chứng có tác động trên phiên bản này có thể chỉ gây lỗi dừng hoặc không hoạt động trên phiên bản khác.</w:t>
-      </w:r>
-    </w:p>
-    <w:p>
-      <w:pPr>
-        <w:spacing w:before="0" w:after="60"/>
-        <w:ind w:left="709" w:hanging="283"/>
-        <w:jc w:val="both"/>
-      </w:pPr>
-      <w:r>
-        <w:rPr>
-          <w:rFonts w:ascii="Times New Roman" w:hAnsi="Times New Roman"/>
-          <w:color w:val="000000"/>
-        </w:rPr>
-        <w:t xml:space="preserve">• </w:t>
-      </w:r>
-      <w:r>
-        <w:rPr>
-          <w:rFonts w:ascii="Times New Roman" w:hAnsi="Times New Roman"/>
-          <w:b/>
-          <w:color w:val="000000"/>
-        </w:rPr>
         <w:t>Giới hạn của việc quan sát từ bên ngoài (Black-box):</w:t>
       </w:r>
       <w:r>
@@ -4357,7 +4229,7 @@
           <w:rFonts w:ascii="Times New Roman" w:hAnsi="Times New Roman"/>
           <w:color w:val="000000"/>
         </w:rPr>
-        <w:t xml:space="preserve"> Mọi phép đo từ xa chỉ ghi nhận phản hồi trên đường truyền mạng. Để có kết luận chính xác, kết quả kiểm tra từ xa nên được đối chiếu với trạng thái nội tại của máy chủ (White-box), bao gồm danh mục bản vá KB đã cài đặt và trạng thái kích hoạt thực tế của dịch vụ SMBv1.</w:t>
+        <w:t xml:space="preserve"> Mọi phép đo từ xa chỉ ghi nhận các biểu hiện trên đường truyền mạng. Để có kết luận toàn diện, nguyên tắc đối chứng đòi hỏi kết quả kiểm tra từ xa cần được đối chiếu với trạng thái nội tại của máy chủ (White-box), bao gồm danh mục bản vá an ninh đã cài đặt và cấu hình kích hoạt thực tế của dịch vụ SMBv1.</w:t>
       </w:r>
     </w:p>
     <w:p>

</xml_diff>